<commit_message>
Update Haru demo assets and Jules prompts
</commit_message>
<xml_diff>
--- a/피우다프로젝트/2026_글로벌_피우다프로젝트_지원신청서_새록정원.docx
+++ b/피우다프로젝트/2026_글로벌_피우다프로젝트_지원신청서_새록정원.docx
@@ -5,11 +5,12 @@
     <w:p>
       <w:pPr>
         <w:pStyle w:val="Title"/>
+        <w:spacing w:after="40" w:line="250" w:lineRule="auto"/>
         <w:jc w:val="center"/>
       </w:pPr>
       <w:r>
         <w:rPr>
-          <w:rFonts w:ascii="Calibri" w:hAnsi="Calibri" w:eastAsia="Malgun Gothic" w:cs="Calibri"/>
+          <w:rFonts w:ascii="Malgun Gothic" w:hAnsi="Malgun Gothic" w:eastAsia="Malgun Gothic" w:cs="Calibri"/>
           <w:b/>
           <w:color w:val="1F4D78"/>
           <w:sz w:val="36"/>
@@ -20,15 +21,17 @@
     <w:p>
       <w:pPr>
         <w:pStyle w:val="Subtitle"/>
+        <w:spacing w:after="40" w:line="250" w:lineRule="auto"/>
         <w:jc w:val="center"/>
       </w:pPr>
       <w:r>
         <w:rPr>
-          <w:rFonts w:ascii="Calibri" w:hAnsi="Calibri" w:eastAsia="Malgun Gothic" w:cs="Calibri"/>
-          <w:color w:val="4A5568"/>
-          <w:sz w:val="22"/>
+          <w:rFonts w:ascii="Malgun Gothic" w:hAnsi="Malgun Gothic" w:eastAsia="Malgun Gothic" w:cs="Calibri"/>
+          <w:b/>
+          <w:color w:val="5A5A5A"/>
+          <w:sz w:val="24"/>
         </w:rPr>
-        <w:t>개발물명: 새록정원</w:t>
+        <w:t>개발물명: Haru</w:t>
       </w:r>
     </w:p>
     <w:tbl>
@@ -49,35 +52,48 @@
         <w:gridCol w:w="10039"/>
       </w:tblGrid>
       <w:tr>
+        <w:trPr/>
         <w:tc>
           <w:tcPr>
             <w:tcW w:type="dxa" w:w="10039"/>
-            <w:shd w:fill="F4F6F9"/>
+            <w:shd w:fill="EAF2F8"/>
             <w:tcMar>
-              <w:top w:w="120" w:type="dxa"/>
-              <w:start w:w="180" w:type="dxa"/>
-              <w:bottom w:w="120" w:type="dxa"/>
-              <w:end w:w="180" w:type="dxa"/>
+              <w:top w:w="90" w:type="dxa"/>
+              <w:start w:w="110" w:type="dxa"/>
+              <w:bottom w:w="90" w:type="dxa"/>
+              <w:end w:w="110" w:type="dxa"/>
             </w:tcMar>
+            <w:vAlign w:val="center"/>
           </w:tcPr>
           <w:p>
             <w:pPr>
-              <w:spacing w:after="100" w:line="283" w:lineRule="auto"/>
+              <w:spacing w:after="40" w:line="259" w:lineRule="auto"/>
+              <w:jc w:val="left"/>
             </w:pPr>
             <w:r>
               <w:rPr>
-                <w:rFonts w:ascii="Calibri" w:hAnsi="Calibri" w:eastAsia="Malgun Gothic" w:cs="Calibri"/>
+                <w:rFonts w:ascii="맑은 고딕" w:hAnsi="맑은 고딕" w:eastAsia="맑은 고딕"/>
                 <w:b w:val="0"/>
-                <w:color w:val="333333"/>
-                <w:sz w:val="19"/>
+                <w:sz w:val="17"/>
               </w:rPr>
-              <w:t>원본 신청서의 표 항목에 맞춰 DOCX에서 편집하기 쉽도록 재구성한 작성본입니다. 제출 전 팀원 실명, 권역, 날짜, 서명, NIPA 교육 증빙 여부는 실제 정보로 교체해야 합니다.</w:t>
+            </w:r>
+            <w:r>
+              <w:rPr>
+                <w:rFonts w:ascii="맑은 고딕" w:hAnsi="맑은 고딕" w:eastAsia="맑은 고딕"/>
+                <w:b w:val="0"/>
+                <w:sz w:val="17"/>
+              </w:rPr>
+              <w:t>원본 신청서의 표 항목에 맞춰 DOCX에서 편집하기 쉽도록 재구성한 작성본입니다. 본 판본은 개발물명을 Haru로 통일하고, 치매 관련 비진단 인지 루틴, 한일 고령화·치매 정책 근거, 공모전 일정 기반 개발 절차, 멘토링 필요성을 본문에 반영한 텍스트 중심 수정본입니다. 추가 기능 화면은 개발 완료 후 그림 자료로 교체·추가합니다. 제출 전 팀장·권역·NIPA 교육 증빙·최종 제출 파일 형식은 반드시 확인해야 합니다.</w:t>
             </w:r>
           </w:p>
         </w:tc>
       </w:tr>
     </w:tbl>
-    <w:p/>
+    <w:p>
+      <w:pPr>
+        <w:spacing w:after="40" w:line="250" w:lineRule="auto"/>
+      </w:pPr>
+    </w:p>
     <w:tbl>
       <w:tblPr>
         <w:tblW w:type="auto" w:w="0"/>
@@ -98,29 +114,36 @@
         <w:gridCol w:w="7937"/>
       </w:tblGrid>
       <w:tr>
+        <w:trPr/>
         <w:tc>
           <w:tcPr>
             <w:tcW w:type="dxa" w:w="1701"/>
-            <w:vAlign w:val="top"/>
+            <w:vAlign w:val="center"/>
             <w:tcMar>
               <w:top w:w="90" w:type="dxa"/>
-              <w:start w:w="140" w:type="dxa"/>
+              <w:start w:w="110" w:type="dxa"/>
               <w:bottom w:w="90" w:type="dxa"/>
-              <w:end w:w="140" w:type="dxa"/>
+              <w:end w:w="110" w:type="dxa"/>
             </w:tcMar>
-            <w:shd w:fill="F4F6F9"/>
+            <w:shd w:fill="EAF2F8"/>
           </w:tcPr>
           <w:p>
             <w:pPr>
-              <w:spacing w:after="100" w:line="283" w:lineRule="auto"/>
-              <w:jc w:val="center"/>
+              <w:spacing w:after="40" w:line="259" w:lineRule="auto"/>
+              <w:jc w:val="left"/>
             </w:pPr>
             <w:r>
               <w:rPr>
-                <w:rFonts w:ascii="Calibri" w:hAnsi="Calibri" w:eastAsia="Malgun Gothic" w:cs="Calibri"/>
+                <w:rFonts w:ascii="맑은 고딕" w:hAnsi="맑은 고딕" w:eastAsia="맑은 고딕"/>
                 <w:b/>
-                <w:color w:val="1F4D78"/>
-                <w:sz w:val="20"/>
+                <w:sz w:val="18"/>
+              </w:rPr>
+            </w:r>
+            <w:r>
+              <w:rPr>
+                <w:rFonts w:ascii="맑은 고딕" w:hAnsi="맑은 고딕" w:eastAsia="맑은 고딕"/>
+                <w:b/>
+                <w:sz w:val="18"/>
               </w:rPr>
               <w:t>개발물명</w:t>
             </w:r>
@@ -129,63 +152,181 @@
         <w:tc>
           <w:tcPr>
             <w:tcW w:type="dxa" w:w="7937"/>
-            <w:vAlign w:val="top"/>
+            <w:vAlign w:val="center"/>
             <w:tcMar>
               <w:top w:w="90" w:type="dxa"/>
-              <w:start w:w="140" w:type="dxa"/>
+              <w:start w:w="110" w:type="dxa"/>
               <w:bottom w:w="90" w:type="dxa"/>
-              <w:end w:w="140" w:type="dxa"/>
+              <w:end w:w="110" w:type="dxa"/>
             </w:tcMar>
           </w:tcPr>
           <w:p>
             <w:pPr>
-              <w:spacing w:after="100" w:line="283" w:lineRule="auto"/>
+              <w:spacing w:after="40" w:line="259" w:lineRule="auto"/>
               <w:jc w:val="left"/>
             </w:pPr>
             <w:r>
               <w:rPr>
-                <w:rFonts w:ascii="Calibri" w:hAnsi="Calibri" w:eastAsia="Malgun Gothic" w:cs="Calibri"/>
-                <w:b/>
-                <w:color w:val="000000"/>
-                <w:sz w:val="20"/>
+                <w:rFonts w:ascii="맑은 고딕" w:hAnsi="맑은 고딕" w:eastAsia="맑은 고딕"/>
+                <w:b w:val="0"/>
+                <w:sz w:val="18"/>
               </w:rPr>
-              <w:t>새록정원</w:t>
+            </w:r>
+            <w:r>
+              <w:rPr>
+                <w:rFonts w:ascii="맑은 고딕" w:hAnsi="맑은 고딕" w:eastAsia="맑은 고딕"/>
+                <w:b w:val="0"/>
+                <w:sz w:val="18"/>
+              </w:rPr>
+              <w:t>Haru</w:t>
             </w:r>
           </w:p>
+        </w:tc>
+      </w:tr>
+      <w:tr>
+        <w:trPr/>
+        <w:tc>
+          <w:tcPr>
+            <w:tcW w:type="dxa" w:w="1701"/>
+            <w:vAlign w:val="center"/>
+            <w:tcMar>
+              <w:top w:w="90" w:type="dxa"/>
+              <w:start w:w="110" w:type="dxa"/>
+              <w:bottom w:w="90" w:type="dxa"/>
+              <w:end w:w="110" w:type="dxa"/>
+            </w:tcMar>
+            <w:shd w:fill="EAF2F8"/>
+          </w:tcPr>
           <w:p>
             <w:pPr>
-              <w:spacing w:after="100" w:line="283" w:lineRule="auto"/>
+              <w:spacing w:after="40" w:line="259" w:lineRule="auto"/>
               <w:jc w:val="left"/>
             </w:pPr>
             <w:r>
               <w:rPr>
-                <w:rFonts w:ascii="Calibri" w:hAnsi="Calibri" w:eastAsia="Malgun Gothic" w:cs="Calibri"/>
+                <w:rFonts w:ascii="맑은 고딕" w:hAnsi="맑은 고딕" w:eastAsia="맑은 고딕"/>
                 <w:b w:val="0"/>
-                <w:color w:val="000000"/>
-                <w:sz w:val="20"/>
+                <w:sz w:val="18"/>
               </w:rPr>
-              <w:t>새록정원은 고령 사용자가 하루 5분 안팎의 짧은 선택형 활동을 통해 사자성어와 문화 표현을 익히고, 그 과정에서 자신의 생활 기억과 감정을 부담 없이 떠올리도록 돕는 디지털 인지·정서 루틴 서비스입니다. 자유 입력이나 복잡한 회원 절차보다 큰 선택 버튼, 명확한 피드백, 정원 보상 구조를 우선하여 60~80대 한국어 사용자가 스스로 반복 이용할 수 있는 형태로 설계했습니다.</w:t>
+            </w:r>
+            <w:r>
+              <w:rPr>
+                <w:rFonts w:ascii="맑은 고딕" w:hAnsi="맑은 고딕" w:eastAsia="맑은 고딕"/>
+                <w:b w:val="0"/>
+                <w:sz w:val="18"/>
+              </w:rPr>
             </w:r>
           </w:p>
+        </w:tc>
+        <w:tc>
+          <w:tcPr>
+            <w:tcW w:type="dxa" w:w="7937"/>
+            <w:vAlign w:val="center"/>
+            <w:tcMar>
+              <w:top w:w="90" w:type="dxa"/>
+              <w:start w:w="110" w:type="dxa"/>
+              <w:bottom w:w="90" w:type="dxa"/>
+              <w:end w:w="110" w:type="dxa"/>
+            </w:tcMar>
+          </w:tcPr>
           <w:p>
             <w:pPr>
-              <w:spacing w:after="100" w:line="283" w:lineRule="auto"/>
+              <w:spacing w:after="40" w:line="259" w:lineRule="auto"/>
               <w:jc w:val="left"/>
             </w:pPr>
             <w:r>
               <w:rPr>
-                <w:rFonts w:ascii="Calibri" w:hAnsi="Calibri" w:eastAsia="Malgun Gothic" w:cs="Calibri"/>
+                <w:rFonts w:ascii="맑은 고딕" w:hAnsi="맑은 고딕" w:eastAsia="맑은 고딕"/>
                 <w:b w:val="0"/>
-                <w:color w:val="000000"/>
-                <w:sz w:val="20"/>
+                <w:sz w:val="18"/>
               </w:rPr>
-              <w:t>명칭은 ‘새록새록’ 떠오르는 기억과 학습 결과가 정원처럼 자라나는 화면 구조를 함께 담기 위해 ‘새록정원’으로 정리했습니다. 질병명을 전면에 내세우지 않아 고령 사용자가 낙인감 없이 접근할 수 있고, 비의료적 취미·회상 루틴이라는 개발 방향에도 부합합니다.</w:t>
+            </w:r>
+            <w:r>
+              <w:rPr>
+                <w:rFonts w:ascii="맑은 고딕" w:hAnsi="맑은 고딕" w:eastAsia="맑은 고딕"/>
+                <w:b w:val="0"/>
+                <w:sz w:val="18"/>
+              </w:rPr>
+              <w:t>Haru는 한국어로 ‘하루’라고 읽히며, 고령 사용자가 하루 한 번 짧게 참여하는 일상 루틴이라는 의미를 담고 있습니다. 일본어로는 ‘はる’ 또는 ‘春’로 읽혀 봄, 새로움, 따뜻한 시작을 연상시키므로, 한일 공통의 노인돌봄 문제를 다루는 본 공모전에서 한국과 일본 사용자 모두에게 자연스럽고 따뜻하게 전달될 수 있는 이름입니다.</w:t>
+            </w:r>
+          </w:p>
+        </w:tc>
+      </w:tr>
+      <w:tr>
+        <w:trPr/>
+        <w:tc>
+          <w:tcPr>
+            <w:tcW w:type="dxa" w:w="1701"/>
+            <w:vAlign w:val="center"/>
+            <w:tcMar>
+              <w:top w:w="90" w:type="dxa"/>
+              <w:start w:w="110" w:type="dxa"/>
+              <w:bottom w:w="90" w:type="dxa"/>
+              <w:end w:w="110" w:type="dxa"/>
+            </w:tcMar>
+            <w:shd w:fill="EAF2F8"/>
+          </w:tcPr>
+          <w:p>
+            <w:pPr>
+              <w:spacing w:after="40" w:line="259" w:lineRule="auto"/>
+              <w:jc w:val="left"/>
+            </w:pPr>
+            <w:r>
+              <w:rPr>
+                <w:rFonts w:ascii="맑은 고딕" w:hAnsi="맑은 고딕" w:eastAsia="맑은 고딕"/>
+                <w:b w:val="0"/>
+                <w:sz w:val="18"/>
+              </w:rPr>
+            </w:r>
+            <w:r>
+              <w:rPr>
+                <w:rFonts w:ascii="맑은 고딕" w:hAnsi="맑은 고딕" w:eastAsia="맑은 고딕"/>
+                <w:b w:val="0"/>
+                <w:sz w:val="18"/>
+              </w:rPr>
+            </w:r>
+          </w:p>
+        </w:tc>
+        <w:tc>
+          <w:tcPr>
+            <w:tcW w:type="dxa" w:w="7937"/>
+            <w:vAlign w:val="center"/>
+            <w:tcMar>
+              <w:top w:w="90" w:type="dxa"/>
+              <w:start w:w="110" w:type="dxa"/>
+              <w:bottom w:w="90" w:type="dxa"/>
+              <w:end w:w="110" w:type="dxa"/>
+            </w:tcMar>
+          </w:tcPr>
+          <w:p>
+            <w:pPr>
+              <w:spacing w:after="40" w:line="259" w:lineRule="auto"/>
+              <w:jc w:val="left"/>
+            </w:pPr>
+            <w:r>
+              <w:rPr>
+                <w:rFonts w:ascii="맑은 고딕" w:hAnsi="맑은 고딕" w:eastAsia="맑은 고딕"/>
+                <w:b w:val="0"/>
+                <w:sz w:val="18"/>
+              </w:rPr>
+            </w:r>
+            <w:r>
+              <w:rPr>
+                <w:rFonts w:ascii="맑은 고딕" w:hAnsi="맑은 고딕" w:eastAsia="맑은 고딕"/>
+                <w:b w:val="0"/>
+                <w:sz w:val="18"/>
+              </w:rPr>
+              <w:t>본 개발물은 ‘하루를 잇고, 마음에 봄을 더하다’라는 표어 아래, 고령 사용자가 하루 5분 안팎의 짧은 문화 표현 활동을 통해 자신의 기억과 감정을 자연스럽게 회상하고 일상 속 정서적 활력을 회복하도록 돕는 디지털 회상·학습 서비스입니다. 질병명을 전면에 내세우지 않아 낙인감을 낮추고, 한국어 사자성어·속담뿐 아니라 일본어 관용구·ことわざ·계절 기억 단서로도 확장 가능한 구조를 지향합니다.</w:t>
             </w:r>
           </w:p>
         </w:tc>
       </w:tr>
     </w:tbl>
-    <w:p/>
+    <w:p>
+      <w:pPr>
+        <w:spacing w:after="40" w:line="250" w:lineRule="auto"/>
+      </w:pPr>
+    </w:p>
     <w:tbl>
       <w:tblPr>
         <w:tblW w:type="auto" w:w="0"/>
@@ -206,29 +347,30 @@
         <w:gridCol w:w="7937"/>
       </w:tblGrid>
       <w:tr>
+        <w:trPr/>
         <w:tc>
           <w:tcPr>
             <w:tcW w:type="dxa" w:w="1701"/>
             <w:vAlign w:val="top"/>
             <w:tcMar>
               <w:top w:w="90" w:type="dxa"/>
-              <w:start w:w="140" w:type="dxa"/>
+              <w:start w:w="110" w:type="dxa"/>
               <w:bottom w:w="90" w:type="dxa"/>
-              <w:end w:w="140" w:type="dxa"/>
+              <w:end w:w="110" w:type="dxa"/>
             </w:tcMar>
-            <w:shd w:fill="F4F6F9"/>
+            <w:shd w:fill="EAF2F8"/>
           </w:tcPr>
           <w:p>
             <w:pPr>
-              <w:spacing w:after="100" w:line="283" w:lineRule="auto"/>
+              <w:spacing w:after="40" w:line="250" w:lineRule="auto" w:before="0"/>
               <w:jc w:val="center"/>
             </w:pPr>
             <w:r>
               <w:rPr>
-                <w:rFonts w:ascii="Calibri" w:hAnsi="Calibri" w:eastAsia="Malgun Gothic" w:cs="Calibri"/>
+                <w:rFonts w:ascii="Malgun Gothic" w:hAnsi="Malgun Gothic" w:eastAsia="Malgun Gothic" w:cs="Calibri"/>
                 <w:b/>
-                <w:color w:val="1F4D78"/>
-                <w:sz w:val="20"/>
+                <w:color w:val="1F4E79"/>
+                <w:sz w:val="18"/>
               </w:rPr>
               <w:t>세부주제(번호포함)</w:t>
             </w:r>
@@ -240,37 +382,37 @@
             <w:vAlign w:val="top"/>
             <w:tcMar>
               <w:top w:w="90" w:type="dxa"/>
-              <w:start w:w="140" w:type="dxa"/>
+              <w:start w:w="110" w:type="dxa"/>
               <w:bottom w:w="90" w:type="dxa"/>
-              <w:end w:w="140" w:type="dxa"/>
+              <w:end w:w="110" w:type="dxa"/>
             </w:tcMar>
           </w:tcPr>
           <w:p>
             <w:pPr>
-              <w:spacing w:after="100" w:line="283" w:lineRule="auto"/>
+              <w:spacing w:after="40" w:line="250" w:lineRule="auto" w:before="0"/>
               <w:jc w:val="left"/>
             </w:pPr>
             <w:r>
               <w:rPr>
-                <w:rFonts w:ascii="Calibri" w:hAnsi="Calibri" w:eastAsia="Malgun Gothic" w:cs="Calibri"/>
+                <w:rFonts w:ascii="Malgun Gothic" w:hAnsi="Malgun Gothic" w:eastAsia="Malgun Gothic" w:cs="Calibri"/>
                 <w:b w:val="0"/>
                 <w:color w:val="000000"/>
-                <w:sz w:val="20"/>
+                <w:sz w:val="18"/>
               </w:rPr>
               <w:t>3.1 노인의 정서 및 사회적 고립 완화를 위한 ICT기반 취미·체험형 솔루션 개발</w:t>
             </w:r>
           </w:p>
           <w:p>
             <w:pPr>
-              <w:spacing w:after="100" w:line="283" w:lineRule="auto"/>
+              <w:spacing w:after="40" w:line="250" w:lineRule="auto" w:before="0"/>
               <w:jc w:val="left"/>
             </w:pPr>
             <w:r>
               <w:rPr>
-                <w:rFonts w:ascii="Calibri" w:hAnsi="Calibri" w:eastAsia="Malgun Gothic" w:cs="Calibri"/>
+                <w:rFonts w:ascii="Malgun Gothic" w:hAnsi="Malgun Gothic" w:eastAsia="Malgun Gothic" w:cs="Calibri"/>
                 <w:b w:val="0"/>
                 <w:color w:val="000000"/>
-                <w:sz w:val="20"/>
+                <w:sz w:val="18"/>
               </w:rPr>
               <w:t>본 개발물은 사자성어, 속담, 문화 표현을 소재로 한 짧은 학습 활동과 개인 기억 회상, 정원 보상, 보호자 안내 화면을 결합한 취미·체험형 서비스입니다. 현재 구현 범위는 진단, 치료, 치매 조기 탐지 또는 의료 점수화가 아니라 고령자가 일상 속에서 즐겁게 참여할 수 있는 비의료적 디지털 활동에 초점을 둡니다. 치매 돌봄 및 가족지원 주제와 일부 연계 가능성은 있으나, 보호자 초대와 가족 공유 기능은 현재 안내 화면 수준이므로 본 신청에서는 3.1을 주 세부주제로 선택합니다.</w:t>
             </w:r>
@@ -278,7 +420,11 @@
         </w:tc>
       </w:tr>
     </w:tbl>
-    <w:p/>
+    <w:p>
+      <w:pPr>
+        <w:spacing w:after="40" w:line="250" w:lineRule="auto"/>
+      </w:pPr>
+    </w:p>
     <w:tbl>
       <w:tblPr>
         <w:tblW w:type="auto" w:w="0"/>
@@ -299,29 +445,36 @@
         <w:gridCol w:w="7937"/>
       </w:tblGrid>
       <w:tr>
+        <w:trPr/>
         <w:tc>
           <w:tcPr>
             <w:tcW w:type="dxa" w:w="1701"/>
-            <w:vAlign w:val="top"/>
+            <w:vAlign w:val="center"/>
             <w:tcMar>
               <w:top w:w="90" w:type="dxa"/>
-              <w:start w:w="140" w:type="dxa"/>
+              <w:start w:w="110" w:type="dxa"/>
               <w:bottom w:w="90" w:type="dxa"/>
-              <w:end w:w="140" w:type="dxa"/>
+              <w:end w:w="110" w:type="dxa"/>
             </w:tcMar>
-            <w:shd w:fill="F4F6F9"/>
+            <w:shd w:fill="EAF2F8"/>
           </w:tcPr>
           <w:p>
             <w:pPr>
-              <w:spacing w:after="100" w:line="283" w:lineRule="auto"/>
-              <w:jc w:val="center"/>
+              <w:spacing w:after="40" w:line="259" w:lineRule="auto"/>
+              <w:jc w:val="left"/>
             </w:pPr>
             <w:r>
               <w:rPr>
-                <w:rFonts w:ascii="Calibri" w:hAnsi="Calibri" w:eastAsia="Malgun Gothic" w:cs="Calibri"/>
+                <w:rFonts w:ascii="맑은 고딕" w:hAnsi="맑은 고딕" w:eastAsia="맑은 고딕"/>
                 <w:b/>
-                <w:color w:val="1F4D78"/>
-                <w:sz w:val="20"/>
+                <w:sz w:val="18"/>
+              </w:rPr>
+            </w:r>
+            <w:r>
+              <w:rPr>
+                <w:rFonts w:ascii="맑은 고딕" w:hAnsi="맑은 고딕" w:eastAsia="맑은 고딕"/>
+                <w:b/>
+                <w:sz w:val="18"/>
               </w:rPr>
               <w:t>개발물 설명</w:t>
             </w:r>
@@ -330,93 +483,305 @@
         <w:tc>
           <w:tcPr>
             <w:tcW w:type="dxa" w:w="7937"/>
-            <w:vAlign w:val="top"/>
+            <w:vAlign w:val="center"/>
             <w:tcMar>
               <w:top w:w="90" w:type="dxa"/>
-              <w:start w:w="140" w:type="dxa"/>
+              <w:start w:w="110" w:type="dxa"/>
               <w:bottom w:w="90" w:type="dxa"/>
-              <w:end w:w="140" w:type="dxa"/>
+              <w:end w:w="110" w:type="dxa"/>
             </w:tcMar>
           </w:tcPr>
           <w:p>
             <w:pPr>
-              <w:spacing w:after="100" w:line="283" w:lineRule="auto"/>
+              <w:spacing w:after="40" w:line="259" w:lineRule="auto"/>
               <w:jc w:val="left"/>
             </w:pPr>
             <w:r>
               <w:rPr>
-                <w:rFonts w:ascii="Calibri" w:hAnsi="Calibri" w:eastAsia="Malgun Gothic" w:cs="Calibri"/>
+                <w:rFonts w:ascii="맑은 고딕" w:hAnsi="맑은 고딕" w:eastAsia="맑은 고딕"/>
                 <w:b w:val="0"/>
-                <w:color w:val="000000"/>
-                <w:sz w:val="20"/>
+                <w:sz w:val="18"/>
               </w:rPr>
-              <w:t>새록정원은 고령 사용자를 위한 클릭 중심 학습·회상 루틴입니다. 사용자는 홈 화면에서 오늘의 학습을 시작하고, 사자성어 뜻 선택, 상황 매칭, 짝 맞추기, 순서 배열, 음성 선택, 그림 선택, 개인 기억 회상 활동을 순서대로 진행합니다. 현재 목업 레슨은 1개이며, 사자성어 개념 5개와 실제 학습 흐름 6문항을 기반으로 작동합니다. 대회 기간에는 현재 구조를 확장하여 더 많은 문화 표현과 반복 학습 콘텐츠를 추가할 계획입니다.</w:t>
+            </w:r>
+            <w:r>
+              <w:rPr>
+                <w:rFonts w:ascii="맑은 고딕" w:hAnsi="맑은 고딕" w:eastAsia="맑은 고딕"/>
+                <w:b w:val="0"/>
+                <w:sz w:val="18"/>
+              </w:rPr>
+              <w:t>Haru는 고령 사용자를 위한 클릭 중심 학습·회상 루틴입니다. 사용자는 홈 화면에서 오늘의 학습을 시작하고, 사자성어 뜻 선택, 상황 매칭, 짝 맞추기, 순서 배열, 음성 선택, 그림 선택, 개인 기억 회상 활동을 순서대로 진행합니다. 현재 구현물은 홈, 학습, 결과, 정원, 가족·보호자, 설정 화면을 포함하며, Vercel 데모 URL을 통해 기본 사용자 흐름을 확인할 수 있습니다.</w:t>
             </w:r>
           </w:p>
+        </w:tc>
+      </w:tr>
+      <w:tr>
+        <w:trPr/>
+        <w:tc>
+          <w:tcPr>
+            <w:tcW w:type="dxa" w:w="1701"/>
+            <w:vAlign w:val="center"/>
+            <w:tcMar>
+              <w:top w:w="90" w:type="dxa"/>
+              <w:start w:w="110" w:type="dxa"/>
+              <w:bottom w:w="90" w:type="dxa"/>
+              <w:end w:w="110" w:type="dxa"/>
+            </w:tcMar>
+            <w:shd w:fill="EAF2F8"/>
+          </w:tcPr>
           <w:p>
             <w:pPr>
-              <w:spacing w:after="100" w:line="283" w:lineRule="auto"/>
+              <w:spacing w:after="40" w:line="259" w:lineRule="auto"/>
               <w:jc w:val="left"/>
             </w:pPr>
             <w:r>
               <w:rPr>
-                <w:rFonts w:ascii="Calibri" w:hAnsi="Calibri" w:eastAsia="Malgun Gothic" w:cs="Calibri"/>
+                <w:rFonts w:ascii="맑은 고딕" w:hAnsi="맑은 고딕" w:eastAsia="맑은 고딕"/>
                 <w:b w:val="0"/>
-                <w:color w:val="000000"/>
-                <w:sz w:val="20"/>
+                <w:sz w:val="18"/>
               </w:rPr>
-              <w:t>현재 웹 시연본은 https://saerok-memory.vercel.app 에서 확인할 수 있습니다. 별도 설치 없이 브라우저에서 홈, 학습, 결과, 정원, 가족·보호자 안내, 설정 화면의 주요 흐름을 확인할 수 있습니다.</w:t>
+            </w:r>
+            <w:r>
+              <w:rPr>
+                <w:rFonts w:ascii="맑은 고딕" w:hAnsi="맑은 고딕" w:eastAsia="맑은 고딕"/>
+                <w:b w:val="0"/>
+                <w:sz w:val="18"/>
+              </w:rPr>
             </w:r>
           </w:p>
+        </w:tc>
+        <w:tc>
+          <w:tcPr>
+            <w:tcW w:type="dxa" w:w="7937"/>
+            <w:vAlign w:val="center"/>
+            <w:tcMar>
+              <w:top w:w="90" w:type="dxa"/>
+              <w:start w:w="110" w:type="dxa"/>
+              <w:bottom w:w="90" w:type="dxa"/>
+              <w:end w:w="110" w:type="dxa"/>
+            </w:tcMar>
+          </w:tcPr>
           <w:p>
             <w:pPr>
-              <w:spacing w:after="100" w:line="283" w:lineRule="auto"/>
+              <w:spacing w:after="40" w:line="259" w:lineRule="auto"/>
               <w:jc w:val="left"/>
             </w:pPr>
             <w:r>
               <w:rPr>
-                <w:rFonts w:ascii="Calibri" w:hAnsi="Calibri" w:eastAsia="Malgun Gothic" w:cs="Calibri"/>
+                <w:rFonts w:ascii="맑은 고딕" w:hAnsi="맑은 고딕" w:eastAsia="맑은 고딕"/>
                 <w:b w:val="0"/>
-                <w:color w:val="000000"/>
-                <w:sz w:val="20"/>
+                <w:sz w:val="18"/>
               </w:rPr>
-              <w:t>핵심 기능은 네 가지입니다. 첫째, 고령 사용자가 긴 문장 입력 없이 보기 선택만으로 참여할 수 있는 선택형 학습입니다. 둘째, “최근에 일석이조라고 느꼈던 순간”처럼 문화 표현과 개인 경험을 연결하는 기억 카드 생성 기능입니다. 사용자가 고른 기억 주제와 감정은 브라우저 로컬 저장소의 기억 카드로 저장되며, 저장된 주제와 감정은 이후 복습 문제 생성에 활용됩니다. 셋째, 학습 완료 후 연속 학습일과 물방울 보상을 제공하고, 정원 화면에서 나무와 보상 상태를 보여 주는 동기부여 구조입니다. 넷째, 보호자 초대와 공유 전 확인 안내 화면을 제공하여 향후 가족 지원 기능으로 확장할 수 있는 진입점을 마련했습니다.</w:t>
+            </w:r>
+            <w:r>
+              <w:rPr>
+                <w:rFonts w:ascii="맑은 고딕" w:hAnsi="맑은 고딕" w:eastAsia="맑은 고딕"/>
+                <w:b w:val="0"/>
+                <w:sz w:val="18"/>
+              </w:rPr>
+              <w:t>기존 개인 기억 선택 기능은 단순히 ‘어떤 기억을 떠올렸는지’를 묻는 화면이 아니라, 사용자가 선택한 기억 주제와 감정 단서를 저장한 뒤 일정 시간이 지난 후 다시 관련 질문을 제시하는 맞춤 회상 루틴의 출발점으로 설계합니다. 예를 들어 사용자가 가족 식사, 여행, 학교, 직장 등 개인 기억 주제를 선택하면 Haru는 해당 단서를 기억 카드로 보관하고, 며칠 뒤 같은 단서를 다시 제시해 사용자가 자신의 기억을 부담 없이 다시 떠올릴 수 있도록 합니다.</w:t>
             </w:r>
           </w:p>
+        </w:tc>
+      </w:tr>
+      <w:tr>
+        <w:trPr/>
+        <w:tc>
+          <w:tcPr>
+            <w:tcW w:type="dxa" w:w="1701"/>
+            <w:vAlign w:val="center"/>
+            <w:tcMar>
+              <w:top w:w="90" w:type="dxa"/>
+              <w:start w:w="110" w:type="dxa"/>
+              <w:bottom w:w="90" w:type="dxa"/>
+              <w:end w:w="110" w:type="dxa"/>
+            </w:tcMar>
+            <w:shd w:fill="EAF2F8"/>
+          </w:tcPr>
           <w:p>
             <w:pPr>
-              <w:spacing w:after="100" w:line="283" w:lineRule="auto"/>
+              <w:spacing w:after="40" w:line="259" w:lineRule="auto"/>
               <w:jc w:val="left"/>
             </w:pPr>
             <w:r>
               <w:rPr>
-                <w:rFonts w:ascii="Calibri" w:hAnsi="Calibri" w:eastAsia="Malgun Gothic" w:cs="Calibri"/>
+                <w:rFonts w:ascii="맑은 고딕" w:hAnsi="맑은 고딕" w:eastAsia="맑은 고딕"/>
                 <w:b w:val="0"/>
-                <w:color w:val="000000"/>
-                <w:sz w:val="20"/>
+                <w:sz w:val="18"/>
               </w:rPr>
-              <w:t>차별점은 고령자에게 익숙한 문화 표현을 단순 지식 퀴즈로만 다루지 않고, 개인의 생활 기억과 감정 선택으로 연결한다는 점입니다. 기존 학습 앱은 빠른 반응, 경쟁, 긴 입력을 전제하는 경우가 많지만, 새록정원은 큰 터치 영역, 짧은 흐름, 즉시 피드백, 비경쟁 보상, 기억 회상 중심의 진행을 우선합니다. 또한 현재 구현물은 서버 전송 없이 브라우저 로컬 저장소에서 기억 카드와 보상 상태를 관리하는 최소 기능 제품이므로, 초기 실증 단계에서 개인정보 수집 범위를 줄일 수 있습니다. 다만 이 방식은 장기 서비스 단계의 계정 연동, 동의 관리, 암호화 저장, 보호자 권한 관리가 아직 구현되지 않았다는 한계를 함께 가집니다.</w:t>
+            </w:r>
+            <w:r>
+              <w:rPr>
+                <w:rFonts w:ascii="맑은 고딕" w:hAnsi="맑은 고딕" w:eastAsia="맑은 고딕"/>
+                <w:b w:val="0"/>
+                <w:sz w:val="18"/>
+              </w:rPr>
             </w:r>
           </w:p>
+        </w:tc>
+        <w:tc>
+          <w:tcPr>
+            <w:tcW w:type="dxa" w:w="7937"/>
+            <w:vAlign w:val="center"/>
+            <w:tcMar>
+              <w:top w:w="90" w:type="dxa"/>
+              <w:start w:w="110" w:type="dxa"/>
+              <w:bottom w:w="90" w:type="dxa"/>
+              <w:end w:w="110" w:type="dxa"/>
+            </w:tcMar>
+          </w:tcPr>
           <w:p>
             <w:pPr>
-              <w:spacing w:after="100" w:line="283" w:lineRule="auto"/>
+              <w:spacing w:after="40" w:line="259" w:lineRule="auto"/>
               <w:jc w:val="left"/>
             </w:pPr>
             <w:r>
               <w:rPr>
-                <w:rFonts w:ascii="Calibri" w:hAnsi="Calibri" w:eastAsia="Malgun Gothic" w:cs="Calibri"/>
+                <w:rFonts w:ascii="맑은 고딕" w:hAnsi="맑은 고딕" w:eastAsia="맑은 고딕"/>
                 <w:b w:val="0"/>
-                <w:color w:val="000000"/>
-                <w:sz w:val="20"/>
+                <w:sz w:val="18"/>
               </w:rPr>
-              <w:t>대표 화면은 본문 하단의 화면 예시에 정리했습니다. 홈, 학습 피드백, 개인 기억 선택, 정원 보상, 가족·보호자 안내, 설정 및 삭제 흐름을 통해 현재 구현물의 실제 사용 장면을 확인할 수 있습니다.</w:t>
+            </w:r>
+            <w:r>
+              <w:rPr>
+                <w:rFonts w:ascii="맑은 고딕" w:hAnsi="맑은 고딕" w:eastAsia="맑은 고딕"/>
+                <w:b w:val="0"/>
+                <w:sz w:val="18"/>
+              </w:rPr>
+              <w:t>치매 관련 확장 기능은 MMSE, CIST 등 인지선별검사에서 다루는 기억, 주의, 언어, 시공간 구성 능력의 영역을 참고하되, 원검사 문항·채점 기준·진단 목적을 그대로 사용하지 않습니다. 추가 개발·통합 중인 루틴은 세 단어 기억 후 지연 회상, 쉬운 숫자 패턴 따라가기, 단순 도형 따라 그리기, 짧은 문장 따라 말하기 등입니다. 결과는 점수·위험 등급이 아니라 완료 여부, 다시 볼 기억 카드, 보호자와 대화할 단서 중심으로 제시합니다.</w:t>
+            </w:r>
+          </w:p>
+        </w:tc>
+      </w:tr>
+      <w:tr>
+        <w:trPr/>
+        <w:tc>
+          <w:tcPr>
+            <w:tcW w:type="dxa" w:w="1701"/>
+            <w:vAlign w:val="center"/>
+            <w:tcMar>
+              <w:top w:w="90" w:type="dxa"/>
+              <w:start w:w="110" w:type="dxa"/>
+              <w:bottom w:w="90" w:type="dxa"/>
+              <w:end w:w="110" w:type="dxa"/>
+            </w:tcMar>
+            <w:shd w:fill="EAF2F8"/>
+          </w:tcPr>
+          <w:p>
+            <w:pPr>
+              <w:spacing w:after="40" w:line="259" w:lineRule="auto"/>
+              <w:jc w:val="left"/>
+            </w:pPr>
+            <w:r>
+              <w:rPr>
+                <w:rFonts w:ascii="맑은 고딕" w:hAnsi="맑은 고딕" w:eastAsia="맑은 고딕"/>
+                <w:b w:val="0"/>
+                <w:sz w:val="18"/>
+              </w:rPr>
+            </w:r>
+            <w:r>
+              <w:rPr>
+                <w:rFonts w:ascii="맑은 고딕" w:hAnsi="맑은 고딕" w:eastAsia="맑은 고딕"/>
+                <w:b w:val="0"/>
+                <w:sz w:val="18"/>
+              </w:rPr>
+            </w:r>
+          </w:p>
+        </w:tc>
+        <w:tc>
+          <w:tcPr>
+            <w:tcW w:type="dxa" w:w="7937"/>
+            <w:vAlign w:val="center"/>
+            <w:tcMar>
+              <w:top w:w="90" w:type="dxa"/>
+              <w:start w:w="110" w:type="dxa"/>
+              <w:bottom w:w="90" w:type="dxa"/>
+              <w:end w:w="110" w:type="dxa"/>
+            </w:tcMar>
+          </w:tcPr>
+          <w:p>
+            <w:pPr>
+              <w:spacing w:after="40" w:line="259" w:lineRule="auto"/>
+              <w:jc w:val="left"/>
+            </w:pPr>
+            <w:r>
+              <w:rPr>
+                <w:rFonts w:ascii="맑은 고딕" w:hAnsi="맑은 고딕" w:eastAsia="맑은 고딕"/>
+                <w:b w:val="0"/>
+                <w:sz w:val="18"/>
+              </w:rPr>
+            </w:r>
+            <w:r>
+              <w:rPr>
+                <w:rFonts w:ascii="맑은 고딕" w:hAnsi="맑은 고딕" w:eastAsia="맑은 고딕"/>
+                <w:b w:val="0"/>
+                <w:sz w:val="18"/>
+              </w:rPr>
+              <w:t>Haru의 한일 확장성은 언어와 생활기억을 동시에 다룰 수 있다는 점에 있습니다. 한국 버전은 사자성어·속담·생활 장면을 중심으로 구성하고, 일본 버전은 일본어 관용구, ことわざ, 계절·지역·가족 행사 기억 단서로 바꾸어 적용할 수 있습니다. 일본 현장 적용 시에는 일본어 표현, 글자 크기, 버튼 문구, 가족·돌봄자 안내 방식, 개인정보 동의 문구를 현지 사용자와 전문가 자문을 통해 조정합니다.</w:t>
+            </w:r>
+          </w:p>
+        </w:tc>
+      </w:tr>
+      <w:tr>
+        <w:tc>
+          <w:tcPr>
+            <w:tcW w:type="dxa" w:w="1701"/>
+            <w:vAlign w:val="center"/>
+          </w:tcPr>
+          <w:p>
+            <w:pPr>
+              <w:spacing w:after="40" w:line="259" w:lineRule="auto"/>
+              <w:jc w:val="left"/>
+            </w:pPr>
+            <w:r>
+              <w:rPr>
+                <w:rFonts w:ascii="맑은 고딕" w:hAnsi="맑은 고딕" w:eastAsia="맑은 고딕"/>
+                <w:b w:val="0"/>
+                <w:sz w:val="18"/>
+              </w:rPr>
+            </w:r>
+            <w:r>
+              <w:rPr>
+                <w:rFonts w:ascii="맑은 고딕" w:hAnsi="맑은 고딕" w:eastAsia="맑은 고딕"/>
+                <w:b w:val="0"/>
+                <w:sz w:val="18"/>
+              </w:rPr>
+            </w:r>
+          </w:p>
+        </w:tc>
+        <w:tc>
+          <w:tcPr>
+            <w:tcW w:type="dxa" w:w="7937"/>
+            <w:vAlign w:val="center"/>
+          </w:tcPr>
+          <w:p>
+            <w:pPr>
+              <w:spacing w:after="40" w:line="259" w:lineRule="auto"/>
+              <w:jc w:val="left"/>
+            </w:pPr>
+            <w:r>
+              <w:rPr>
+                <w:rFonts w:ascii="맑은 고딕" w:hAnsi="맑은 고딕" w:eastAsia="맑은 고딕"/>
+                <w:b w:val="0"/>
+                <w:sz w:val="18"/>
+              </w:rPr>
+            </w:r>
+            <w:r>
+              <w:rPr>
+                <w:rFonts w:ascii="맑은 고딕" w:hAnsi="맑은 고딕" w:eastAsia="맑은 고딕"/>
+                <w:b w:val="0"/>
+                <w:sz w:val="18"/>
+              </w:rPr>
+              <w:t>Haru의 차별성은 고령 사용자가 부담을 느끼기 쉬운 자유 입력, 긴 검사, 복잡한 계정 절차를 줄이고, 듀오링고형 짧은 세션과 큰 선택 버튼, 즉각 피드백, 봄의 정원처럼 자라나는 보상 구조를 결합했다는 점입니다. 또한 개인정보는 기본적으로 로컬 저장을 우선하고, 사용자가 기억 카드 공유와 삭제 여부를 선택하도록 하여 실서비스 개발 단계에서 데이터 최소 수집 원칙을 지키는 방향으로 설계합니다.</w:t>
             </w:r>
           </w:p>
         </w:tc>
       </w:tr>
     </w:tbl>
-    <w:p/>
+    <w:p>
+      <w:pPr>
+        <w:spacing w:after="40" w:line="250" w:lineRule="auto"/>
+      </w:pPr>
+    </w:p>
     <w:tbl>
       <w:tblPr>
         <w:tblW w:type="auto" w:w="0"/>
@@ -437,29 +802,36 @@
         <w:gridCol w:w="7937"/>
       </w:tblGrid>
       <w:tr>
+        <w:trPr/>
         <w:tc>
           <w:tcPr>
             <w:tcW w:type="dxa" w:w="1701"/>
-            <w:vAlign w:val="top"/>
+            <w:vAlign w:val="center"/>
             <w:tcMar>
               <w:top w:w="90" w:type="dxa"/>
-              <w:start w:w="140" w:type="dxa"/>
+              <w:start w:w="110" w:type="dxa"/>
               <w:bottom w:w="90" w:type="dxa"/>
-              <w:end w:w="140" w:type="dxa"/>
+              <w:end w:w="110" w:type="dxa"/>
             </w:tcMar>
-            <w:shd w:fill="F4F6F9"/>
+            <w:shd w:fill="EAF2F8"/>
           </w:tcPr>
           <w:p>
             <w:pPr>
-              <w:spacing w:after="100" w:line="283" w:lineRule="auto"/>
-              <w:jc w:val="center"/>
+              <w:spacing w:after="40" w:line="259" w:lineRule="auto"/>
+              <w:jc w:val="left"/>
             </w:pPr>
             <w:r>
               <w:rPr>
-                <w:rFonts w:ascii="Calibri" w:hAnsi="Calibri" w:eastAsia="Malgun Gothic" w:cs="Calibri"/>
+                <w:rFonts w:ascii="맑은 고딕" w:hAnsi="맑은 고딕" w:eastAsia="맑은 고딕"/>
                 <w:b/>
-                <w:color w:val="1F4D78"/>
-                <w:sz w:val="20"/>
+                <w:sz w:val="18"/>
+              </w:rPr>
+            </w:r>
+            <w:r>
+              <w:rPr>
+                <w:rFonts w:ascii="맑은 고딕" w:hAnsi="맑은 고딕" w:eastAsia="맑은 고딕"/>
+                <w:b/>
+                <w:sz w:val="18"/>
               </w:rPr>
               <w:t>배경 및 목적</w:t>
             </w:r>
@@ -468,93 +840,360 @@
         <w:tc>
           <w:tcPr>
             <w:tcW w:type="dxa" w:w="7937"/>
-            <w:vAlign w:val="top"/>
+            <w:vAlign w:val="center"/>
             <w:tcMar>
               <w:top w:w="90" w:type="dxa"/>
-              <w:start w:w="140" w:type="dxa"/>
+              <w:start w:w="110" w:type="dxa"/>
               <w:bottom w:w="90" w:type="dxa"/>
-              <w:end w:w="140" w:type="dxa"/>
+              <w:end w:w="110" w:type="dxa"/>
             </w:tcMar>
           </w:tcPr>
           <w:p>
             <w:pPr>
-              <w:spacing w:after="100" w:line="283" w:lineRule="auto"/>
+              <w:spacing w:after="40" w:line="259" w:lineRule="auto"/>
               <w:jc w:val="left"/>
             </w:pPr>
             <w:r>
               <w:rPr>
-                <w:rFonts w:ascii="Calibri" w:hAnsi="Calibri" w:eastAsia="Malgun Gothic" w:cs="Calibri"/>
+                <w:rFonts w:ascii="맑은 고딕" w:hAnsi="맑은 고딕" w:eastAsia="맑은 고딕"/>
                 <w:b w:val="0"/>
-                <w:color w:val="000000"/>
-                <w:sz w:val="20"/>
+                <w:sz w:val="18"/>
               </w:rPr>
-              <w:t>한국은 2025년 65세 이상 고령인구가 1,051만 4천 명으로 전체 인구의 20.3%를 차지하여 초고령사회에 진입한 상태입니다. 통계청은 고령인구 비중이 2036년 30%, 2050년 40%를 넘어설 것으로 전망하고 있습니다. 이는 노인돌봄 문제가 일부 가정의 문제가 아니라 지역사회, 가족, 복지기관, 디지털 서비스가 함께 대응해야 할 사회공공문제임을 의미합니다.</w:t>
+            </w:r>
+            <w:r>
+              <w:rPr>
+                <w:rFonts w:ascii="맑은 고딕" w:hAnsi="맑은 고딕" w:eastAsia="맑은 고딕"/>
+                <w:b w:val="0"/>
+                <w:sz w:val="18"/>
+              </w:rPr>
+              <w:t>한국은 이미 초고령사회에 진입했습니다. 통계청의 2025 고령자 통계에 따르면 2025년 65세 이상 고령인구는 1,051만 4천 명으로 전체 인구의 20.3%를 차지하고, 2050년에는 40.1%까지 증가할 것으로 전망됩니다[참고 1]. 고령화는 노인돌봄, 가족 돌봄 부담, 사회적 고립, 인지 건강 관리의 필요성을 함께 키우고 있습니다.</w:t>
             </w:r>
           </w:p>
+        </w:tc>
+      </w:tr>
+      <w:tr>
+        <w:trPr/>
+        <w:tc>
+          <w:tcPr>
+            <w:tcW w:type="dxa" w:w="1701"/>
+            <w:vAlign w:val="center"/>
+            <w:tcMar>
+              <w:top w:w="90" w:type="dxa"/>
+              <w:start w:w="110" w:type="dxa"/>
+              <w:bottom w:w="90" w:type="dxa"/>
+              <w:end w:w="110" w:type="dxa"/>
+            </w:tcMar>
+            <w:shd w:fill="EAF2F8"/>
+          </w:tcPr>
           <w:p>
             <w:pPr>
-              <w:spacing w:after="100" w:line="283" w:lineRule="auto"/>
+              <w:spacing w:after="40" w:line="259" w:lineRule="auto"/>
               <w:jc w:val="left"/>
             </w:pPr>
             <w:r>
               <w:rPr>
-                <w:rFonts w:ascii="Calibri" w:hAnsi="Calibri" w:eastAsia="Malgun Gothic" w:cs="Calibri"/>
+                <w:rFonts w:ascii="맑은 고딕" w:hAnsi="맑은 고딕" w:eastAsia="맑은 고딕"/>
                 <w:b w:val="0"/>
-                <w:color w:val="000000"/>
-                <w:sz w:val="20"/>
+                <w:sz w:val="18"/>
               </w:rPr>
-              <w:t>고령화와 함께 치매와 돌봄 부담도 중요한 과제로 커지고 있습니다. 세계보건기구는 2021년 전 세계 치매 환자가 5,700만 명이며 매년 약 1,000만 명의 신규 사례가 발생한다고 설명합니다. 또한 치매는 고령자의 장애와 의존을 일으키는 주요 원인 중 하나이며, 가족과 가까운 지인이 제공하는 비공식 돌봄이 큰 비중을 차지한다고 밝히고 있습니다. 경제협력개발기구도 장기요양이 필요한 사람에게 가족과 지인이 제공하는 비공식 돌봄이 주요 돌봄 자원이며, 25개 회원국 기준 50세 이상 인구의 13%가 비공식 돌봄을 제공한다고 보고했습니다. 따라서 고령자가 스스로 참여할 수 있는 일상 루틴과 가족이 부담 없이 관심을 이어갈 수 있는 가벼운 연결 구조가 필요합니다.</w:t>
+            </w:r>
+            <w:r>
+              <w:rPr>
+                <w:rFonts w:ascii="맑은 고딕" w:hAnsi="맑은 고딕" w:eastAsia="맑은 고딕"/>
+                <w:b w:val="0"/>
+                <w:sz w:val="18"/>
+              </w:rPr>
             </w:r>
           </w:p>
+        </w:tc>
+        <w:tc>
+          <w:tcPr>
+            <w:tcW w:type="dxa" w:w="7937"/>
+            <w:vAlign w:val="center"/>
+            <w:tcMar>
+              <w:top w:w="90" w:type="dxa"/>
+              <w:start w:w="110" w:type="dxa"/>
+              <w:bottom w:w="90" w:type="dxa"/>
+              <w:end w:w="110" w:type="dxa"/>
+            </w:tcMar>
+          </w:tcPr>
           <w:p>
             <w:pPr>
-              <w:spacing w:after="100" w:line="283" w:lineRule="auto"/>
+              <w:spacing w:after="40" w:line="259" w:lineRule="auto"/>
               <w:jc w:val="left"/>
             </w:pPr>
             <w:r>
               <w:rPr>
-                <w:rFonts w:ascii="Calibri" w:hAnsi="Calibri" w:eastAsia="Malgun Gothic" w:cs="Calibri"/>
+                <w:rFonts w:ascii="맑은 고딕" w:hAnsi="맑은 고딕" w:eastAsia="맑은 고딕"/>
                 <w:b w:val="0"/>
-                <w:color w:val="000000"/>
-                <w:sz w:val="20"/>
+                <w:sz w:val="18"/>
               </w:rPr>
-              <w:t>정서적 고립과 외로움 또한 중요한 배경입니다. 세계보건기구는 사회적 고립과 외로움이 건강과 삶의 질에 영향을 주는 사회적 결정요인이며, 전 세계적으로 약 6명 중 1명이 외로움을 경험하고 고령자 중 약 10명 중 1명이 외로움을 경험한다고 설명합니다. 특히 고령자는 이동성 저하, 건강 문제, 디지털 접근성 장벽 때문에 새로운 활동과 관계를 시작하기 어려울 수 있습니다. 정보통신기술 기반 취미·체험형 프로그램은 이러한 장벽을 낮추고, 집이나 기관에서도 반복 가능한 작은 참여 기회를 만들 수 있습니다.</w:t>
+            </w:r>
+            <w:r>
+              <w:rPr>
+                <w:rFonts w:ascii="맑은 고딕" w:hAnsi="맑은 고딕" w:eastAsia="맑은 고딕"/>
+                <w:b w:val="0"/>
+                <w:sz w:val="18"/>
+              </w:rPr>
+              <w:t>일본 역시 본 과제와 직접 맞닿아 있는 초고령사회입니다. 일본 내각부의 2025 고령사회백서 개요는 2024년 10월 1일 기준 65세 이상 인구 3,624만 명, 고령화율 29.3%를 제시하고, 65세 이상 1인 가구 비율도 장기적으로 증가한다고 설명합니다[참고 9]. 따라서 Haru는 한국에서만 통하는 서비스가 아니라, 일본의 고령자 일상·언어·가족 돌봄 맥락에도 맞게 조정할 수 있어야 합니다.</w:t>
             </w:r>
           </w:p>
+        </w:tc>
+      </w:tr>
+      <w:tr>
+        <w:trPr/>
+        <w:tc>
+          <w:tcPr>
+            <w:tcW w:type="dxa" w:w="1701"/>
+            <w:vAlign w:val="center"/>
+            <w:tcMar>
+              <w:top w:w="90" w:type="dxa"/>
+              <w:start w:w="110" w:type="dxa"/>
+              <w:bottom w:w="90" w:type="dxa"/>
+              <w:end w:w="110" w:type="dxa"/>
+            </w:tcMar>
+            <w:shd w:fill="EAF2F8"/>
+          </w:tcPr>
           <w:p>
             <w:pPr>
-              <w:spacing w:after="100" w:line="283" w:lineRule="auto"/>
+              <w:spacing w:after="40" w:line="259" w:lineRule="auto"/>
               <w:jc w:val="left"/>
             </w:pPr>
             <w:r>
               <w:rPr>
-                <w:rFonts w:ascii="Calibri" w:hAnsi="Calibri" w:eastAsia="Malgun Gothic" w:cs="Calibri"/>
+                <w:rFonts w:ascii="맑은 고딕" w:hAnsi="맑은 고딕" w:eastAsia="맑은 고딕"/>
                 <w:b w:val="0"/>
-                <w:color w:val="000000"/>
-                <w:sz w:val="20"/>
+                <w:sz w:val="18"/>
               </w:rPr>
-              <w:t>새록정원의 목적은 고령자가 치료나 평가의 대상이 아니라 자신의 경험을 가진 참여자로 활동할 수 있게 하는 것입니다. 사자성어와 문화 표현은 세대가 공유하기 쉬운 소재이고, 개인 기억 선택은 과거 경험을 자연스럽게 떠올리는 계기가 됩니다. 회상 활동과 인지 자극에 관한 문헌은 일부 상황에서 삶의 질, 의사소통, 인지 기능 등에 작은 긍정 가능성을 보고하지만, 효과의 크기와 적용 조건에는 차이가 있습니다. 따라서 본 개발물은 치매 예방, 치료, 인지 개선 효과를 단정하지 않고, 비의료적 일상 활동으로서 정서 회상, 자기표현, 반복 참여 가능성을 검증하는 데 목적을 둡니다.</w:t>
+            </w:r>
+            <w:r>
+              <w:rPr>
+                <w:rFonts w:ascii="맑은 고딕" w:hAnsi="맑은 고딕" w:eastAsia="맑은 고딕"/>
+                <w:b w:val="0"/>
+                <w:sz w:val="18"/>
+              </w:rPr>
             </w:r>
           </w:p>
+        </w:tc>
+        <w:tc>
+          <w:tcPr>
+            <w:tcW w:type="dxa" w:w="7937"/>
+            <w:vAlign w:val="center"/>
+            <w:tcMar>
+              <w:top w:w="90" w:type="dxa"/>
+              <w:start w:w="110" w:type="dxa"/>
+              <w:bottom w:w="90" w:type="dxa"/>
+              <w:end w:w="110" w:type="dxa"/>
+            </w:tcMar>
+          </w:tcPr>
           <w:p>
             <w:pPr>
-              <w:spacing w:after="100" w:line="283" w:lineRule="auto"/>
+              <w:spacing w:after="40" w:line="259" w:lineRule="auto"/>
               <w:jc w:val="left"/>
             </w:pPr>
             <w:r>
               <w:rPr>
-                <w:rFonts w:ascii="Calibri" w:hAnsi="Calibri" w:eastAsia="Malgun Gothic" w:cs="Calibri"/>
+                <w:rFonts w:ascii="맑은 고딕" w:hAnsi="맑은 고딕" w:eastAsia="맑은 고딕"/>
                 <w:b w:val="0"/>
-                <w:color w:val="000000"/>
-                <w:sz w:val="20"/>
+                <w:sz w:val="18"/>
               </w:rPr>
-              <w:t>또 하나의 목적은 고령자 접근성을 고려한 디지털 경험을 만드는 것입니다. 세계 웹 표준 관련 자료는 고령 사용자가 시력, 손 조작, 청력, 단기 기억, 집중력 변화로 웹 사용에 어려움을 겪을 수 있다고 설명합니다. 새록정원은 이러한 특성을 고려하여 큰 버튼, 짧은 단계, 명확한 진행률, 시각적 보상, 선택 중심 입력을 적용했습니다. 대회 기간에는 대비, 문구, 음성 안내, 보호자 권한, 데이터 삭제 흐름을 추가 검증하여 현장 적용성을 높이고자 합니다.</w:t>
+            </w:r>
+            <w:r>
+              <w:rPr>
+                <w:rFonts w:ascii="맑은 고딕" w:hAnsi="맑은 고딕" w:eastAsia="맑은 고딕"/>
+                <w:b w:val="0"/>
+                <w:sz w:val="18"/>
+              </w:rPr>
+              <w:t>치매는 한일 양국 노인돌봄 문제의 핵심 배경 중 하나입니다. 세계보건기구는 2021년 전 세계 치매 인구를 5,700만 명으로 제시하며, 치매가 고령자의 장애와 의존을 유발하는 주요 원인이고 가족 등 비공식 돌봄자의 부담도 크다고 설명합니다[참고 2]. 일본 경제산업성도 2022년 일본의 치매 고령자 약 443만 명, MCI 고령자 약 559만 명, 2040년 치매·MCI 합계 약 1,200만 명 전망을 제시하며, 당사자 참여형 개발과 공동창작의 중요성을 설명합니다[참고 11].</w:t>
+            </w:r>
+          </w:p>
+        </w:tc>
+      </w:tr>
+      <w:tr>
+        <w:trPr/>
+        <w:tc>
+          <w:tcPr>
+            <w:tcW w:type="dxa" w:w="1701"/>
+            <w:vAlign w:val="center"/>
+            <w:tcMar>
+              <w:top w:w="90" w:type="dxa"/>
+              <w:start w:w="110" w:type="dxa"/>
+              <w:bottom w:w="90" w:type="dxa"/>
+              <w:end w:w="110" w:type="dxa"/>
+            </w:tcMar>
+            <w:shd w:fill="EAF2F8"/>
+          </w:tcPr>
+          <w:p>
+            <w:pPr>
+              <w:spacing w:after="40" w:line="259" w:lineRule="auto"/>
+              <w:jc w:val="left"/>
+            </w:pPr>
+            <w:r>
+              <w:rPr>
+                <w:rFonts w:ascii="맑은 고딕" w:hAnsi="맑은 고딕" w:eastAsia="맑은 고딕"/>
+                <w:b w:val="0"/>
+                <w:sz w:val="18"/>
+              </w:rPr>
+            </w:r>
+            <w:r>
+              <w:rPr>
+                <w:rFonts w:ascii="맑은 고딕" w:hAnsi="맑은 고딕" w:eastAsia="맑은 고딕"/>
+                <w:b w:val="0"/>
+                <w:sz w:val="18"/>
+              </w:rPr>
+            </w:r>
+          </w:p>
+        </w:tc>
+        <w:tc>
+          <w:tcPr>
+            <w:tcW w:type="dxa" w:w="7937"/>
+            <w:vAlign w:val="center"/>
+            <w:tcMar>
+              <w:top w:w="90" w:type="dxa"/>
+              <w:start w:w="110" w:type="dxa"/>
+              <w:bottom w:w="90" w:type="dxa"/>
+              <w:end w:w="110" w:type="dxa"/>
+            </w:tcMar>
+          </w:tcPr>
+          <w:p>
+            <w:pPr>
+              <w:spacing w:after="40" w:line="259" w:lineRule="auto"/>
+              <w:jc w:val="left"/>
+            </w:pPr>
+            <w:r>
+              <w:rPr>
+                <w:rFonts w:ascii="맑은 고딕" w:hAnsi="맑은 고딕" w:eastAsia="맑은 고딕"/>
+                <w:b w:val="0"/>
+                <w:sz w:val="18"/>
+              </w:rPr>
+            </w:r>
+            <w:r>
+              <w:rPr>
+                <w:rFonts w:ascii="맑은 고딕" w:hAnsi="맑은 고딕" w:eastAsia="맑은 고딕"/>
+                <w:b w:val="0"/>
+                <w:sz w:val="18"/>
+              </w:rPr>
+              <w:t>일본 후생노동성은 2024년 12월 3일 치매시책추진기본계획을 결정하고, 치매가 누구에게나 일어날 수 있다는 전제, 당사자의 목소리 존중, 지역사회에서 희망을 가지고 자기답게 살아갈 수 있는 환경, 다양한 주체의 연계·협력을 강조합니다[참고 10]. 이는 Haru가 질병을 검사하는 앱이 아니라, 고령 사용자가 매일 짧게 참여하고 가족·지역과 대화 단서를 만들 수 있는 비의료적 일상 루틴이어야 한다는 방향과 맞닿아 있습니다.</w:t>
+            </w:r>
+          </w:p>
+        </w:tc>
+      </w:tr>
+      <w:tr>
+        <w:tc>
+          <w:tcPr>
+            <w:tcW w:type="dxa" w:w="1701"/>
+            <w:vAlign w:val="center"/>
+          </w:tcPr>
+          <w:p>
+            <w:pPr>
+              <w:spacing w:after="40" w:line="259" w:lineRule="auto"/>
+              <w:jc w:val="left"/>
+            </w:pPr>
+            <w:r>
+              <w:rPr>
+                <w:rFonts w:ascii="맑은 고딕" w:hAnsi="맑은 고딕" w:eastAsia="맑은 고딕"/>
+                <w:b w:val="0"/>
+                <w:sz w:val="18"/>
+              </w:rPr>
+            </w:r>
+            <w:r>
+              <w:rPr>
+                <w:rFonts w:ascii="맑은 고딕" w:hAnsi="맑은 고딕" w:eastAsia="맑은 고딕"/>
+                <w:b w:val="0"/>
+                <w:sz w:val="18"/>
+              </w:rPr>
+            </w:r>
+          </w:p>
+        </w:tc>
+        <w:tc>
+          <w:tcPr>
+            <w:tcW w:type="dxa" w:w="7937"/>
+            <w:vAlign w:val="center"/>
+          </w:tcPr>
+          <w:p>
+            <w:pPr>
+              <w:spacing w:after="40" w:line="259" w:lineRule="auto"/>
+              <w:jc w:val="left"/>
+            </w:pPr>
+            <w:r>
+              <w:rPr>
+                <w:rFonts w:ascii="맑은 고딕" w:hAnsi="맑은 고딕" w:eastAsia="맑은 고딕"/>
+                <w:b w:val="0"/>
+                <w:sz w:val="18"/>
+              </w:rPr>
+            </w:r>
+            <w:r>
+              <w:rPr>
+                <w:rFonts w:ascii="맑은 고딕" w:hAnsi="맑은 고딕" w:eastAsia="맑은 고딕"/>
+                <w:b w:val="0"/>
+                <w:sz w:val="18"/>
+              </w:rPr>
+              <w:t>다만 Haru는 치매를 진단, 선별, 치료하거나 위험도를 판정하는 의료기기가 아닙니다. 국내 공공 현장에서 쓰이는 CIST는 지남력, 주의력, 언어, 시공간 기능, 기억력, 집행기능 등 여러 인지 영역을 다루는 선별 도구로 보고되어 있습니다[참고 4]. Haru는 이러한 인지 영역의 존재를 참고해 활동 구조를 설계하되, 의료적 판정 대신 사용자의 일상 참여, 회상, 보호자와의 대화 형성을 목표로 합니다.</w:t>
+            </w:r>
+          </w:p>
+        </w:tc>
+      </w:tr>
+      <w:tr>
+        <w:tc>
+          <w:tcPr>
+            <w:tcW w:type="dxa" w:w="1701"/>
+            <w:vAlign w:val="center"/>
+          </w:tcPr>
+          <w:p>
+            <w:pPr>
+              <w:spacing w:after="40" w:line="259" w:lineRule="auto"/>
+              <w:jc w:val="left"/>
+            </w:pPr>
+            <w:r>
+              <w:rPr>
+                <w:rFonts w:ascii="맑은 고딕" w:hAnsi="맑은 고딕" w:eastAsia="맑은 고딕"/>
+                <w:b w:val="0"/>
+                <w:sz w:val="18"/>
+              </w:rPr>
+            </w:r>
+            <w:r>
+              <w:rPr>
+                <w:rFonts w:ascii="맑은 고딕" w:hAnsi="맑은 고딕" w:eastAsia="맑은 고딕"/>
+                <w:b w:val="0"/>
+                <w:sz w:val="18"/>
+              </w:rPr>
+            </w:r>
+          </w:p>
+        </w:tc>
+        <w:tc>
+          <w:tcPr>
+            <w:tcW w:type="dxa" w:w="7937"/>
+            <w:vAlign w:val="center"/>
+          </w:tcPr>
+          <w:p>
+            <w:pPr>
+              <w:spacing w:after="40" w:line="259" w:lineRule="auto"/>
+              <w:jc w:val="left"/>
+            </w:pPr>
+            <w:r>
+              <w:rPr>
+                <w:rFonts w:ascii="맑은 고딕" w:hAnsi="맑은 고딕" w:eastAsia="맑은 고딕"/>
+                <w:b w:val="0"/>
+                <w:sz w:val="18"/>
+              </w:rPr>
+            </w:r>
+            <w:r>
+              <w:rPr>
+                <w:rFonts w:ascii="맑은 고딕" w:hAnsi="맑은 고딕" w:eastAsia="맑은 고딕"/>
+                <w:b w:val="0"/>
+                <w:sz w:val="18"/>
+              </w:rPr>
+              <w:t>또한 회상 활동과 인지 자극은 고령자의 정서적 연결과 사회적 상호작용을 돕는 방향으로 설계할 필요가 있습니다. Cochrane 리뷰는 경도·중등도 치매 대상 인지 자극 프로그램에서 작은 단기 인지 이득과 의사소통·사회적 상호작용 개선 가능성을 보고했고[참고 5], 회상요법 리뷰는 삶의 질과 의사소통 등 일부 결과에서 가능성을 제시했으나 효과가 조건에 따라 다르다는 점도 함께 보여줍니다[참고 6]. 따라서 Haru는 효과를 과장하지 않고, 공모전 기간 중 전문가 자문과 사용자 피드백을 통해 안전한 비의료 서비스로 구체화합니다.</w:t>
             </w:r>
           </w:p>
         </w:tc>
       </w:tr>
     </w:tbl>
-    <w:p/>
+    <w:p>
+      <w:pPr>
+        <w:spacing w:after="40" w:line="250" w:lineRule="auto"/>
+      </w:pPr>
+    </w:p>
     <w:tbl>
       <w:tblPr>
         <w:tblW w:type="auto" w:w="0"/>
@@ -575,29 +1214,36 @@
         <w:gridCol w:w="7937"/>
       </w:tblGrid>
       <w:tr>
+        <w:trPr/>
         <w:tc>
           <w:tcPr>
             <w:tcW w:type="dxa" w:w="1701"/>
-            <w:vAlign w:val="top"/>
+            <w:vAlign w:val="center"/>
             <w:tcMar>
               <w:top w:w="90" w:type="dxa"/>
-              <w:start w:w="140" w:type="dxa"/>
+              <w:start w:w="110" w:type="dxa"/>
               <w:bottom w:w="90" w:type="dxa"/>
-              <w:end w:w="140" w:type="dxa"/>
+              <w:end w:w="110" w:type="dxa"/>
             </w:tcMar>
-            <w:shd w:fill="F4F6F9"/>
+            <w:shd w:fill="EAF2F8"/>
           </w:tcPr>
           <w:p>
             <w:pPr>
-              <w:spacing w:after="100" w:line="283" w:lineRule="auto"/>
-              <w:jc w:val="center"/>
+              <w:spacing w:after="40" w:line="259" w:lineRule="auto"/>
+              <w:jc w:val="left"/>
             </w:pPr>
             <w:r>
               <w:rPr>
-                <w:rFonts w:ascii="Calibri" w:hAnsi="Calibri" w:eastAsia="Malgun Gothic" w:cs="Calibri"/>
+                <w:rFonts w:ascii="맑은 고딕" w:hAnsi="맑은 고딕" w:eastAsia="맑은 고딕"/>
                 <w:b/>
-                <w:color w:val="1F4D78"/>
-                <w:sz w:val="20"/>
+                <w:sz w:val="18"/>
+              </w:rPr>
+            </w:r>
+            <w:r>
+              <w:rPr>
+                <w:rFonts w:ascii="맑은 고딕" w:hAnsi="맑은 고딕" w:eastAsia="맑은 고딕"/>
+                <w:b/>
+                <w:sz w:val="18"/>
               </w:rPr>
               <w:t>개발 계획</w:t>
             </w:r>
@@ -606,109 +1252,433 @@
         <w:tc>
           <w:tcPr>
             <w:tcW w:type="dxa" w:w="7937"/>
-            <w:vAlign w:val="top"/>
+            <w:vAlign w:val="center"/>
             <w:tcMar>
               <w:top w:w="90" w:type="dxa"/>
-              <w:start w:w="140" w:type="dxa"/>
+              <w:start w:w="110" w:type="dxa"/>
               <w:bottom w:w="90" w:type="dxa"/>
-              <w:end w:w="140" w:type="dxa"/>
+              <w:end w:w="110" w:type="dxa"/>
             </w:tcMar>
           </w:tcPr>
           <w:p>
             <w:pPr>
-              <w:spacing w:after="100" w:line="283" w:lineRule="auto"/>
+              <w:spacing w:after="40" w:line="259" w:lineRule="auto"/>
               <w:jc w:val="left"/>
             </w:pPr>
             <w:r>
               <w:rPr>
-                <w:rFonts w:ascii="Calibri" w:hAnsi="Calibri" w:eastAsia="Malgun Gothic" w:cs="Calibri"/>
+                <w:rFonts w:ascii="맑은 고딕" w:hAnsi="맑은 고딕" w:eastAsia="맑은 고딕"/>
                 <w:b w:val="0"/>
-                <w:color w:val="000000"/>
-                <w:sz w:val="20"/>
+                <w:sz w:val="18"/>
               </w:rPr>
-              <w:t>현재 구현된 최소 기능 제품은 리액트 기반 웹앱으로 작동하며, 홈, 학습, 결과, 정원, 가족, 설정 화면을 갖추고 있습니다. 학습 화면은 사자성어 뜻 선택, 상황 매칭, 짝 맞추기, 개인 기억 회상 등 주요 흐름을 실제로 진행할 수 있고, 저장된 기억 카드가 있으면 이후 학습 세션에 기억 복습 문항을 삽입할 수 있습니다. 검증 결과 현재 워크트리에서 형식 검사, 정적 분석, 단위 테스트, 빌드가 모두 통과했습니다.</w:t>
+            </w:r>
+            <w:r>
+              <w:rPr>
+                <w:rFonts w:ascii="맑은 고딕" w:hAnsi="맑은 고딕" w:eastAsia="맑은 고딕"/>
+                <w:b w:val="0"/>
+                <w:sz w:val="18"/>
+              </w:rPr>
+              <w:t>현재 Haru는 완성된 상용 서비스가 아니라, 리액트 기반 프론트엔드 데모와 핵심 사용자 흐름을 검증하기 위한 프로토타입입니다. 홈, 학습, 결과, 정원, 가족·보호자, 설정 화면과 Vercel 데모 URL은 제출 전 개발 준비도를 보여주기 위한 자료이며, 실제 서비스 수준의 백엔드, 개인화 알고리즘, 개인정보 처리 구조, 현장 검증은 피우다 프로젝트 개발 기간과 멘토링을 통해 고도화할 계획입니다.</w:t>
             </w:r>
           </w:p>
+        </w:tc>
+      </w:tr>
+      <w:tr>
+        <w:trPr/>
+        <w:tc>
+          <w:tcPr>
+            <w:tcW w:type="dxa" w:w="1701"/>
+            <w:vAlign w:val="center"/>
+            <w:tcMar>
+              <w:top w:w="90" w:type="dxa"/>
+              <w:start w:w="110" w:type="dxa"/>
+              <w:bottom w:w="90" w:type="dxa"/>
+              <w:end w:w="110" w:type="dxa"/>
+            </w:tcMar>
+            <w:shd w:fill="EAF2F8"/>
+          </w:tcPr>
           <w:p>
             <w:pPr>
-              <w:spacing w:after="100" w:line="283" w:lineRule="auto"/>
+              <w:spacing w:after="40" w:line="259" w:lineRule="auto"/>
               <w:jc w:val="left"/>
             </w:pPr>
             <w:r>
               <w:rPr>
-                <w:rFonts w:ascii="Calibri" w:hAnsi="Calibri" w:eastAsia="Malgun Gothic" w:cs="Calibri"/>
+                <w:rFonts w:ascii="맑은 고딕" w:hAnsi="맑은 고딕" w:eastAsia="맑은 고딕"/>
                 <w:b w:val="0"/>
-                <w:color w:val="000000"/>
-                <w:sz w:val="20"/>
+                <w:sz w:val="18"/>
               </w:rPr>
-              <w:t>1단계는 1차 개발 기간에 현재 프로토타입을 제출 가능한 서비스 흐름으로 정리하는 것입니다. 구체적으로 사자성어와 문화 표현 콘텐츠를 확장하고, 현재 1개 레슨 중심 구조를 여러 일일 세션으로 나눕니다. 고령자가 화면을 읽고 누르는 데 어려움이 없는지 확인하기 위해 버튼 크기, 문장 길이, 색 대비, 진행 표시, 피드백 문구를 점검합니다. 또한 현재 브라우저 로컬 저장소에 저장되는 기억 카드 구조를 정리하고, 기억 주제·감정 태그·복습 상태가 안정적으로 관리되는지 확인합니다.</w:t>
+            </w:r>
+            <w:r>
+              <w:rPr>
+                <w:rFonts w:ascii="맑은 고딕" w:hAnsi="맑은 고딕" w:eastAsia="맑은 고딕"/>
+                <w:b w:val="0"/>
+                <w:sz w:val="18"/>
+              </w:rPr>
             </w:r>
           </w:p>
+        </w:tc>
+        <w:tc>
+          <w:tcPr>
+            <w:tcW w:type="dxa" w:w="7937"/>
+            <w:vAlign w:val="center"/>
+            <w:tcMar>
+              <w:top w:w="90" w:type="dxa"/>
+              <w:start w:w="110" w:type="dxa"/>
+              <w:bottom w:w="90" w:type="dxa"/>
+              <w:end w:w="110" w:type="dxa"/>
+            </w:tcMar>
+          </w:tcPr>
           <w:p>
             <w:pPr>
-              <w:spacing w:after="100" w:line="283" w:lineRule="auto"/>
+              <w:spacing w:after="40" w:line="259" w:lineRule="auto"/>
               <w:jc w:val="left"/>
             </w:pPr>
             <w:r>
               <w:rPr>
-                <w:rFonts w:ascii="Calibri" w:hAnsi="Calibri" w:eastAsia="Malgun Gothic" w:cs="Calibri"/>
+                <w:rFonts w:ascii="맑은 고딕" w:hAnsi="맑은 고딕" w:eastAsia="맑은 고딕"/>
                 <w:b w:val="0"/>
-                <w:color w:val="000000"/>
-                <w:sz w:val="20"/>
+                <w:sz w:val="18"/>
               </w:rPr>
-              <w:t>2단계는 중간심사 전후로 실사용 시나리오를 강화하는 것입니다. 홈에서 학습 시작, 문항 진행, 개인 기억 선택, 결과 보상, 정원 확인, 가족 안내, 설정에서 기억 카드 삭제까지 하나의 시나리오로 묶어 시연합니다. 보호자 기능은 현재 실제 초대 발송이나 계정 연동이 아니라 안내 화면 수준이므로, 중간 단계에서는 “사용자 동의 후 선택한 기억만 공유한다”는 설계 원칙과 화면 흐름을 먼저 검증합니다. 실제 공유, 보호자 계정, 접근권한, 동의 이력은 후속 개발 계획으로 분리합니다.</w:t>
+            </w:r>
+            <w:r>
+              <w:rPr>
+                <w:rFonts w:ascii="맑은 고딕" w:hAnsi="맑은 고딕" w:eastAsia="맑은 고딕"/>
+                <w:b w:val="0"/>
+                <w:sz w:val="18"/>
+              </w:rPr>
+              <w:t>신청접수 및 예선 단계(4.1.~5.17. 23:59 접수, 5.19.~5.22. 서류심사)에는 Haru의 문제정의, 한일 노인돌봄 적합성, 현재 데모 URL, 팀 역량, 근거 문헌, 추가 개발 범위를 명확히 제시합니다. 이 단계의 산출물은 신청서, 데모 링크, 초기 화면 자료, 기능 고도화 계획이며, 과장된 의료 효과 대신 비진단 인지·정서 루틴이라는 범위를 분명히 합니다.</w:t>
             </w:r>
           </w:p>
+        </w:tc>
+      </w:tr>
+      <w:tr>
+        <w:trPr/>
+        <w:tc>
+          <w:tcPr>
+            <w:tcW w:type="dxa" w:w="1701"/>
+            <w:vAlign w:val="center"/>
+            <w:tcMar>
+              <w:top w:w="90" w:type="dxa"/>
+              <w:start w:w="110" w:type="dxa"/>
+              <w:bottom w:w="90" w:type="dxa"/>
+              <w:end w:w="110" w:type="dxa"/>
+            </w:tcMar>
+            <w:shd w:fill="EAF2F8"/>
+          </w:tcPr>
           <w:p>
             <w:pPr>
-              <w:spacing w:after="100" w:line="283" w:lineRule="auto"/>
+              <w:spacing w:after="40" w:line="259" w:lineRule="auto"/>
               <w:jc w:val="left"/>
             </w:pPr>
             <w:r>
               <w:rPr>
-                <w:rFonts w:ascii="Calibri" w:hAnsi="Calibri" w:eastAsia="Malgun Gothic" w:cs="Calibri"/>
+                <w:rFonts w:ascii="맑은 고딕" w:hAnsi="맑은 고딕" w:eastAsia="맑은 고딕"/>
                 <w:b w:val="0"/>
-                <w:color w:val="000000"/>
-                <w:sz w:val="20"/>
+                <w:sz w:val="18"/>
               </w:rPr>
-              <w:t>3단계는 2차 개발 기간에 현장 적용성을 높이는 것입니다. 복지관, 치매안심센터, 가족 돌봄자, 고령자 학습 모임 등 실제 적용 후보를 정하고, 60~80대 사용자가 5분 안팎의 세션을 완료할 수 있는지 관찰합니다. 이때 측정 항목은 의료적 효과가 아니라 세션 완료율, 중도 포기 지점, 버튼 오작동, 문항 이해도, 기억 선택 부담, 보호자 안내 이해도, 삭제 기능 인지 여부로 설정합니다. 관찰 결과에 따라 문항 난이도, 보기 수, 글자 크기, 피드백 문구, 보상 빈도를 조정합니다.</w:t>
+            </w:r>
+            <w:r>
+              <w:rPr>
+                <w:rFonts w:ascii="맑은 고딕" w:hAnsi="맑은 고딕" w:eastAsia="맑은 고딕"/>
+                <w:b w:val="0"/>
+                <w:sz w:val="18"/>
+              </w:rPr>
             </w:r>
           </w:p>
+        </w:tc>
+        <w:tc>
+          <w:tcPr>
+            <w:tcW w:type="dxa" w:w="7937"/>
+            <w:vAlign w:val="center"/>
+            <w:tcMar>
+              <w:top w:w="90" w:type="dxa"/>
+              <w:start w:w="110" w:type="dxa"/>
+              <w:bottom w:w="90" w:type="dxa"/>
+              <w:end w:w="110" w:type="dxa"/>
+            </w:tcMar>
+          </w:tcPr>
           <w:p>
             <w:pPr>
-              <w:spacing w:after="100" w:line="283" w:lineRule="auto"/>
+              <w:spacing w:after="40" w:line="259" w:lineRule="auto"/>
               <w:jc w:val="left"/>
             </w:pPr>
             <w:r>
               <w:rPr>
-                <w:rFonts w:ascii="Calibri" w:hAnsi="Calibri" w:eastAsia="Malgun Gothic" w:cs="Calibri"/>
+                <w:rFonts w:ascii="맑은 고딕" w:hAnsi="맑은 고딕" w:eastAsia="맑은 고딕"/>
                 <w:b w:val="0"/>
-                <w:color w:val="000000"/>
-                <w:sz w:val="20"/>
+                <w:sz w:val="18"/>
               </w:rPr>
-              <w:t>4단계는 최종 발표와 시범 적용을 대비한 확장 계획입니다. 일본 현장 적용 가능성을 고려하여 현재 준비된 한국어·영어·일본어 다국어 구조를 일본어 문화 표현 콘텐츠와 연결하고, 오사카 현장 실증이 가능할 경우 현지 고령 사용자가 이해하기 쉬운 예문과 선택지를 별도로 구성합니다. 다만 일본어 현장 실증은 대회 선정과 현지 협의가 필요한 사항이므로, 본 신청서에서는 확정된 파트너십으로 표현하지 않고 적용 가능성과 준비 방향으로 제시합니다.</w:t>
+            </w:r>
+            <w:r>
+              <w:rPr>
+                <w:rFonts w:ascii="맑은 고딕" w:hAnsi="맑은 고딕" w:eastAsia="맑은 고딕"/>
+                <w:b w:val="0"/>
+                <w:sz w:val="18"/>
+              </w:rPr>
+              <w:t>1차 SW개발 단계(5.22.~7.5.)에는 고령자 친화 UX를 유지하면서 치매 관련 인지 루틴을 비진단 방식으로 통합합니다. 세 단어 기억 후 지연 회상, 쉬운 숫자 패턴, 단순 도형 따라 그리기, 짧은 문장 따라 말하기를 학습 흐름 안에 넣고, 개인 기억 단서가 여러 번 선택될 경우 하나의 기억 카드로 합쳐 저장되도록 데이터 구조를 정리합니다. 동시에 한국어 콘텐츠 30개 내외와 일본어 전환 후보 콘텐츠를 함께 정리합니다.</w:t>
             </w:r>
           </w:p>
+        </w:tc>
+      </w:tr>
+      <w:tr>
+        <w:trPr/>
+        <w:tc>
+          <w:tcPr>
+            <w:tcW w:type="dxa" w:w="1701"/>
+            <w:vAlign w:val="center"/>
+            <w:tcMar>
+              <w:top w:w="90" w:type="dxa"/>
+              <w:start w:w="110" w:type="dxa"/>
+              <w:bottom w:w="90" w:type="dxa"/>
+              <w:end w:w="110" w:type="dxa"/>
+            </w:tcMar>
+            <w:shd w:fill="EAF2F8"/>
+          </w:tcPr>
           <w:p>
             <w:pPr>
-              <w:spacing w:after="100" w:line="283" w:lineRule="auto"/>
+              <w:spacing w:after="40" w:line="259" w:lineRule="auto"/>
               <w:jc w:val="left"/>
             </w:pPr>
             <w:r>
               <w:rPr>
-                <w:rFonts w:ascii="Calibri" w:hAnsi="Calibri" w:eastAsia="Malgun Gothic" w:cs="Calibri"/>
+                <w:rFonts w:ascii="맑은 고딕" w:hAnsi="맑은 고딕" w:eastAsia="맑은 고딕"/>
                 <w:b w:val="0"/>
-                <w:color w:val="000000"/>
-                <w:sz w:val="20"/>
+                <w:sz w:val="18"/>
               </w:rPr>
-              <w:t>개인정보와 보안 계획은 단계적으로 보강합니다. 현재 기억 카드는 브라우저 로컬 저장소에 저장되고, 가족 공유 기본값은 비공개입니다. 대회 기간에는 개인정보 보호 원칙에 따라 수집 목적을 명확히 하고, 필요한 최소 정보만 저장하며, 사용자가 기억 카드를 삭제할 수 있는 흐름을 개선합니다. 향후 서버 저장이나 보호자 공유가 필요해질 경우에는 사전 동의, 전송 범위 표시, 공유 철회, 암호화 저장, 접근권한 관리, 로그 관리, 개인정보 처리방침을 별도 개발 범위로 두겠습니다.</w:t>
+            </w:r>
+            <w:r>
+              <w:rPr>
+                <w:rFonts w:ascii="맑은 고딕" w:hAnsi="맑은 고딕" w:eastAsia="맑은 고딕"/>
+                <w:b w:val="0"/>
+                <w:sz w:val="18"/>
+              </w:rPr>
+            </w:r>
+          </w:p>
+        </w:tc>
+        <w:tc>
+          <w:tcPr>
+            <w:tcW w:type="dxa" w:w="7937"/>
+            <w:vAlign w:val="center"/>
+            <w:tcMar>
+              <w:top w:w="90" w:type="dxa"/>
+              <w:start w:w="110" w:type="dxa"/>
+              <w:bottom w:w="90" w:type="dxa"/>
+              <w:end w:w="110" w:type="dxa"/>
+            </w:tcMar>
+          </w:tcPr>
+          <w:p>
+            <w:pPr>
+              <w:spacing w:after="40" w:line="259" w:lineRule="auto"/>
+              <w:jc w:val="left"/>
+            </w:pPr>
+            <w:r>
+              <w:rPr>
+                <w:rFonts w:ascii="맑은 고딕" w:hAnsi="맑은 고딕" w:eastAsia="맑은 고딕"/>
+                <w:b w:val="0"/>
+                <w:sz w:val="18"/>
+              </w:rPr>
+            </w:r>
+            <w:r>
+              <w:rPr>
+                <w:rFonts w:ascii="맑은 고딕" w:hAnsi="맑은 고딕" w:eastAsia="맑은 고딕"/>
+                <w:b w:val="0"/>
+                <w:sz w:val="18"/>
+              </w:rPr>
+              <w:t>오리엔테이션 및 멘토링 활용 단계(5.28. 이후)에는 두 가지 자문을 우선 요청합니다. 첫째, 팀 내부에 치매 전문의, 임상심리, 작업치료, 노인간호 등 치매 전문 자문자가 상시 포함되어 있지 않으므로, 치매 관련 의학·학술적 이해를 바탕으로 문항 부담, 비진단 표현, 보호자 안내 문구, 현장 적용 윤리성에 대한 전문가 멘토링이 필요합니다. 둘째, 현재는 설득력 있는 데모 수준이므로 실서비스 개발을 위해 백엔드 구조, 사용자별 맞춤 기억 데이터베이스, 복습 스케줄링 알고리즘, 가족 공유 권한, 삭제·동의 흐름에 대한 개발 멘토링이 필요합니다.</w:t>
+            </w:r>
+          </w:p>
+        </w:tc>
+      </w:tr>
+      <w:tr>
+        <w:trPr/>
+        <w:tc>
+          <w:tcPr>
+            <w:tcW w:type="dxa" w:w="1701"/>
+            <w:vAlign w:val="center"/>
+            <w:tcMar>
+              <w:top w:w="90" w:type="dxa"/>
+              <w:start w:w="110" w:type="dxa"/>
+              <w:bottom w:w="90" w:type="dxa"/>
+              <w:end w:w="110" w:type="dxa"/>
+            </w:tcMar>
+            <w:shd w:fill="EAF2F8"/>
+          </w:tcPr>
+          <w:p>
+            <w:pPr>
+              <w:spacing w:after="40" w:line="259" w:lineRule="auto"/>
+              <w:jc w:val="left"/>
+            </w:pPr>
+            <w:r>
+              <w:rPr>
+                <w:rFonts w:ascii="맑은 고딕" w:hAnsi="맑은 고딕" w:eastAsia="맑은 고딕"/>
+                <w:b w:val="0"/>
+                <w:sz w:val="18"/>
+              </w:rPr>
+            </w:r>
+            <w:r>
+              <w:rPr>
+                <w:rFonts w:ascii="맑은 고딕" w:hAnsi="맑은 고딕" w:eastAsia="맑은 고딕"/>
+                <w:b w:val="0"/>
+                <w:sz w:val="18"/>
+              </w:rPr>
+            </w:r>
+          </w:p>
+        </w:tc>
+        <w:tc>
+          <w:tcPr>
+            <w:tcW w:type="dxa" w:w="7937"/>
+            <w:vAlign w:val="center"/>
+            <w:tcMar>
+              <w:top w:w="90" w:type="dxa"/>
+              <w:start w:w="110" w:type="dxa"/>
+              <w:bottom w:w="90" w:type="dxa"/>
+              <w:end w:w="110" w:type="dxa"/>
+            </w:tcMar>
+          </w:tcPr>
+          <w:p>
+            <w:pPr>
+              <w:spacing w:after="40" w:line="259" w:lineRule="auto"/>
+              <w:jc w:val="left"/>
+            </w:pPr>
+            <w:r>
+              <w:rPr>
+                <w:rFonts w:ascii="맑은 고딕" w:hAnsi="맑은 고딕" w:eastAsia="맑은 고딕"/>
+                <w:b w:val="0"/>
+                <w:sz w:val="18"/>
+              </w:rPr>
+            </w:r>
+            <w:r>
+              <w:rPr>
+                <w:rFonts w:ascii="맑은 고딕" w:hAnsi="맑은 고딕" w:eastAsia="맑은 고딕"/>
+                <w:b w:val="0"/>
+                <w:sz w:val="18"/>
+              </w:rPr>
+              <w:t>중간심사 및 결선팀 선발 단계(7.7.~7.8.)에는 1차 개발 결과를 바탕으로 고령 사용자가 하루 5분 안팎으로 루틴을 완료하는 시나리오를 발표합니다. 검증 지표는 치매 개선 효과가 아니라 세션 완료율, 중도 이탈 지점, 버튼 이해도, 글자 크기와 대비, 기억 질문의 부담감, 보호자 안내 이해도, 삭제 기능 인지 여부로 설정합니다. 이때 신규 치매 관련 루틴 화면은 개발 완료 후 실제 스크린샷으로 교체합니다.</w:t>
+            </w:r>
+          </w:p>
+        </w:tc>
+      </w:tr>
+      <w:tr>
+        <w:tc>
+          <w:tcPr>
+            <w:tcW w:type="dxa" w:w="1701"/>
+            <w:vAlign w:val="center"/>
+          </w:tcPr>
+          <w:p>
+            <w:pPr>
+              <w:spacing w:after="40" w:line="259" w:lineRule="auto"/>
+              <w:jc w:val="left"/>
+            </w:pPr>
+            <w:r>
+              <w:rPr>
+                <w:rFonts w:ascii="맑은 고딕" w:hAnsi="맑은 고딕" w:eastAsia="맑은 고딕"/>
+                <w:b w:val="0"/>
+                <w:sz w:val="18"/>
+              </w:rPr>
+            </w:r>
+            <w:r>
+              <w:rPr>
+                <w:rFonts w:ascii="맑은 고딕" w:hAnsi="맑은 고딕" w:eastAsia="맑은 고딕"/>
+                <w:b w:val="0"/>
+                <w:sz w:val="18"/>
+              </w:rPr>
+            </w:r>
+          </w:p>
+        </w:tc>
+        <w:tc>
+          <w:tcPr>
+            <w:tcW w:type="dxa" w:w="7937"/>
+            <w:vAlign w:val="center"/>
+          </w:tcPr>
+          <w:p>
+            <w:pPr>
+              <w:spacing w:after="40" w:line="259" w:lineRule="auto"/>
+              <w:jc w:val="left"/>
+            </w:pPr>
+            <w:r>
+              <w:rPr>
+                <w:rFonts w:ascii="맑은 고딕" w:hAnsi="맑은 고딕" w:eastAsia="맑은 고딕"/>
+                <w:b w:val="0"/>
+                <w:sz w:val="18"/>
+              </w:rPr>
+            </w:r>
+            <w:r>
+              <w:rPr>
+                <w:rFonts w:ascii="맑은 고딕" w:hAnsi="맑은 고딕" w:eastAsia="맑은 고딕"/>
+                <w:b w:val="0"/>
+                <w:sz w:val="18"/>
+              </w:rPr>
+              <w:t>2차 SW개발 단계(7.8.~8.17.)에는 결선 피드백과 멘토링 결과를 반영하여 실서비스 구조를 강화합니다. 계정·동의·삭제 흐름, 개인별 기억 카드 DB, 복습 예정일 계산, 가족·보호자 요약 화면, 일본어 UI와 일본 현장용 콘텐츠 세트를 정리하고, 사용자가 공유하지 않은 개인 기억은 보호자 화면에 노출되지 않도록 기본값을 보수적으로 설계합니다.</w:t>
+            </w:r>
+          </w:p>
+        </w:tc>
+      </w:tr>
+      <w:tr>
+        <w:tc>
+          <w:tcPr>
+            <w:tcW w:type="dxa" w:w="1701"/>
+            <w:vAlign w:val="center"/>
+          </w:tcPr>
+          <w:p>
+            <w:pPr>
+              <w:spacing w:after="40" w:line="259" w:lineRule="auto"/>
+              <w:jc w:val="left"/>
+            </w:pPr>
+            <w:r>
+              <w:rPr>
+                <w:rFonts w:ascii="맑은 고딕" w:hAnsi="맑은 고딕" w:eastAsia="맑은 고딕"/>
+                <w:b w:val="0"/>
+                <w:sz w:val="18"/>
+              </w:rPr>
+            </w:r>
+            <w:r>
+              <w:rPr>
+                <w:rFonts w:ascii="맑은 고딕" w:hAnsi="맑은 고딕" w:eastAsia="맑은 고딕"/>
+                <w:b w:val="0"/>
+                <w:sz w:val="18"/>
+              </w:rPr>
+            </w:r>
+          </w:p>
+        </w:tc>
+        <w:tc>
+          <w:tcPr>
+            <w:tcW w:type="dxa" w:w="7937"/>
+            <w:vAlign w:val="center"/>
+          </w:tcPr>
+          <w:p>
+            <w:pPr>
+              <w:spacing w:after="40" w:line="259" w:lineRule="auto"/>
+              <w:jc w:val="left"/>
+            </w:pPr>
+            <w:r>
+              <w:rPr>
+                <w:rFonts w:ascii="맑은 고딕" w:hAnsi="맑은 고딕" w:eastAsia="맑은 고딕"/>
+                <w:b w:val="0"/>
+                <w:sz w:val="18"/>
+              </w:rPr>
+            </w:r>
+            <w:r>
+              <w:rPr>
+                <w:rFonts w:ascii="맑은 고딕" w:hAnsi="맑은 고딕" w:eastAsia="맑은 고딕"/>
+                <w:b w:val="0"/>
+                <w:sz w:val="18"/>
+              </w:rPr>
+              <w:t>최종 발표 및 이후 실증 준비 단계(8.19. 최종 발표, 9.1. 전국 왕중왕전, 8.28.~10.23. 우수 개발물 일본 현장 방문 및 시범적용)에는 Haru의 한국어·일본어 적용 시나리오, 국내 실증 전후 비교 방식, 일본 오사카부 사키시마 지역 등 현장 적용 가능성에 맞춘 운영안을 제시합니다. 단, 현재 확정되지 않은 기관 협약이나 사용자 수는 주장하지 않고, 선정 이후 현장 관계자·전문가 검토를 거쳐 파일럿 범위를 확정한다는 전제로 작성합니다.</w:t>
             </w:r>
           </w:p>
         </w:tc>
       </w:tr>
     </w:tbl>
-    <w:p/>
     <w:p>
+      <w:pPr>
+        <w:spacing w:after="40" w:line="250" w:lineRule="auto"/>
+      </w:pPr>
+    </w:p>
+    <w:p>
+      <w:pPr>
+        <w:spacing w:after="40" w:line="250" w:lineRule="auto"/>
+      </w:pPr>
       <w:r>
         <w:br w:type="page"/>
       </w:r>
@@ -733,29 +1703,36 @@
         <w:gridCol w:w="7937"/>
       </w:tblGrid>
       <w:tr>
+        <w:trPr/>
         <w:tc>
           <w:tcPr>
             <w:tcW w:type="dxa" w:w="1701"/>
-            <w:vAlign w:val="top"/>
+            <w:vAlign w:val="center"/>
             <w:tcMar>
               <w:top w:w="90" w:type="dxa"/>
-              <w:start w:w="140" w:type="dxa"/>
+              <w:start w:w="110" w:type="dxa"/>
               <w:bottom w:w="90" w:type="dxa"/>
-              <w:end w:w="140" w:type="dxa"/>
+              <w:end w:w="110" w:type="dxa"/>
             </w:tcMar>
-            <w:shd w:fill="F4F6F9"/>
+            <w:shd w:fill="EAF2F8"/>
           </w:tcPr>
           <w:p>
             <w:pPr>
-              <w:spacing w:after="100" w:line="283" w:lineRule="auto"/>
-              <w:jc w:val="center"/>
+              <w:spacing w:after="40" w:line="259" w:lineRule="auto"/>
+              <w:jc w:val="left"/>
             </w:pPr>
             <w:r>
               <w:rPr>
-                <w:rFonts w:ascii="Calibri" w:hAnsi="Calibri" w:eastAsia="Malgun Gothic" w:cs="Calibri"/>
+                <w:rFonts w:ascii="맑은 고딕" w:hAnsi="맑은 고딕" w:eastAsia="맑은 고딕"/>
                 <w:b/>
-                <w:color w:val="1F4D78"/>
-                <w:sz w:val="20"/>
+                <w:sz w:val="18"/>
+              </w:rPr>
+            </w:r>
+            <w:r>
+              <w:rPr>
+                <w:rFonts w:ascii="맑은 고딕" w:hAnsi="맑은 고딕" w:eastAsia="맑은 고딕"/>
+                <w:b/>
+                <w:sz w:val="18"/>
               </w:rPr>
               <w:t>개발주제 관련 팀 및 팀원 역량</w:t>
             </w:r>
@@ -764,168 +1741,443 @@
         <w:tc>
           <w:tcPr>
             <w:tcW w:type="dxa" w:w="7937"/>
-            <w:vAlign w:val="top"/>
+            <w:vAlign w:val="center"/>
             <w:tcMar>
               <w:top w:w="90" w:type="dxa"/>
-              <w:start w:w="140" w:type="dxa"/>
+              <w:start w:w="110" w:type="dxa"/>
               <w:bottom w:w="90" w:type="dxa"/>
-              <w:end w:w="140" w:type="dxa"/>
+              <w:end w:w="110" w:type="dxa"/>
             </w:tcMar>
           </w:tcPr>
           <w:p>
             <w:pPr>
-              <w:spacing w:after="100" w:line="283" w:lineRule="auto"/>
+              <w:spacing w:after="40" w:line="259" w:lineRule="auto"/>
               <w:jc w:val="left"/>
             </w:pPr>
             <w:r>
               <w:rPr>
-                <w:rFonts w:ascii="Calibri" w:hAnsi="Calibri" w:eastAsia="Malgun Gothic" w:cs="Calibri"/>
+                <w:rFonts w:ascii="맑은 고딕" w:hAnsi="맑은 고딕" w:eastAsia="맑은 고딕"/>
                 <w:b w:val="0"/>
-                <w:color w:val="7A5A00"/>
                 <w:sz w:val="18"/>
               </w:rPr>
-              <w:t>※ 본 항목은 제출 전 사용자 확인이 반드시 필요한 초안입니다. 팀장과 팀원 실명, 역할, 전공·경험, 수상·자격·수료증, NIPA 교육 확인증 여부가 아직 제공되지 않았으므로 사실을 추정하여 기재하지 않습니다. 아래 표시문은 제출 전 실제 정보로 교체해야 합니다.</w:t>
+            </w:r>
+            <w:r>
+              <w:rPr>
+                <w:rFonts w:ascii="맑은 고딕" w:hAnsi="맑은 고딕" w:eastAsia="맑은 고딕"/>
+                <w:b w:val="0"/>
+                <w:sz w:val="18"/>
+              </w:rPr>
+              <w:t>본 팀은 고령 사용자의 정서적 고립 완화와 일상적 디지털 참여를 목표로 하는 ICT 기반 취미·체험형 솔루션 「Haru」 개발에 필요한 기술 구현, AI 고도화, 고령자·돌봄 현장 이해, 사용자 경험 설계, 일본 현장 검증 및 사업화 역량을 균형 있게 갖추고 있습니다.</w:t>
             </w:r>
           </w:p>
+        </w:tc>
+      </w:tr>
+      <w:tr>
+        <w:trPr/>
+        <w:tc>
+          <w:tcPr>
+            <w:tcW w:type="dxa" w:w="1701"/>
+            <w:vAlign w:val="center"/>
+            <w:tcMar>
+              <w:top w:w="90" w:type="dxa"/>
+              <w:start w:w="110" w:type="dxa"/>
+              <w:bottom w:w="90" w:type="dxa"/>
+              <w:end w:w="110" w:type="dxa"/>
+            </w:tcMar>
+            <w:shd w:fill="EAF2F8"/>
+          </w:tcPr>
           <w:p>
             <w:pPr>
-              <w:spacing w:after="100" w:line="283" w:lineRule="auto"/>
+              <w:spacing w:after="40" w:line="259" w:lineRule="auto"/>
               <w:jc w:val="left"/>
             </w:pPr>
             <w:r>
               <w:rPr>
-                <w:rFonts w:ascii="Calibri" w:hAnsi="Calibri" w:eastAsia="Malgun Gothic" w:cs="Calibri"/>
+                <w:rFonts w:ascii="맑은 고딕" w:hAnsi="맑은 고딕" w:eastAsia="맑은 고딕"/>
                 <w:b w:val="0"/>
-                <w:color w:val="000000"/>
-                <w:sz w:val="20"/>
+                <w:sz w:val="18"/>
               </w:rPr>
-              <w:t>팀 구성은 최소 3인, 최대 5인 요건에 맞추어 확정합니다.</w:t>
+            </w:r>
+            <w:r>
+              <w:rPr>
+                <w:rFonts w:ascii="맑은 고딕" w:hAnsi="맑은 고딕" w:eastAsia="맑은 고딕"/>
+                <w:b w:val="0"/>
+                <w:sz w:val="18"/>
+              </w:rPr>
             </w:r>
           </w:p>
+        </w:tc>
+        <w:tc>
+          <w:tcPr>
+            <w:tcW w:type="dxa" w:w="7937"/>
+            <w:vAlign w:val="center"/>
+            <w:tcMar>
+              <w:top w:w="90" w:type="dxa"/>
+              <w:start w:w="110" w:type="dxa"/>
+              <w:bottom w:w="90" w:type="dxa"/>
+              <w:end w:w="110" w:type="dxa"/>
+            </w:tcMar>
+          </w:tcPr>
           <w:p>
             <w:pPr>
-              <w:pStyle w:val="ListBullet"/>
-              <w:spacing w:after="100" w:line="283" w:lineRule="auto"/>
-            </w:pPr>
-            <w:r>
-              <w:rPr>
-                <w:rFonts w:ascii="Calibri" w:hAnsi="Calibri" w:eastAsia="Malgun Gothic" w:cs="Calibri"/>
-                <w:b w:val="0"/>
-                <w:color w:val="000000"/>
-                <w:sz w:val="19"/>
-              </w:rPr>
-              <w:t>팀장: [이름 입력 필요] / 역할: 문제 정의, 개발 총괄, 일정 관리, 발표 총괄</w:t>
-            </w:r>
-          </w:p>
-          <w:p>
-            <w:pPr>
-              <w:pStyle w:val="ListBullet"/>
-              <w:spacing w:after="100" w:line="283" w:lineRule="auto"/>
-            </w:pPr>
-            <w:r>
-              <w:rPr>
-                <w:rFonts w:ascii="Calibri" w:hAnsi="Calibri" w:eastAsia="Malgun Gothic" w:cs="Calibri"/>
-                <w:b w:val="0"/>
-                <w:color w:val="000000"/>
-                <w:sz w:val="19"/>
-              </w:rPr>
-              <w:t>팀원 1: [이름 입력 필요] / 역할: 프론트엔드 구현, 학습 흐름, 데이터 저장 구조</w:t>
-            </w:r>
-          </w:p>
-          <w:p>
-            <w:pPr>
-              <w:pStyle w:val="ListBullet"/>
-              <w:spacing w:after="100" w:line="283" w:lineRule="auto"/>
-            </w:pPr>
-            <w:r>
-              <w:rPr>
-                <w:rFonts w:ascii="Calibri" w:hAnsi="Calibri" w:eastAsia="Malgun Gothic" w:cs="Calibri"/>
-                <w:b w:val="0"/>
-                <w:color w:val="000000"/>
-                <w:sz w:val="19"/>
-              </w:rPr>
-              <w:t>팀원 2: [이름 입력 필요] / 역할: 사용자 경험 설계, 고령자 접근성 점검, 화면 시안</w:t>
-            </w:r>
-          </w:p>
-          <w:p>
-            <w:pPr>
-              <w:pStyle w:val="ListBullet"/>
-              <w:spacing w:after="100" w:line="283" w:lineRule="auto"/>
-            </w:pPr>
-            <w:r>
-              <w:rPr>
-                <w:rFonts w:ascii="Calibri" w:hAnsi="Calibri" w:eastAsia="Malgun Gothic" w:cs="Calibri"/>
-                <w:b w:val="0"/>
-                <w:color w:val="000000"/>
-                <w:sz w:val="19"/>
-              </w:rPr>
-              <w:t>팀원 3: [선택 입력] / 역할: 노인돌봄·문헌 조사, 현장 테스트 기획, 자료 정리</w:t>
-            </w:r>
-          </w:p>
-          <w:p>
-            <w:pPr>
-              <w:pStyle w:val="ListBullet"/>
-              <w:spacing w:after="100" w:line="283" w:lineRule="auto"/>
-            </w:pPr>
-            <w:r>
-              <w:rPr>
-                <w:rFonts w:ascii="Calibri" w:hAnsi="Calibri" w:eastAsia="Malgun Gothic" w:cs="Calibri"/>
-                <w:b w:val="0"/>
-                <w:color w:val="000000"/>
-                <w:sz w:val="19"/>
-              </w:rPr>
-              <w:t>팀원 4: [선택 입력] / 역할: 다국어 콘텐츠, 일본 현장 적용 가능성 검토</w:t>
-            </w:r>
-          </w:p>
-          <w:p>
-            <w:pPr>
-              <w:spacing w:after="100" w:line="283" w:lineRule="auto"/>
+              <w:spacing w:after="40" w:line="259" w:lineRule="auto"/>
               <w:jc w:val="left"/>
             </w:pPr>
             <w:r>
               <w:rPr>
-                <w:rFonts w:ascii="Calibri" w:hAnsi="Calibri" w:eastAsia="Malgun Gothic" w:cs="Calibri"/>
+                <w:rFonts w:ascii="맑은 고딕" w:hAnsi="맑은 고딕" w:eastAsia="맑은 고딕"/>
                 <w:b w:val="0"/>
-                <w:color w:val="000000"/>
-                <w:sz w:val="20"/>
+                <w:sz w:val="18"/>
               </w:rPr>
-              <w:t>현재 구현물은 리액트 기반 웹앱, 타입스크립트, 라우팅, 다국어 리소스, 단위 테스트, 정적 분석, 빌드 검증까지 갖춘 상태입니다. 따라서 팀 역량 항목에서는 단순 아이디어가 아니라 실제 작동하는 프로토타입을 기반으로 개발을 이어갈 수 있다는 점을 강조할 수 있습니다. 다만 개별 팀원의 기술 역량, 노인돌봄 관련 경험, 교육 수료, 수상, 자격증, 학위, 논문, 기관 협력은 증빙이 있는 사실만 기재해야 합니다.</w:t>
+            </w:r>
+            <w:r>
+              <w:rPr>
+                <w:rFonts w:ascii="맑은 고딕" w:hAnsi="맑은 고딕" w:eastAsia="맑은 고딕"/>
+                <w:b w:val="0"/>
+                <w:sz w:val="18"/>
+              </w:rPr>
+              <w:t>이재우 팀원은 서울대학교 기계공학 학사 및 차의과학대학교 의학전문대학원 본과 4학년 경험을 바탕으로 고령자, 돌봄, 의료·요양 현장에 대한 이해를 보유하고 있습니다. 국방AI 경진대회 국방부장관상 수상 경험을 통해 공공 문제를 기술 기반으로 정의하고 해결하는 역량을 입증했습니다. 본 프로젝트에서는 치매 관련 표현이 의료적 진단·치료로 과장되지 않도록 안전한 서비스 범위를 정리하고, 복지기관·요양시설·치매안심센터 등 잠재 협력기관 대상 파일럿 기획, 사용자 및 보호자 요구사항 정리, B2G·B2B 확장 가능성 검토를 담당합니다.</w:t>
             </w:r>
           </w:p>
+        </w:tc>
+      </w:tr>
+      <w:tr>
+        <w:trPr/>
+        <w:tc>
+          <w:tcPr>
+            <w:tcW w:type="dxa" w:w="1701"/>
+            <w:vAlign w:val="center"/>
+            <w:tcMar>
+              <w:top w:w="90" w:type="dxa"/>
+              <w:start w:w="110" w:type="dxa"/>
+              <w:bottom w:w="90" w:type="dxa"/>
+              <w:end w:w="110" w:type="dxa"/>
+            </w:tcMar>
+            <w:shd w:fill="EAF2F8"/>
+          </w:tcPr>
           <w:p>
             <w:pPr>
-              <w:spacing w:after="100" w:line="283" w:lineRule="auto"/>
+              <w:spacing w:after="40" w:line="259" w:lineRule="auto"/>
               <w:jc w:val="left"/>
             </w:pPr>
             <w:r>
               <w:rPr>
-                <w:rFonts w:ascii="Calibri" w:hAnsi="Calibri" w:eastAsia="Malgun Gothic" w:cs="Calibri"/>
+                <w:rFonts w:ascii="맑은 고딕" w:hAnsi="맑은 고딕" w:eastAsia="맑은 고딕"/>
                 <w:b w:val="0"/>
-                <w:color w:val="000000"/>
-                <w:sz w:val="20"/>
+                <w:sz w:val="18"/>
               </w:rPr>
-              <w:t>협업 방식은 다음과 같이 운영합니다. 기획 담당은 공고 세부주제와 현장 문제를 정리하고, 개발 담당은 학습 흐름과 기억 카드 저장·복습·보상 기능을 구현합니다. 디자인 담당은 고령 사용자에게 맞는 글자 크기, 터치 영역, 색 대비, 안내 문구를 점검합니다. 리서치 담당은 고령화, 사회적 고립, 돌봄 부담, 회상 활동, 접근성 문헌을 정리하여 과장 없는 기대효과 문장을 관리합니다. 검증 담당은 테스트 명령, 브라우저 시나리오, 스크린샷, 개인정보 삭제 흐름을 확인합니다.</w:t>
+            </w:r>
+            <w:r>
+              <w:rPr>
+                <w:rFonts w:ascii="맑은 고딕" w:hAnsi="맑은 고딕" w:eastAsia="맑은 고딕"/>
+                <w:b w:val="0"/>
+                <w:sz w:val="18"/>
+              </w:rPr>
             </w:r>
           </w:p>
+        </w:tc>
+        <w:tc>
+          <w:tcPr>
+            <w:tcW w:type="dxa" w:w="7937"/>
+            <w:vAlign w:val="center"/>
+            <w:tcMar>
+              <w:top w:w="90" w:type="dxa"/>
+              <w:start w:w="110" w:type="dxa"/>
+              <w:bottom w:w="90" w:type="dxa"/>
+              <w:end w:w="110" w:type="dxa"/>
+            </w:tcMar>
+          </w:tcPr>
           <w:p>
             <w:pPr>
-              <w:spacing w:after="100" w:line="283" w:lineRule="auto"/>
+              <w:spacing w:after="40" w:line="259" w:lineRule="auto"/>
               <w:jc w:val="left"/>
             </w:pPr>
             <w:r>
               <w:rPr>
-                <w:rFonts w:ascii="Calibri" w:hAnsi="Calibri" w:eastAsia="Malgun Gothic" w:cs="Calibri"/>
+                <w:rFonts w:ascii="맑은 고딕" w:hAnsi="맑은 고딕" w:eastAsia="맑은 고딕"/>
                 <w:b w:val="0"/>
-                <w:color w:val="000000"/>
-                <w:sz w:val="20"/>
+                <w:sz w:val="18"/>
               </w:rPr>
-              <w:t>NIPA 가점 여부는 [해당자 이름과 교육명 입력 필요]입니다. 팀 내에 NIPA 운영 AI·BC 복합 교육 또는 디지털 신기술 교육 교육생·수료생이 있고 교육 수료증 또는 교육 확인증을 제출할 수 있을 때만 가점 사항으로 기재합니다. 해당 증빙이 없으면 지원서와 첨부자료에서 가점 관련 표현을 삭제합니다.</w:t>
+            </w:r>
+            <w:r>
+              <w:rPr>
+                <w:rFonts w:ascii="맑은 고딕" w:hAnsi="맑은 고딕" w:eastAsia="맑은 고딕"/>
+                <w:b w:val="0"/>
+                <w:sz w:val="18"/>
+              </w:rPr>
+              <w:t>김현준 팀원은 KAIST 전산학부 및 KIST AI 연구원 경험을 바탕으로 AI 모델링, 데이터 분석, 알고리즘 최적화 역량을 보유하고 있습니다. ACL, Nature 등 주요 학술지 및 학회 논문 17편, 누적 인용 471회 수준의 연구 실적을 바탕으로 기술적 난도가 높은 문제를 구조화하고 고도화할 수 있습니다. 본 프로젝트에서는 사용자의 학습 이력, 선택한 기억 주제, 감정 태그, 복습 상태를 바탕으로 개인화된 복습 문항을 구성하고, 세 단어 지연 회상, 숫자 패턴, 도형 따라 그리기 등 비진단 인지 루틴의 데이터 구조와 재방문 유도 알고리즘을 설계합니다.</w:t>
+            </w:r>
+          </w:p>
+        </w:tc>
+      </w:tr>
+      <w:tr>
+        <w:trPr/>
+        <w:tc>
+          <w:tcPr>
+            <w:tcW w:type="dxa" w:w="1701"/>
+            <w:vAlign w:val="center"/>
+            <w:tcMar>
+              <w:top w:w="90" w:type="dxa"/>
+              <w:start w:w="110" w:type="dxa"/>
+              <w:bottom w:w="90" w:type="dxa"/>
+              <w:end w:w="110" w:type="dxa"/>
+            </w:tcMar>
+            <w:shd w:fill="EAF2F8"/>
+          </w:tcPr>
+          <w:p>
+            <w:pPr>
+              <w:spacing w:after="40" w:line="259" w:lineRule="auto"/>
+              <w:jc w:val="left"/>
+            </w:pPr>
+            <w:r>
+              <w:rPr>
+                <w:rFonts w:ascii="맑은 고딕" w:hAnsi="맑은 고딕" w:eastAsia="맑은 고딕"/>
+                <w:b w:val="0"/>
+                <w:sz w:val="18"/>
+              </w:rPr>
+            </w:r>
+            <w:r>
+              <w:rPr>
+                <w:rFonts w:ascii="맑은 고딕" w:hAnsi="맑은 고딕" w:eastAsia="맑은 고딕"/>
+                <w:b w:val="0"/>
+                <w:sz w:val="18"/>
+              </w:rPr>
+            </w:r>
+          </w:p>
+        </w:tc>
+        <w:tc>
+          <w:tcPr>
+            <w:tcW w:type="dxa" w:w="7937"/>
+            <w:vAlign w:val="center"/>
+            <w:tcMar>
+              <w:top w:w="90" w:type="dxa"/>
+              <w:start w:w="110" w:type="dxa"/>
+              <w:bottom w:w="90" w:type="dxa"/>
+              <w:end w:w="110" w:type="dxa"/>
+            </w:tcMar>
+          </w:tcPr>
+          <w:p>
+            <w:pPr>
+              <w:spacing w:after="40" w:line="259" w:lineRule="auto"/>
+              <w:jc w:val="left"/>
+            </w:pPr>
+            <w:r>
+              <w:rPr>
+                <w:rFonts w:ascii="맑은 고딕" w:hAnsi="맑은 고딕" w:eastAsia="맑은 고딕"/>
+                <w:b w:val="0"/>
+                <w:sz w:val="18"/>
+              </w:rPr>
+            </w:r>
+            <w:r>
+              <w:rPr>
+                <w:rFonts w:ascii="맑은 고딕" w:hAnsi="맑은 고딕" w:eastAsia="맑은 고딕"/>
+                <w:b w:val="0"/>
+                <w:sz w:val="18"/>
+              </w:rPr>
+              <w:t>류다훈 팀원은 연세대학교 화학 학사 및 서울대학교 석사과정 경험을 통해 과학기술 기반 문제를 근거 중심으로 분석하고, 복잡한 기술 내용을 사용자와 기관 관점의 서비스 언어로 재구성하는 역량을 갖추고 있습니다. 방위사업청장상 및 과학기술정보통신부장관상 수상 경험을 통해 공공성과 기술성이 결합된 프로젝트의 기획·운영 역량을 입증했습니다. 본 프로젝트에서는 운영 전략, 사업화 기획, 마케팅, 기관 파트너십 구축을 담당하며, 복지관, 고령자 학습 모임, 재가돌봄기관, 가족 돌봄자 커뮤니티에서 활용 가능한 활동 패키지와 보호자 안내 콘텐츠를 설계합니다.</w:t>
+            </w:r>
+          </w:p>
+        </w:tc>
+      </w:tr>
+      <w:tr>
+        <w:trPr/>
+        <w:tc>
+          <w:tcPr>
+            <w:tcW w:type="dxa" w:w="1701"/>
+            <w:vAlign w:val="center"/>
+            <w:tcMar>
+              <w:top w:w="90" w:type="dxa"/>
+              <w:start w:w="110" w:type="dxa"/>
+              <w:bottom w:w="90" w:type="dxa"/>
+              <w:end w:w="110" w:type="dxa"/>
+            </w:tcMar>
+            <w:shd w:fill="EAF2F8"/>
+          </w:tcPr>
+          <w:p>
+            <w:pPr>
+              <w:spacing w:after="40" w:line="259" w:lineRule="auto"/>
+              <w:jc w:val="left"/>
+            </w:pPr>
+            <w:r>
+              <w:rPr>
+                <w:rFonts w:ascii="맑은 고딕" w:hAnsi="맑은 고딕" w:eastAsia="맑은 고딕"/>
+                <w:b w:val="0"/>
+                <w:sz w:val="18"/>
+              </w:rPr>
+            </w:r>
+            <w:r>
+              <w:rPr>
+                <w:rFonts w:ascii="맑은 고딕" w:hAnsi="맑은 고딕" w:eastAsia="맑은 고딕"/>
+                <w:b w:val="0"/>
+                <w:sz w:val="18"/>
+              </w:rPr>
+            </w:r>
+          </w:p>
+        </w:tc>
+        <w:tc>
+          <w:tcPr>
+            <w:tcW w:type="dxa" w:w="7937"/>
+            <w:vAlign w:val="center"/>
+            <w:tcMar>
+              <w:top w:w="90" w:type="dxa"/>
+              <w:start w:w="110" w:type="dxa"/>
+              <w:bottom w:w="90" w:type="dxa"/>
+              <w:end w:w="110" w:type="dxa"/>
+            </w:tcMar>
+          </w:tcPr>
+          <w:p>
+            <w:pPr>
+              <w:spacing w:after="40" w:line="259" w:lineRule="auto"/>
+              <w:jc w:val="left"/>
+            </w:pPr>
+            <w:r>
+              <w:rPr>
+                <w:rFonts w:ascii="맑은 고딕" w:hAnsi="맑은 고딕" w:eastAsia="맑은 고딕"/>
+                <w:b w:val="0"/>
+                <w:sz w:val="18"/>
+              </w:rPr>
+            </w:r>
+            <w:r>
+              <w:rPr>
+                <w:rFonts w:ascii="맑은 고딕" w:hAnsi="맑은 고딕" w:eastAsia="맑은 고딕"/>
+                <w:b w:val="0"/>
+                <w:sz w:val="18"/>
+              </w:rPr>
+              <w:t>나현우 팀원은 북해도대학교 기계공학 석사 및 동 대학원 박사과정 경험과 일본 유학 경험을 바탕으로 유창한 일본어 역량과 일본 현장·사용자에 대한 이해를 갖추고 있습니다. 북해도대학교 기술창업형 프로덕트 개발 프로그램에 3회 참여하며 생체 데이터 기반 감정 가시화, 근력운동 밸런스 보조 웨어러블, 말더듬 감지·완화 프로덕트 등 사용자 친화형 기술 제품을 수행했습니다. 본 프로젝트에서는 사용자 경험 고도화, 일본어 콘텐츠 검수, 일본 고령자 대상 현장 적용 가능성 검토, 현지 실증 시나리오 구성을 담당합니다.</w:t>
+            </w:r>
+          </w:p>
+        </w:tc>
+      </w:tr>
+      <w:tr>
+        <w:trPr/>
+        <w:tc>
+          <w:tcPr>
+            <w:tcW w:type="dxa" w:w="1701"/>
+            <w:vAlign w:val="center"/>
+            <w:tcMar>
+              <w:top w:w="90" w:type="dxa"/>
+              <w:start w:w="110" w:type="dxa"/>
+              <w:bottom w:w="90" w:type="dxa"/>
+              <w:end w:w="110" w:type="dxa"/>
+            </w:tcMar>
+            <w:shd w:fill="EAF2F8"/>
+          </w:tcPr>
+          <w:p>
+            <w:pPr>
+              <w:spacing w:after="40" w:line="259" w:lineRule="auto"/>
+              <w:jc w:val="left"/>
+            </w:pPr>
+            <w:r>
+              <w:rPr>
+                <w:rFonts w:ascii="맑은 고딕" w:hAnsi="맑은 고딕" w:eastAsia="맑은 고딕"/>
+                <w:b w:val="0"/>
+                <w:sz w:val="18"/>
+              </w:rPr>
+            </w:r>
+            <w:r>
+              <w:rPr>
+                <w:rFonts w:ascii="맑은 고딕" w:hAnsi="맑은 고딕" w:eastAsia="맑은 고딕"/>
+                <w:b w:val="0"/>
+                <w:sz w:val="18"/>
+              </w:rPr>
+            </w:r>
+          </w:p>
+        </w:tc>
+        <w:tc>
+          <w:tcPr>
+            <w:tcW w:type="dxa" w:w="7937"/>
+            <w:vAlign w:val="center"/>
+            <w:tcMar>
+              <w:top w:w="90" w:type="dxa"/>
+              <w:start w:w="110" w:type="dxa"/>
+              <w:bottom w:w="90" w:type="dxa"/>
+              <w:end w:w="110" w:type="dxa"/>
+            </w:tcMar>
+          </w:tcPr>
+          <w:p>
+            <w:pPr>
+              <w:spacing w:after="40" w:line="259" w:lineRule="auto"/>
+              <w:jc w:val="left"/>
+            </w:pPr>
+            <w:r>
+              <w:rPr>
+                <w:rFonts w:ascii="맑은 고딕" w:hAnsi="맑은 고딕" w:eastAsia="맑은 고딕"/>
+                <w:b w:val="0"/>
+                <w:sz w:val="18"/>
+              </w:rPr>
+            </w:r>
+            <w:r>
+              <w:rPr>
+                <w:rFonts w:ascii="맑은 고딕" w:hAnsi="맑은 고딕" w:eastAsia="맑은 고딕"/>
+                <w:b w:val="0"/>
+                <w:sz w:val="18"/>
+              </w:rPr>
+              <w:t>협업은 기획, 개발, 콘텐츠, 검증, 사업화가 순환되는 구조로 운영합니다. 초기 단계에서는 고령 사용자가 부담 없이 참여할 수 있는 사자성어·속담·문화 표현 기반 학습 콘텐츠와 개인 기억 회상 흐름을 정리하고, 개발 단계에서는 홈, 학습, 결과, 정원, 가족·보호자 안내, 설정 화면과 기억 카드 저장·삭제, 복습 문항, 보상 구조를 안정화합니다. 검증 단계에서는 세션 완료율, 중도 포기 지점, 문항 이해도, 버튼 조작 편의성, 기억 선택 부담, 보호자 안내 이해도, 개인정보 삭제 기능 인지 여부를 중심으로 사용성을 점검합니다. 이를 통해 본 팀은 아이디어 제안에 그치지 않고 실제 구현물 기반으로 사용성 검증, 콘텐츠 확장, 국내외 현장 적용, 사업화 전략까지 이어지는 전주기 실행 체계를 갖추고 있습니다.</w:t>
+            </w:r>
+          </w:p>
+        </w:tc>
+      </w:tr>
+      <w:tr>
+        <w:tc>
+          <w:tcPr>
+            <w:tcW w:type="dxa" w:w="1701"/>
+            <w:vAlign w:val="center"/>
+          </w:tcPr>
+          <w:p>
+            <w:pPr>
+              <w:spacing w:after="40" w:line="259" w:lineRule="auto"/>
+              <w:jc w:val="left"/>
+            </w:pPr>
+            <w:r>
+              <w:rPr>
+                <w:rFonts w:ascii="맑은 고딕" w:hAnsi="맑은 고딕" w:eastAsia="맑은 고딕"/>
+                <w:b w:val="0"/>
+                <w:sz w:val="18"/>
+              </w:rPr>
+            </w:r>
+            <w:r>
+              <w:rPr>
+                <w:rFonts w:ascii="맑은 고딕" w:hAnsi="맑은 고딕" w:eastAsia="맑은 고딕"/>
+                <w:b w:val="0"/>
+                <w:sz w:val="18"/>
+              </w:rPr>
+            </w:r>
+          </w:p>
+        </w:tc>
+        <w:tc>
+          <w:tcPr>
+            <w:tcW w:type="dxa" w:w="7937"/>
+            <w:vAlign w:val="center"/>
+          </w:tcPr>
+          <w:p>
+            <w:pPr>
+              <w:spacing w:after="40" w:line="259" w:lineRule="auto"/>
+              <w:jc w:val="left"/>
+            </w:pPr>
+            <w:r>
+              <w:rPr>
+                <w:rFonts w:ascii="맑은 고딕" w:hAnsi="맑은 고딕" w:eastAsia="맑은 고딕"/>
+                <w:b w:val="0"/>
+                <w:sz w:val="18"/>
+              </w:rPr>
+            </w:r>
+            <w:r>
+              <w:rPr>
+                <w:rFonts w:ascii="맑은 고딕" w:hAnsi="맑은 고딕" w:eastAsia="맑은 고딕"/>
+                <w:b w:val="0"/>
+                <w:sz w:val="18"/>
+              </w:rPr>
+              <w:t>다만 본 팀은 치매 전문 임상 자문과 실서비스 백엔드·개인화 알고리즘 멘토링이 반드시 필요하다는 점을 명확히 인식하고 있습니다. 팀의 의료·공학·AI·일본 현장 이해 역량을 바탕으로 프로토타입을 빠르게 구현하되, 피우다 프로젝트 멘토링을 통해 치매 관련 표현의 안전성, 비의료 서비스 경계, 개인 기억 데이터베이스 설계, 보호자 공유 권한, 일본 현장 적용성을 검증하며 완성도를 높이겠습니다.</w:t>
             </w:r>
           </w:p>
         </w:tc>
       </w:tr>
     </w:tbl>
-    <w:p/>
+    <w:p>
+      <w:pPr>
+        <w:spacing w:after="40" w:line="250" w:lineRule="auto"/>
+      </w:pPr>
+    </w:p>
     <w:tbl>
       <w:tblPr>
         <w:tblW w:type="auto" w:w="0"/>
@@ -946,29 +2198,36 @@
         <w:gridCol w:w="7937"/>
       </w:tblGrid>
       <w:tr>
+        <w:trPr/>
         <w:tc>
           <w:tcPr>
             <w:tcW w:type="dxa" w:w="1701"/>
-            <w:vAlign w:val="top"/>
+            <w:vAlign w:val="center"/>
             <w:tcMar>
               <w:top w:w="90" w:type="dxa"/>
-              <w:start w:w="140" w:type="dxa"/>
+              <w:start w:w="110" w:type="dxa"/>
               <w:bottom w:w="90" w:type="dxa"/>
-              <w:end w:w="140" w:type="dxa"/>
+              <w:end w:w="110" w:type="dxa"/>
             </w:tcMar>
-            <w:shd w:fill="F4F6F9"/>
+            <w:shd w:fill="EAF2F8"/>
           </w:tcPr>
           <w:p>
             <w:pPr>
-              <w:spacing w:after="100" w:line="283" w:lineRule="auto"/>
-              <w:jc w:val="center"/>
+              <w:spacing w:after="40" w:line="259" w:lineRule="auto"/>
+              <w:jc w:val="left"/>
             </w:pPr>
             <w:r>
               <w:rPr>
-                <w:rFonts w:ascii="Calibri" w:hAnsi="Calibri" w:eastAsia="Malgun Gothic" w:cs="Calibri"/>
+                <w:rFonts w:ascii="맑은 고딕" w:hAnsi="맑은 고딕" w:eastAsia="맑은 고딕"/>
                 <w:b/>
-                <w:color w:val="1F4D78"/>
-                <w:sz w:val="20"/>
+                <w:sz w:val="18"/>
+              </w:rPr>
+            </w:r>
+            <w:r>
+              <w:rPr>
+                <w:rFonts w:ascii="맑은 고딕" w:hAnsi="맑은 고딕" w:eastAsia="맑은 고딕"/>
+                <w:b/>
+                <w:sz w:val="18"/>
               </w:rPr>
               <w:t>기대효과</w:t>
             </w:r>
@@ -977,270 +2236,1137 @@
         <w:tc>
           <w:tcPr>
             <w:tcW w:type="dxa" w:w="7937"/>
-            <w:vAlign w:val="top"/>
+            <w:vAlign w:val="center"/>
             <w:tcMar>
               <w:top w:w="90" w:type="dxa"/>
-              <w:start w:w="140" w:type="dxa"/>
+              <w:start w:w="110" w:type="dxa"/>
               <w:bottom w:w="90" w:type="dxa"/>
-              <w:end w:w="140" w:type="dxa"/>
+              <w:end w:w="110" w:type="dxa"/>
             </w:tcMar>
           </w:tcPr>
           <w:p>
             <w:pPr>
-              <w:spacing w:after="100" w:line="283" w:lineRule="auto"/>
+              <w:spacing w:after="40" w:line="259" w:lineRule="auto"/>
               <w:jc w:val="left"/>
             </w:pPr>
             <w:r>
               <w:rPr>
-                <w:rFonts w:ascii="Calibri" w:hAnsi="Calibri" w:eastAsia="Malgun Gothic" w:cs="Calibri"/>
+                <w:rFonts w:ascii="맑은 고딕" w:hAnsi="맑은 고딕" w:eastAsia="맑은 고딕"/>
                 <w:b w:val="0"/>
-                <w:color w:val="000000"/>
-                <w:sz w:val="20"/>
+                <w:sz w:val="18"/>
               </w:rPr>
-              <w:t>새록정원의 1차 기대효과는 고령 사용자에게 부담이 낮은 디지털 참여 루틴을 제공하는 것입니다. 사용자는 짧은 문항을 선택하고, 익숙한 문화 표현을 배우며, 자신의 기억 주제와 감정을 고릅니다. 이는 긴 글쓰기나 복잡한 앱 조작 없이도 “오늘의 활동을 끝냈다”는 성취감을 줄 수 있습니다. 학습 완료 후 연속 학습일과 물방울 보상이 표시되고, 정원 화면에서 보상 상태가 보이므로 반복 참여 동기를 만들 수 있습니다.</w:t>
+            </w:r>
+            <w:r>
+              <w:rPr>
+                <w:rFonts w:ascii="맑은 고딕" w:hAnsi="맑은 고딕" w:eastAsia="맑은 고딕"/>
+                <w:b w:val="0"/>
+                <w:sz w:val="18"/>
+              </w:rPr>
+              <w:t>Haru의 1차 기대효과는 고령 사용자에게 부담이 낮은 디지털 참여 루틴을 제공하는 것입니다. 사용자는 하루 한 번 짧은 문항을 선택하고, 익숙한 문화 표현을 배우며, 자신의 기억 주제와 감정을 고릅니다. 여기에 세 단어 지연 회상, 쉬운 숫자 패턴, 단순 도형 따라 그리기, 문장 따라 말하기를 더하면 사용자는 검사받는 느낌보다 가벼운 학습·회상 활동으로 인지 영역을 반복적으로 접할 수 있습니다.</w:t>
             </w:r>
           </w:p>
+        </w:tc>
+      </w:tr>
+      <w:tr>
+        <w:trPr/>
+        <w:tc>
+          <w:tcPr>
+            <w:tcW w:type="dxa" w:w="1701"/>
+            <w:vAlign w:val="center"/>
+            <w:tcMar>
+              <w:top w:w="90" w:type="dxa"/>
+              <w:start w:w="110" w:type="dxa"/>
+              <w:bottom w:w="90" w:type="dxa"/>
+              <w:end w:w="110" w:type="dxa"/>
+            </w:tcMar>
+            <w:shd w:fill="EAF2F8"/>
+          </w:tcPr>
           <w:p>
             <w:pPr>
-              <w:spacing w:after="100" w:line="283" w:lineRule="auto"/>
+              <w:spacing w:after="40" w:line="259" w:lineRule="auto"/>
               <w:jc w:val="left"/>
             </w:pPr>
             <w:r>
               <w:rPr>
-                <w:rFonts w:ascii="Calibri" w:hAnsi="Calibri" w:eastAsia="Malgun Gothic" w:cs="Calibri"/>
+                <w:rFonts w:ascii="맑은 고딕" w:hAnsi="맑은 고딕" w:eastAsia="맑은 고딕"/>
                 <w:b w:val="0"/>
-                <w:color w:val="000000"/>
-                <w:sz w:val="20"/>
+                <w:sz w:val="18"/>
               </w:rPr>
-              <w:t>2차 기대효과는 가족과 보호자가 고령자의 기억 활동을 존중하는 방식으로 관심을 이어갈 수 있는 기반을 마련하는 것입니다. 현재 기능은 실제 가족 계정 연동이나 공유 전송이 아니라 보호자 초대 안내와 공유 전 확인 안내 화면입니다. 향후 사용자의 명시적 동의와 선택 범위 설정을 전제로, 가족은 고령자가 직접 고른 기억 카드나 학습 참여 상태를 확인하고 대화 소재로 활용할 수 있습니다. 이는 돌봄을 감시나 통제 중심으로만 구성하지 않고, 정서적 연결과 대화의 계기로 확장하는 방향입니다.</w:t>
+            </w:r>
+            <w:r>
+              <w:rPr>
+                <w:rFonts w:ascii="맑은 고딕" w:hAnsi="맑은 고딕" w:eastAsia="맑은 고딕"/>
+                <w:b w:val="0"/>
+                <w:sz w:val="18"/>
+              </w:rPr>
             </w:r>
           </w:p>
+        </w:tc>
+        <w:tc>
+          <w:tcPr>
+            <w:tcW w:type="dxa" w:w="7937"/>
+            <w:vAlign w:val="center"/>
+            <w:tcMar>
+              <w:top w:w="90" w:type="dxa"/>
+              <w:start w:w="110" w:type="dxa"/>
+              <w:bottom w:w="90" w:type="dxa"/>
+              <w:end w:w="110" w:type="dxa"/>
+            </w:tcMar>
+          </w:tcPr>
           <w:p>
             <w:pPr>
-              <w:spacing w:after="100" w:line="283" w:lineRule="auto"/>
+              <w:spacing w:after="40" w:line="259" w:lineRule="auto"/>
               <w:jc w:val="left"/>
             </w:pPr>
             <w:r>
               <w:rPr>
-                <w:rFonts w:ascii="Calibri" w:hAnsi="Calibri" w:eastAsia="Malgun Gothic" w:cs="Calibri"/>
+                <w:rFonts w:ascii="맑은 고딕" w:hAnsi="맑은 고딕" w:eastAsia="맑은 고딕"/>
                 <w:b w:val="0"/>
-                <w:color w:val="000000"/>
-                <w:sz w:val="20"/>
+                <w:sz w:val="18"/>
               </w:rPr>
-              <w:t>3차 기대효과는 복지관, 치매안심센터, 재가 돌봄기관, 가족 돌봄자 모임에서 사용할 수 있는 가벼운 활동 도구가 될 가능성입니다. 기관 입장에서는 전문 장비 없이 웹 화면으로 짧은 활동을 진행할 수 있고, 진행자는 사자성어와 생활 기억을 연결한 대화형 활동으로 확장할 수 있습니다. 다만 기관 적용성과 만족도, 정서 변화, 사회적 고립 완화 정도는 실제 파일럿을 통해 검증해야 하며, 본 개발 단계에서는 세션 완료율, 사용 편의성, 이해도, 재사용 의향을 우선 지표로 삼겠습니다.</w:t>
+            </w:r>
+            <w:r>
+              <w:rPr>
+                <w:rFonts w:ascii="맑은 고딕" w:hAnsi="맑은 고딕" w:eastAsia="맑은 고딕"/>
+                <w:b w:val="0"/>
+                <w:sz w:val="18"/>
+              </w:rPr>
+              <w:t>2차 기대효과는 가족·보호자와의 대화 단서 형성입니다. 세계보건기구와 Lancet Commission은 치매와 인지 저하 맥락에서 사회적 고립, 인지 비활동, 돌봄 부담의 중요성을 제시하고 있습니다[참고 2][참고 7]. Haru는 사용자가 선택한 기억 단서와 완료한 활동을 보호자가 이해하기 쉬운 비의료 요약으로 보여주어, 위험 점수 확인보다 “오늘 어떤 기억을 떠올렸는지” 대화하게 만드는 데 초점을 둡니다.</w:t>
             </w:r>
           </w:p>
+        </w:tc>
+      </w:tr>
+      <w:tr>
+        <w:trPr/>
+        <w:tc>
+          <w:tcPr>
+            <w:tcW w:type="dxa" w:w="1701"/>
+            <w:vAlign w:val="center"/>
+            <w:tcMar>
+              <w:top w:w="90" w:type="dxa"/>
+              <w:start w:w="110" w:type="dxa"/>
+              <w:bottom w:w="90" w:type="dxa"/>
+              <w:end w:w="110" w:type="dxa"/>
+            </w:tcMar>
+            <w:shd w:fill="EAF2F8"/>
+          </w:tcPr>
           <w:p>
             <w:pPr>
-              <w:spacing w:after="100" w:line="283" w:lineRule="auto"/>
+              <w:spacing w:after="40" w:line="259" w:lineRule="auto"/>
               <w:jc w:val="left"/>
             </w:pPr>
             <w:r>
               <w:rPr>
-                <w:rFonts w:ascii="Calibri" w:hAnsi="Calibri" w:eastAsia="Malgun Gothic" w:cs="Calibri"/>
+                <w:rFonts w:ascii="맑은 고딕" w:hAnsi="맑은 고딕" w:eastAsia="맑은 고딕"/>
                 <w:b w:val="0"/>
-                <w:color w:val="000000"/>
-                <w:sz w:val="20"/>
+                <w:sz w:val="18"/>
               </w:rPr>
-              <w:t>4차 기대효과는 사업화와 확장 가능성입니다. 초기에는 개인 사용자와 가족을 대상으로 한 무료 또는 저비용 웹 서비스로 검증하고, 이후에는 복지기관용 활동 패키지, 지역문화 콘텐츠 묶음, 다국어 문화 표현 콘텐츠, 보호자 동의 기반 공유 기능으로 확장할 수 있습니다. 대회가 제공하는 멘토링, 개발공간, 장비, 일본 현장 방문 및 시범적용 기회는 새록정원이 실제 현장 피드백을 받아 개선되는 데 직접 도움이 됩니다.</w:t>
+            </w:r>
+            <w:r>
+              <w:rPr>
+                <w:rFonts w:ascii="맑은 고딕" w:hAnsi="맑은 고딕" w:eastAsia="맑은 고딕"/>
+                <w:b w:val="0"/>
+                <w:sz w:val="18"/>
+              </w:rPr>
             </w:r>
           </w:p>
+        </w:tc>
+        <w:tc>
+          <w:tcPr>
+            <w:tcW w:type="dxa" w:w="7937"/>
+            <w:vAlign w:val="center"/>
+            <w:tcMar>
+              <w:top w:w="90" w:type="dxa"/>
+              <w:start w:w="110" w:type="dxa"/>
+              <w:bottom w:w="90" w:type="dxa"/>
+              <w:end w:w="110" w:type="dxa"/>
+            </w:tcMar>
+          </w:tcPr>
           <w:p>
             <w:pPr>
-              <w:spacing w:after="100" w:line="283" w:lineRule="auto"/>
+              <w:spacing w:after="40" w:line="259" w:lineRule="auto"/>
               <w:jc w:val="left"/>
             </w:pPr>
             <w:r>
               <w:rPr>
-                <w:rFonts w:ascii="Calibri" w:hAnsi="Calibri" w:eastAsia="Malgun Gothic" w:cs="Calibri"/>
+                <w:rFonts w:ascii="맑은 고딕" w:hAnsi="맑은 고딕" w:eastAsia="맑은 고딕"/>
                 <w:b w:val="0"/>
-                <w:color w:val="000000"/>
-                <w:sz w:val="20"/>
+                <w:sz w:val="18"/>
               </w:rPr>
-              <w:t>본 개발물은 의료기기나 디지털 치료제로 주장하지 않습니다. 치매를 진단·치료·예방하거나 인지 기능 개선을 보장한다고 표현하지 않습니다. 기대효과는 고령자의 취미·체험형 디지털 활동 참여, 정서 회상 기회, 가족 대화 소재, 기관 활동 도구 가능성으로 제한하여 검증하겠습니다. 이러한 신중한 접근은 사실과 다른 기재를 금지하는 공고 유의사항을 지키면서도, 노인돌봄 분야에서 실제로 확장 가능한 서비스를 만드는 데 필요합니다.</w:t>
+            </w:r>
+            <w:r>
+              <w:rPr>
+                <w:rFonts w:ascii="맑은 고딕" w:hAnsi="맑은 고딕" w:eastAsia="맑은 고딕"/>
+                <w:b w:val="0"/>
+                <w:sz w:val="18"/>
+              </w:rPr>
+              <w:t>3차 기대효과는 복지·돌봄 기관에서 활용 가능한 저부담 활동 콘텐츠를 제공하는 것입니다. Cochrane 리뷰에서 인지 자극과 회상 활동은 경도·중등도 치매 대상자에게 작은 이점과 사회적 상호작용 가능성을 보였지만, 디지털·개별 전달 방식에 대한 추가 연구가 필요하다고 제시됩니다[참고 5][참고 6]. Haru는 이를 치료 효과로 주장하지 않고, 기관 프로그램에서 반복 사용 가능한 문화·기억 기반 활동 도구로 검증합니다.</w:t>
             </w:r>
           </w:p>
+        </w:tc>
+      </w:tr>
+      <w:tr>
+        <w:trPr/>
+        <w:tc>
+          <w:tcPr>
+            <w:tcW w:type="dxa" w:w="1701"/>
+            <w:vAlign w:val="center"/>
+            <w:tcMar>
+              <w:top w:w="90" w:type="dxa"/>
+              <w:start w:w="110" w:type="dxa"/>
+              <w:bottom w:w="90" w:type="dxa"/>
+              <w:end w:w="110" w:type="dxa"/>
+            </w:tcMar>
+            <w:shd w:fill="EAF2F8"/>
+          </w:tcPr>
           <w:p>
             <w:pPr>
-              <w:spacing w:after="100" w:line="283" w:lineRule="auto"/>
+              <w:spacing w:after="40" w:line="259" w:lineRule="auto"/>
               <w:jc w:val="left"/>
             </w:pPr>
             <w:r>
               <w:rPr>
-                <w:rFonts w:ascii="Calibri" w:hAnsi="Calibri" w:eastAsia="Malgun Gothic" w:cs="Calibri"/>
+                <w:rFonts w:ascii="맑은 고딕" w:hAnsi="맑은 고딕" w:eastAsia="맑은 고딕"/>
                 <w:b w:val="0"/>
-                <w:color w:val="000000"/>
-                <w:sz w:val="20"/>
+                <w:sz w:val="18"/>
               </w:rPr>
-              <w:t>주요 근거자료는 다음과 같습니다. 통계청 「2025 고령자 통계」는 국내 고령인구 비중과 향후 전망의 근거입니다. 세계보건기구 치매 설명자료는 치매와 돌봄 부담이 국제적 공중보건 과제임을 뒷받침합니다. 세계보건기구 사회적 고립과 외로움 자료는 고령자의 사회적 연결 필요성을 설명합니다. 경제협력개발기구 「한눈에 보는 보건 2023」의 비공식 돌봄 자료는 가족·지인 돌봄 부담의 배경 근거입니다. 코크란의 인지 자극 및 회상 활동 검토 자료는 효과를 단정하지 않고 신중하게 표현해야 한다는 근거로 사용했습니다. 세계 웹 표준 관련 고령 사용자 접근성 자료는 큰 글자, 명확한 조작, 음성·자막·대체 텍스트 등 접근성 개선 방향의 근거입니다. 개인정보 보호법 제3조는 목적 명확화와 최소 수집 원칙을 데이터 처리 계획의 기준으로 삼았습니다.</w:t>
+            </w:r>
+            <w:r>
+              <w:rPr>
+                <w:rFonts w:ascii="맑은 고딕" w:hAnsi="맑은 고딕" w:eastAsia="맑은 고딕"/>
+                <w:b w:val="0"/>
+                <w:sz w:val="18"/>
+              </w:rPr>
             </w:r>
           </w:p>
+        </w:tc>
+        <w:tc>
+          <w:tcPr>
+            <w:tcW w:type="dxa" w:w="7937"/>
+            <w:vAlign w:val="center"/>
+            <w:tcMar>
+              <w:top w:w="90" w:type="dxa"/>
+              <w:start w:w="110" w:type="dxa"/>
+              <w:bottom w:w="90" w:type="dxa"/>
+              <w:end w:w="110" w:type="dxa"/>
+            </w:tcMar>
+          </w:tcPr>
           <w:p>
             <w:pPr>
-              <w:spacing w:after="100" w:line="283" w:lineRule="auto"/>
+              <w:spacing w:after="40" w:line="259" w:lineRule="auto"/>
               <w:jc w:val="left"/>
             </w:pPr>
             <w:r>
               <w:rPr>
-                <w:rFonts w:ascii="Calibri" w:hAnsi="Calibri" w:eastAsia="Malgun Gothic" w:cs="Calibri"/>
+                <w:rFonts w:ascii="맑은 고딕" w:hAnsi="맑은 고딕" w:eastAsia="맑은 고딕"/>
                 <w:b w:val="0"/>
-                <w:color w:val="000000"/>
-                <w:sz w:val="20"/>
+                <w:sz w:val="18"/>
               </w:rPr>
-              <w:t>출처 목록은 아래와 같습니다. 접근일은 2026년 5월 15일입니다.</w:t>
+            </w:r>
+            <w:r>
+              <w:rPr>
+                <w:rFonts w:ascii="맑은 고딕" w:hAnsi="맑은 고딕" w:eastAsia="맑은 고딕"/>
+                <w:b w:val="0"/>
+                <w:sz w:val="18"/>
+              </w:rPr>
+              <w:t>4차 기대효과는 한일 확장성입니다. 일본은 고령화율 29.3%의 초고령사회이고[참고 9], 일본의 치매 정책은 당사자 목소리, 지역사회 참여, 새로운 기술 활용, 다양한 주체의 연계를 강조합니다[참고 10][참고 11]. Haru는 한국어 사자성어·속담 구조를 일본어 관용구, ことわざ, 계절·지역·가족 행사 기억 단서로 전환할 수 있으므로, 일본 복지·돌봄 현장에서도 비의료 디지털 인지·정서 루틴으로 실증 가능성을 가질 수 있습니다.</w:t>
             </w:r>
           </w:p>
+        </w:tc>
+      </w:tr>
+      <w:tr>
+        <w:tc>
+          <w:tcPr>
+            <w:tcW w:type="dxa" w:w="1701"/>
+            <w:vAlign w:val="center"/>
+          </w:tcPr>
           <w:p>
             <w:pPr>
-              <w:pStyle w:val="ListNumber"/>
-              <w:spacing w:after="100" w:line="283" w:lineRule="auto"/>
+              <w:spacing w:after="40" w:line="259" w:lineRule="auto"/>
+              <w:jc w:val="left"/>
             </w:pPr>
             <w:r>
               <w:rPr>
-                <w:rFonts w:ascii="Calibri" w:hAnsi="Calibri" w:eastAsia="Malgun Gothic" w:cs="Calibri"/>
+                <w:rFonts w:ascii="맑은 고딕" w:hAnsi="맑은 고딕" w:eastAsia="맑은 고딕"/>
                 <w:b w:val="0"/>
-                <w:color w:val="000000"/>
-                <w:sz w:val="19"/>
+                <w:sz w:val="18"/>
               </w:rPr>
-              <w:t>통계청, 「2025 고령자 통계」, https://kostat.go.kr/boardDownload.es?bid=10820&amp;list_no=438832&amp;seq=1</w:t>
+            </w:r>
+            <w:r>
+              <w:rPr>
+                <w:rFonts w:ascii="맑은 고딕" w:hAnsi="맑은 고딕" w:eastAsia="맑은 고딕"/>
+                <w:b w:val="0"/>
+                <w:sz w:val="18"/>
+              </w:rPr>
             </w:r>
           </w:p>
+        </w:tc>
+        <w:tc>
+          <w:tcPr>
+            <w:tcW w:type="dxa" w:w="7937"/>
+            <w:vAlign w:val="center"/>
+          </w:tcPr>
           <w:p>
             <w:pPr>
-              <w:pStyle w:val="ListNumber"/>
-              <w:spacing w:after="100" w:line="283" w:lineRule="auto"/>
+              <w:spacing w:after="40" w:line="259" w:lineRule="auto"/>
+              <w:jc w:val="left"/>
             </w:pPr>
             <w:r>
               <w:rPr>
-                <w:rFonts w:ascii="Calibri" w:hAnsi="Calibri" w:eastAsia="Malgun Gothic" w:cs="Calibri"/>
+                <w:rFonts w:ascii="맑은 고딕" w:hAnsi="맑은 고딕" w:eastAsia="맑은 고딕"/>
                 <w:b w:val="0"/>
-                <w:color w:val="000000"/>
-                <w:sz w:val="19"/>
+                <w:sz w:val="18"/>
               </w:rPr>
-              <w:t>세계보건기구, 치매 설명자료, https://www.who.int/news-room/fact-sheets/detail/dementia</w:t>
             </w:r>
-          </w:p>
-          <w:p>
-            <w:pPr>
-              <w:pStyle w:val="ListNumber"/>
-              <w:spacing w:after="100" w:line="283" w:lineRule="auto"/>
-            </w:pPr>
             <w:r>
               <w:rPr>
-                <w:rFonts w:ascii="Calibri" w:hAnsi="Calibri" w:eastAsia="Malgun Gothic" w:cs="Calibri"/>
+                <w:rFonts w:ascii="맑은 고딕" w:hAnsi="맑은 고딕" w:eastAsia="맑은 고딕"/>
                 <w:b w:val="0"/>
-                <w:color w:val="000000"/>
-                <w:sz w:val="19"/>
+                <w:sz w:val="18"/>
               </w:rPr>
-              <w:t>세계보건기구, 고령자의 사회적 고립과 외로움 감소, https://www.who.int/activities/reducing-social-isolation-and-loneliness-among-older-people</w:t>
-            </w:r>
-          </w:p>
-          <w:p>
-            <w:pPr>
-              <w:pStyle w:val="ListNumber"/>
-              <w:spacing w:after="100" w:line="283" w:lineRule="auto"/>
-            </w:pPr>
-            <w:r>
-              <w:rPr>
-                <w:rFonts w:ascii="Calibri" w:hAnsi="Calibri" w:eastAsia="Malgun Gothic" w:cs="Calibri"/>
-                <w:b w:val="0"/>
-                <w:color w:val="000000"/>
-                <w:sz w:val="19"/>
-              </w:rPr>
-              <w:t>경제협력개발기구, 「한눈에 보는 보건 2023」 비공식 돌봄, https://www.oecd.org/en/publications/health-at-a-glance-2023_7a7afb35-en/full-report/informal-carers_d9627891.html</w:t>
-            </w:r>
-          </w:p>
-          <w:p>
-            <w:pPr>
-              <w:pStyle w:val="ListNumber"/>
-              <w:spacing w:after="100" w:line="283" w:lineRule="auto"/>
-            </w:pPr>
-            <w:r>
-              <w:rPr>
-                <w:rFonts w:ascii="Calibri" w:hAnsi="Calibri" w:eastAsia="Malgun Gothic" w:cs="Calibri"/>
-                <w:b w:val="0"/>
-                <w:color w:val="000000"/>
-                <w:sz w:val="19"/>
-              </w:rPr>
-              <w:t>코크란, 치매 인지 자극 검토, https://www.cochrane.org/evidence/CD005562_can-cognitive-stimulation-benefit-people-dementia</w:t>
-            </w:r>
-          </w:p>
-          <w:p>
-            <w:pPr>
-              <w:pStyle w:val="ListNumber"/>
-              <w:spacing w:after="100" w:line="283" w:lineRule="auto"/>
-            </w:pPr>
-            <w:r>
-              <w:rPr>
-                <w:rFonts w:ascii="Calibri" w:hAnsi="Calibri" w:eastAsia="Malgun Gothic" w:cs="Calibri"/>
-                <w:b w:val="0"/>
-                <w:color w:val="000000"/>
-                <w:sz w:val="19"/>
-              </w:rPr>
-              <w:t>코크란, 치매 회상 활동 검토, https://www.cochrane.org/about-us/news/featured-review-reminiscence-therapy-dementia</w:t>
-            </w:r>
-          </w:p>
-          <w:p>
-            <w:pPr>
-              <w:pStyle w:val="ListNumber"/>
-              <w:spacing w:after="100" w:line="283" w:lineRule="auto"/>
-            </w:pPr>
-            <w:r>
-              <w:rPr>
-                <w:rFonts w:ascii="Calibri" w:hAnsi="Calibri" w:eastAsia="Malgun Gothic" w:cs="Calibri"/>
-                <w:b w:val="0"/>
-                <w:color w:val="000000"/>
-                <w:sz w:val="19"/>
-              </w:rPr>
-              <w:t>세계 웹 컨소시엄, 고령 사용자와 웹 접근성, https://www.w3.org/WAI/older-users/</w:t>
-            </w:r>
-          </w:p>
-          <w:p>
-            <w:pPr>
-              <w:pStyle w:val="ListNumber"/>
-              <w:spacing w:after="100" w:line="283" w:lineRule="auto"/>
-            </w:pPr>
-            <w:r>
-              <w:rPr>
-                <w:rFonts w:ascii="Calibri" w:hAnsi="Calibri" w:eastAsia="Malgun Gothic" w:cs="Calibri"/>
-                <w:b w:val="0"/>
-                <w:color w:val="000000"/>
-                <w:sz w:val="19"/>
-              </w:rPr>
-              <w:t>세계 웹 컨소시엄, 고령자를 위한 웹사이트 개발 지침, https://www.w3.org/WAI/older-users/developing/</w:t>
-            </w:r>
-          </w:p>
-          <w:p>
-            <w:pPr>
-              <w:pStyle w:val="ListNumber"/>
-              <w:spacing w:after="100" w:line="283" w:lineRule="auto"/>
-            </w:pPr>
-            <w:r>
-              <w:rPr>
-                <w:rFonts w:ascii="Calibri" w:hAnsi="Calibri" w:eastAsia="Malgun Gothic" w:cs="Calibri"/>
-                <w:b w:val="0"/>
-                <w:color w:val="000000"/>
-                <w:sz w:val="19"/>
-              </w:rPr>
-              <w:t>국가법령정보센터, 개인정보 보호법 제3조, https://www.law.go.kr/LSW/lsLawLinkInfo.do?chrClsCd=010202&amp;lsJoLnkSeq=900072509</w:t>
+              <w:t>5차 기대효과는 공모전 멘토링을 통한 서비스 완성도 향상입니다. 본 팀은 이미 데모를 통해 문제정의와 사용자 흐름을 제시했지만, 실제 운영을 위해서는 치매 전문가 자문, 백엔드 개발, 개인화 알고리즘, 데이터 보호, 일본 현장 적합성 검토가 필요합니다. 따라서 Haru는 “이미 완성된 서비스”가 아니라, 피우다 프로젝트의 개발·멘토링·실증 절차에 맞춰 개선될 수 있는 프로토타입이라는 점에서 공모전 지원 취지와 부합합니다.</w:t>
             </w:r>
           </w:p>
         </w:tc>
       </w:tr>
     </w:tbl>
-    <w:p/>
     <w:p>
-      <w:r>
-        <w:br w:type="page"/>
-      </w:r>
+      <w:pPr>
+        <w:spacing w:after="40" w:line="250" w:lineRule="auto"/>
+      </w:pPr>
     </w:p>
     <w:p>
       <w:pPr>
-        <w:pStyle w:val="Heading1"/>
+        <w:spacing w:after="40" w:before="0" w:line="250" w:lineRule="auto"/>
       </w:pPr>
       <w:r>
         <w:rPr>
-          <w:rFonts w:ascii="Calibri" w:hAnsi="Calibri" w:eastAsia="Malgun Gothic" w:cs="Calibri"/>
+          <w:rFonts w:ascii="Malgun Gothic" w:hAnsi="Malgun Gothic" w:eastAsia="Malgun Gothic"/>
+          <w:b/>
+          <w:color w:val="1F4E79"/>
+          <w:sz w:val="24"/>
+        </w:rPr>
+        <w:t>주요 참고자료</w:t>
+      </w:r>
+    </w:p>
+    <w:tbl>
+      <w:tblPr>
+        <w:tblStyle w:val="TableGrid"/>
+        <w:tblW w:type="auto" w:w="0"/>
+        <w:tblLook w:firstColumn="1" w:firstRow="1" w:lastColumn="0" w:lastRow="0" w:noHBand="0" w:noVBand="1" w:val="04A0"/>
+      </w:tblPr>
+      <w:tblGrid>
+        <w:gridCol w:w="5019"/>
+        <w:gridCol w:w="5019"/>
+      </w:tblGrid>
+      <w:tr>
+        <w:trPr/>
+        <w:tc>
+          <w:tcPr>
+            <w:tcW w:type="dxa" w:w="5019"/>
+            <w:shd w:fill="EAF2F8"/>
+            <w:tcMar>
+              <w:top w:w="90" w:type="dxa"/>
+              <w:start w:w="110" w:type="dxa"/>
+              <w:bottom w:w="90" w:type="dxa"/>
+              <w:end w:w="110" w:type="dxa"/>
+            </w:tcMar>
+            <w:vAlign w:val="center"/>
+          </w:tcPr>
+          <w:p>
+            <w:pPr>
+              <w:spacing w:after="40" w:line="259" w:lineRule="auto"/>
+              <w:jc w:val="left"/>
+            </w:pPr>
+            <w:r>
+              <w:rPr>
+                <w:rFonts w:ascii="맑은 고딕" w:hAnsi="맑은 고딕" w:eastAsia="맑은 고딕"/>
+                <w:b/>
+                <w:sz w:val="17"/>
+              </w:rPr>
+            </w:r>
+            <w:r>
+              <w:rPr>
+                <w:rFonts w:ascii="맑은 고딕" w:hAnsi="맑은 고딕" w:eastAsia="맑은 고딕"/>
+                <w:b/>
+                <w:sz w:val="17"/>
+              </w:rPr>
+              <w:t>번호</w:t>
+            </w:r>
+          </w:p>
+        </w:tc>
+        <w:tc>
+          <w:tcPr>
+            <w:tcW w:type="dxa" w:w="5019"/>
+            <w:shd w:fill="D9EAF7"/>
+            <w:tcMar>
+              <w:top w:w="90" w:type="dxa"/>
+              <w:start w:w="110" w:type="dxa"/>
+              <w:bottom w:w="90" w:type="dxa"/>
+              <w:end w:w="110" w:type="dxa"/>
+            </w:tcMar>
+            <w:vAlign w:val="center"/>
+          </w:tcPr>
+          <w:p>
+            <w:pPr>
+              <w:spacing w:after="40" w:line="259" w:lineRule="auto"/>
+              <w:jc w:val="left"/>
+            </w:pPr>
+            <w:r>
+              <w:rPr>
+                <w:rFonts w:ascii="맑은 고딕" w:hAnsi="맑은 고딕" w:eastAsia="맑은 고딕"/>
+                <w:b/>
+                <w:sz w:val="16"/>
+              </w:rPr>
+            </w:r>
+            <w:r>
+              <w:rPr>
+                <w:rFonts w:ascii="맑은 고딕" w:hAnsi="맑은 고딕" w:eastAsia="맑은 고딕"/>
+                <w:b/>
+                <w:sz w:val="16"/>
+              </w:rPr>
+              <w:t>자료</w:t>
+            </w:r>
+          </w:p>
+        </w:tc>
+      </w:tr>
+      <w:tr>
+        <w:trPr/>
+        <w:tc>
+          <w:tcPr>
+            <w:tcW w:type="dxa" w:w="5019"/>
+            <w:tcMar>
+              <w:top w:w="90" w:type="dxa"/>
+              <w:start w:w="110" w:type="dxa"/>
+              <w:bottom w:w="90" w:type="dxa"/>
+              <w:end w:w="110" w:type="dxa"/>
+            </w:tcMar>
+            <w:vAlign w:val="center"/>
+            <w:shd w:fill="EAF2F8"/>
+          </w:tcPr>
+          <w:p>
+            <w:pPr>
+              <w:spacing w:after="40" w:line="259" w:lineRule="auto"/>
+              <w:jc w:val="left"/>
+            </w:pPr>
+            <w:r>
+              <w:rPr>
+                <w:rFonts w:ascii="맑은 고딕" w:hAnsi="맑은 고딕" w:eastAsia="맑은 고딕"/>
+                <w:b w:val="0"/>
+                <w:sz w:val="17"/>
+              </w:rPr>
+            </w:r>
+            <w:r>
+              <w:rPr>
+                <w:rFonts w:ascii="맑은 고딕" w:hAnsi="맑은 고딕" w:eastAsia="맑은 고딕"/>
+                <w:b w:val="0"/>
+                <w:sz w:val="17"/>
+              </w:rPr>
+              <w:t>[참고 1]</w:t>
+            </w:r>
+          </w:p>
+        </w:tc>
+        <w:tc>
+          <w:tcPr>
+            <w:tcW w:type="dxa" w:w="5019"/>
+            <w:tcMar>
+              <w:top w:w="90" w:type="dxa"/>
+              <w:start w:w="110" w:type="dxa"/>
+              <w:bottom w:w="90" w:type="dxa"/>
+              <w:end w:w="110" w:type="dxa"/>
+            </w:tcMar>
+            <w:vAlign w:val="center"/>
+          </w:tcPr>
+          <w:p>
+            <w:pPr>
+              <w:spacing w:after="40" w:line="259" w:lineRule="auto"/>
+              <w:jc w:val="left"/>
+            </w:pPr>
+            <w:r>
+              <w:rPr>
+                <w:rFonts w:ascii="맑은 고딕" w:hAnsi="맑은 고딕" w:eastAsia="맑은 고딕"/>
+                <w:b w:val="0"/>
+                <w:sz w:val="16"/>
+              </w:rPr>
+            </w:r>
+            <w:r>
+              <w:rPr>
+                <w:rFonts w:ascii="맑은 고딕" w:hAnsi="맑은 고딕" w:eastAsia="맑은 고딕"/>
+                <w:b w:val="0"/>
+                <w:sz w:val="16"/>
+              </w:rPr>
+              <w:t>통계청, 「2025 고령자 통계」, 2025.9.29., https://kostat.go.kr/boardDownload.es?bid=10820&amp;list_no=438832&amp;seq=1</w:t>
+            </w:r>
+          </w:p>
+        </w:tc>
+      </w:tr>
+      <w:tr>
+        <w:trPr/>
+        <w:tc>
+          <w:tcPr>
+            <w:tcW w:type="dxa" w:w="5019"/>
+            <w:tcMar>
+              <w:top w:w="90" w:type="dxa"/>
+              <w:start w:w="110" w:type="dxa"/>
+              <w:bottom w:w="90" w:type="dxa"/>
+              <w:end w:w="110" w:type="dxa"/>
+            </w:tcMar>
+            <w:vAlign w:val="center"/>
+            <w:shd w:fill="EAF2F8"/>
+          </w:tcPr>
+          <w:p>
+            <w:pPr>
+              <w:spacing w:after="40" w:line="259" w:lineRule="auto"/>
+              <w:jc w:val="left"/>
+            </w:pPr>
+            <w:r>
+              <w:rPr>
+                <w:rFonts w:ascii="맑은 고딕" w:hAnsi="맑은 고딕" w:eastAsia="맑은 고딕"/>
+                <w:b w:val="0"/>
+                <w:sz w:val="17"/>
+              </w:rPr>
+            </w:r>
+            <w:r>
+              <w:rPr>
+                <w:rFonts w:ascii="맑은 고딕" w:hAnsi="맑은 고딕" w:eastAsia="맑은 고딕"/>
+                <w:b w:val="0"/>
+                <w:sz w:val="17"/>
+              </w:rPr>
+              <w:t>[참고 2]</w:t>
+            </w:r>
+          </w:p>
+        </w:tc>
+        <w:tc>
+          <w:tcPr>
+            <w:tcW w:type="dxa" w:w="5019"/>
+            <w:tcMar>
+              <w:top w:w="90" w:type="dxa"/>
+              <w:start w:w="110" w:type="dxa"/>
+              <w:bottom w:w="90" w:type="dxa"/>
+              <w:end w:w="110" w:type="dxa"/>
+            </w:tcMar>
+            <w:vAlign w:val="center"/>
+          </w:tcPr>
+          <w:p>
+            <w:pPr>
+              <w:spacing w:after="40" w:line="259" w:lineRule="auto"/>
+              <w:jc w:val="left"/>
+            </w:pPr>
+            <w:r>
+              <w:rPr>
+                <w:rFonts w:ascii="맑은 고딕" w:hAnsi="맑은 고딕" w:eastAsia="맑은 고딕"/>
+                <w:b w:val="0"/>
+                <w:sz w:val="16"/>
+              </w:rPr>
+            </w:r>
+            <w:r>
+              <w:rPr>
+                <w:rFonts w:ascii="맑은 고딕" w:hAnsi="맑은 고딕" w:eastAsia="맑은 고딕"/>
+                <w:b w:val="0"/>
+                <w:sz w:val="16"/>
+              </w:rPr>
+              <w:t>World Health Organization, “Dementia” fact sheet, 2025.3.31., https://www.who.int/news-room/fact-sheets/detail/dementia</w:t>
+            </w:r>
+          </w:p>
+        </w:tc>
+      </w:tr>
+      <w:tr>
+        <w:trPr/>
+        <w:tc>
+          <w:tcPr>
+            <w:tcW w:type="dxa" w:w="5019"/>
+            <w:tcMar>
+              <w:top w:w="90" w:type="dxa"/>
+              <w:start w:w="110" w:type="dxa"/>
+              <w:bottom w:w="90" w:type="dxa"/>
+              <w:end w:w="110" w:type="dxa"/>
+            </w:tcMar>
+            <w:vAlign w:val="center"/>
+            <w:shd w:fill="EAF2F8"/>
+          </w:tcPr>
+          <w:p>
+            <w:pPr>
+              <w:spacing w:after="40" w:line="259" w:lineRule="auto"/>
+              <w:jc w:val="left"/>
+            </w:pPr>
+            <w:r>
+              <w:rPr>
+                <w:rFonts w:ascii="맑은 고딕" w:hAnsi="맑은 고딕" w:eastAsia="맑은 고딕"/>
+                <w:b w:val="0"/>
+                <w:sz w:val="17"/>
+              </w:rPr>
+            </w:r>
+            <w:r>
+              <w:rPr>
+                <w:rFonts w:ascii="맑은 고딕" w:hAnsi="맑은 고딕" w:eastAsia="맑은 고딕"/>
+                <w:b w:val="0"/>
+                <w:sz w:val="17"/>
+              </w:rPr>
+              <w:t>[참고 3]</w:t>
+            </w:r>
+          </w:p>
+        </w:tc>
+        <w:tc>
+          <w:tcPr>
+            <w:tcW w:type="dxa" w:w="5019"/>
+            <w:tcMar>
+              <w:top w:w="90" w:type="dxa"/>
+              <w:start w:w="110" w:type="dxa"/>
+              <w:bottom w:w="90" w:type="dxa"/>
+              <w:end w:w="110" w:type="dxa"/>
+            </w:tcMar>
+            <w:vAlign w:val="center"/>
+          </w:tcPr>
+          <w:p>
+            <w:pPr>
+              <w:spacing w:after="40" w:line="259" w:lineRule="auto"/>
+              <w:jc w:val="left"/>
+            </w:pPr>
+            <w:r>
+              <w:rPr>
+                <w:rFonts w:ascii="맑은 고딕" w:hAnsi="맑은 고딕" w:eastAsia="맑은 고딕"/>
+                <w:b w:val="0"/>
+                <w:sz w:val="16"/>
+              </w:rPr>
+            </w:r>
+            <w:r>
+              <w:rPr>
+                <w:rFonts w:ascii="맑은 고딕" w:hAnsi="맑은 고딕" w:eastAsia="맑은 고딕"/>
+                <w:b w:val="0"/>
+                <w:sz w:val="16"/>
+              </w:rPr>
+              <w:t>국립중앙의료원 중앙치매센터, 「대한민국 치매현황 2024」, 2025, 보건복지부 공동발행, https://dl.nanet.go.kr/detail/MONO12025000049997</w:t>
+            </w:r>
+          </w:p>
+        </w:tc>
+      </w:tr>
+      <w:tr>
+        <w:trPr/>
+        <w:tc>
+          <w:tcPr>
+            <w:tcW w:type="dxa" w:w="5019"/>
+            <w:tcMar>
+              <w:top w:w="90" w:type="dxa"/>
+              <w:start w:w="110" w:type="dxa"/>
+              <w:bottom w:w="90" w:type="dxa"/>
+              <w:end w:w="110" w:type="dxa"/>
+            </w:tcMar>
+            <w:vAlign w:val="center"/>
+            <w:shd w:fill="EAF2F8"/>
+          </w:tcPr>
+          <w:p>
+            <w:pPr>
+              <w:spacing w:after="40" w:line="259" w:lineRule="auto"/>
+              <w:jc w:val="left"/>
+            </w:pPr>
+            <w:r>
+              <w:rPr>
+                <w:rFonts w:ascii="맑은 고딕" w:hAnsi="맑은 고딕" w:eastAsia="맑은 고딕"/>
+                <w:b w:val="0"/>
+                <w:sz w:val="17"/>
+              </w:rPr>
+            </w:r>
+            <w:r>
+              <w:rPr>
+                <w:rFonts w:ascii="맑은 고딕" w:hAnsi="맑은 고딕" w:eastAsia="맑은 고딕"/>
+                <w:b w:val="0"/>
+                <w:sz w:val="17"/>
+              </w:rPr>
+              <w:t>[참고 4]</w:t>
+            </w:r>
+          </w:p>
+        </w:tc>
+        <w:tc>
+          <w:tcPr>
+            <w:tcW w:type="dxa" w:w="5019"/>
+            <w:tcMar>
+              <w:top w:w="90" w:type="dxa"/>
+              <w:start w:w="110" w:type="dxa"/>
+              <w:bottom w:w="90" w:type="dxa"/>
+              <w:end w:w="110" w:type="dxa"/>
+            </w:tcMar>
+            <w:vAlign w:val="center"/>
+          </w:tcPr>
+          <w:p>
+            <w:pPr>
+              <w:spacing w:after="40" w:line="259" w:lineRule="auto"/>
+              <w:jc w:val="left"/>
+            </w:pPr>
+            <w:r>
+              <w:rPr>
+                <w:rFonts w:ascii="맑은 고딕" w:hAnsi="맑은 고딕" w:eastAsia="맑은 고딕"/>
+                <w:b w:val="0"/>
+                <w:sz w:val="16"/>
+              </w:rPr>
+            </w:r>
+            <w:r>
+              <w:rPr>
+                <w:rFonts w:ascii="맑은 고딕" w:hAnsi="맑은 고딕" w:eastAsia="맑은 고딕"/>
+                <w:b w:val="0"/>
+                <w:sz w:val="16"/>
+              </w:rPr>
+              <w:t>Han H. 등, “The Clinical Utility of the Cognitive Impairment Screening Test (CIST),” Dementia and Neurocognitive Disorders, 2026, https://dnd.or.kr/DOIx.php?id=10.12779%2Fdnd.2026.25.1.42</w:t>
+            </w:r>
+          </w:p>
+        </w:tc>
+      </w:tr>
+      <w:tr>
+        <w:trPr/>
+        <w:tc>
+          <w:tcPr>
+            <w:tcW w:type="dxa" w:w="5019"/>
+            <w:tcMar>
+              <w:top w:w="90" w:type="dxa"/>
+              <w:start w:w="110" w:type="dxa"/>
+              <w:bottom w:w="90" w:type="dxa"/>
+              <w:end w:w="110" w:type="dxa"/>
+            </w:tcMar>
+            <w:vAlign w:val="center"/>
+            <w:shd w:fill="EAF2F8"/>
+          </w:tcPr>
+          <w:p>
+            <w:pPr>
+              <w:spacing w:after="40" w:line="259" w:lineRule="auto"/>
+              <w:jc w:val="left"/>
+            </w:pPr>
+            <w:r>
+              <w:rPr>
+                <w:rFonts w:ascii="맑은 고딕" w:hAnsi="맑은 고딕" w:eastAsia="맑은 고딕"/>
+                <w:b w:val="0"/>
+                <w:sz w:val="17"/>
+              </w:rPr>
+            </w:r>
+            <w:r>
+              <w:rPr>
+                <w:rFonts w:ascii="맑은 고딕" w:hAnsi="맑은 고딕" w:eastAsia="맑은 고딕"/>
+                <w:b w:val="0"/>
+                <w:sz w:val="17"/>
+              </w:rPr>
+              <w:t>[참고 5]</w:t>
+            </w:r>
+          </w:p>
+        </w:tc>
+        <w:tc>
+          <w:tcPr>
+            <w:tcW w:type="dxa" w:w="5019"/>
+            <w:tcMar>
+              <w:top w:w="90" w:type="dxa"/>
+              <w:start w:w="110" w:type="dxa"/>
+              <w:bottom w:w="90" w:type="dxa"/>
+              <w:end w:w="110" w:type="dxa"/>
+            </w:tcMar>
+            <w:vAlign w:val="center"/>
+          </w:tcPr>
+          <w:p>
+            <w:pPr>
+              <w:spacing w:after="40" w:line="259" w:lineRule="auto"/>
+              <w:jc w:val="left"/>
+            </w:pPr>
+            <w:r>
+              <w:rPr>
+                <w:rFonts w:ascii="맑은 고딕" w:hAnsi="맑은 고딕" w:eastAsia="맑은 고딕"/>
+                <w:b w:val="0"/>
+                <w:sz w:val="16"/>
+              </w:rPr>
+            </w:r>
+            <w:r>
+              <w:rPr>
+                <w:rFonts w:ascii="맑은 고딕" w:hAnsi="맑은 고딕" w:eastAsia="맑은 고딕"/>
+                <w:b w:val="0"/>
+                <w:sz w:val="16"/>
+              </w:rPr>
+              <w:t>Woods B. 등, “Cognitive stimulation to improve cognitive functioning in people with dementia,” Cochrane Database of Systematic Reviews, 2023, DOI: 10.1002/14651858.CD005562.pub3</w:t>
+            </w:r>
+          </w:p>
+        </w:tc>
+      </w:tr>
+      <w:tr>
+        <w:trPr/>
+        <w:tc>
+          <w:tcPr>
+            <w:tcW w:type="dxa" w:w="5019"/>
+            <w:tcMar>
+              <w:top w:w="90" w:type="dxa"/>
+              <w:start w:w="110" w:type="dxa"/>
+              <w:bottom w:w="90" w:type="dxa"/>
+              <w:end w:w="110" w:type="dxa"/>
+            </w:tcMar>
+            <w:vAlign w:val="center"/>
+            <w:shd w:fill="EAF2F8"/>
+          </w:tcPr>
+          <w:p>
+            <w:pPr>
+              <w:spacing w:after="40" w:line="259" w:lineRule="auto"/>
+              <w:jc w:val="left"/>
+            </w:pPr>
+            <w:r>
+              <w:rPr>
+                <w:rFonts w:ascii="맑은 고딕" w:hAnsi="맑은 고딕" w:eastAsia="맑은 고딕"/>
+                <w:b w:val="0"/>
+                <w:sz w:val="17"/>
+              </w:rPr>
+            </w:r>
+            <w:r>
+              <w:rPr>
+                <w:rFonts w:ascii="맑은 고딕" w:hAnsi="맑은 고딕" w:eastAsia="맑은 고딕"/>
+                <w:b w:val="0"/>
+                <w:sz w:val="17"/>
+              </w:rPr>
+              <w:t>[참고 6]</w:t>
+            </w:r>
+          </w:p>
+        </w:tc>
+        <w:tc>
+          <w:tcPr>
+            <w:tcW w:type="dxa" w:w="5019"/>
+            <w:tcMar>
+              <w:top w:w="90" w:type="dxa"/>
+              <w:start w:w="110" w:type="dxa"/>
+              <w:bottom w:w="90" w:type="dxa"/>
+              <w:end w:w="110" w:type="dxa"/>
+            </w:tcMar>
+            <w:vAlign w:val="center"/>
+          </w:tcPr>
+          <w:p>
+            <w:pPr>
+              <w:spacing w:after="40" w:line="259" w:lineRule="auto"/>
+              <w:jc w:val="left"/>
+            </w:pPr>
+            <w:r>
+              <w:rPr>
+                <w:rFonts w:ascii="맑은 고딕" w:hAnsi="맑은 고딕" w:eastAsia="맑은 고딕"/>
+                <w:b w:val="0"/>
+                <w:sz w:val="16"/>
+              </w:rPr>
+            </w:r>
+            <w:r>
+              <w:rPr>
+                <w:rFonts w:ascii="맑은 고딕" w:hAnsi="맑은 고딕" w:eastAsia="맑은 고딕"/>
+                <w:b w:val="0"/>
+                <w:sz w:val="16"/>
+              </w:rPr>
+              <w:t>Woods B. 등, “Reminiscence therapy for dementia,” Cochrane Database of Systematic Reviews, 2018, DOI: 10.1002/14651858.CD001120.pub3</w:t>
+            </w:r>
+          </w:p>
+        </w:tc>
+      </w:tr>
+      <w:tr>
+        <w:trPr/>
+        <w:tc>
+          <w:tcPr>
+            <w:tcW w:type="dxa" w:w="5019"/>
+            <w:tcMar>
+              <w:top w:w="90" w:type="dxa"/>
+              <w:start w:w="110" w:type="dxa"/>
+              <w:bottom w:w="90" w:type="dxa"/>
+              <w:end w:w="110" w:type="dxa"/>
+            </w:tcMar>
+            <w:vAlign w:val="center"/>
+            <w:shd w:fill="EAF2F8"/>
+          </w:tcPr>
+          <w:p>
+            <w:pPr>
+              <w:spacing w:after="40" w:line="259" w:lineRule="auto"/>
+              <w:jc w:val="left"/>
+            </w:pPr>
+            <w:r>
+              <w:rPr>
+                <w:rFonts w:ascii="맑은 고딕" w:hAnsi="맑은 고딕" w:eastAsia="맑은 고딕"/>
+                <w:b w:val="0"/>
+                <w:sz w:val="17"/>
+              </w:rPr>
+            </w:r>
+            <w:r>
+              <w:rPr>
+                <w:rFonts w:ascii="맑은 고딕" w:hAnsi="맑은 고딕" w:eastAsia="맑은 고딕"/>
+                <w:b w:val="0"/>
+                <w:sz w:val="17"/>
+              </w:rPr>
+              <w:t>[참고 7]</w:t>
+            </w:r>
+          </w:p>
+        </w:tc>
+        <w:tc>
+          <w:tcPr>
+            <w:tcW w:type="dxa" w:w="5019"/>
+            <w:tcMar>
+              <w:top w:w="90" w:type="dxa"/>
+              <w:start w:w="110" w:type="dxa"/>
+              <w:bottom w:w="90" w:type="dxa"/>
+              <w:end w:w="110" w:type="dxa"/>
+            </w:tcMar>
+            <w:vAlign w:val="center"/>
+          </w:tcPr>
+          <w:p>
+            <w:pPr>
+              <w:spacing w:after="40" w:line="259" w:lineRule="auto"/>
+              <w:jc w:val="left"/>
+            </w:pPr>
+            <w:r>
+              <w:rPr>
+                <w:rFonts w:ascii="맑은 고딕" w:hAnsi="맑은 고딕" w:eastAsia="맑은 고딕"/>
+                <w:b w:val="0"/>
+                <w:sz w:val="16"/>
+              </w:rPr>
+            </w:r>
+            <w:r>
+              <w:rPr>
+                <w:rFonts w:ascii="맑은 고딕" w:hAnsi="맑은 고딕" w:eastAsia="맑은 고딕"/>
+                <w:b w:val="0"/>
+                <w:sz w:val="16"/>
+              </w:rPr>
+              <w:t>Livingston G. 등, “Dementia prevention, intervention, and care: 2024 report of the Lancet standing Commission,” The Lancet, 404(10452), 572-628, DOI: 10.1016/S0140-6736(24)01296-0</w:t>
+            </w:r>
+          </w:p>
+        </w:tc>
+      </w:tr>
+      <w:tr>
+        <w:trPr/>
+        <w:tc>
+          <w:tcPr>
+            <w:tcW w:type="dxa" w:w="5019"/>
+            <w:tcMar>
+              <w:top w:w="90" w:type="dxa"/>
+              <w:start w:w="110" w:type="dxa"/>
+              <w:bottom w:w="90" w:type="dxa"/>
+              <w:end w:w="110" w:type="dxa"/>
+            </w:tcMar>
+            <w:vAlign w:val="center"/>
+            <w:shd w:fill="EAF2F8"/>
+          </w:tcPr>
+          <w:p>
+            <w:pPr>
+              <w:spacing w:after="40" w:line="259" w:lineRule="auto"/>
+              <w:jc w:val="left"/>
+            </w:pPr>
+            <w:r>
+              <w:rPr>
+                <w:rFonts w:ascii="맑은 고딕" w:hAnsi="맑은 고딕" w:eastAsia="맑은 고딕"/>
+                <w:b w:val="0"/>
+                <w:sz w:val="17"/>
+              </w:rPr>
+            </w:r>
+            <w:r>
+              <w:rPr>
+                <w:rFonts w:ascii="맑은 고딕" w:hAnsi="맑은 고딕" w:eastAsia="맑은 고딕"/>
+                <w:b w:val="0"/>
+                <w:sz w:val="17"/>
+              </w:rPr>
+              <w:t>[참고 8]</w:t>
+            </w:r>
+          </w:p>
+        </w:tc>
+        <w:tc>
+          <w:tcPr>
+            <w:tcW w:type="dxa" w:w="5019"/>
+            <w:tcMar>
+              <w:top w:w="90" w:type="dxa"/>
+              <w:start w:w="110" w:type="dxa"/>
+              <w:bottom w:w="90" w:type="dxa"/>
+              <w:end w:w="110" w:type="dxa"/>
+            </w:tcMar>
+            <w:vAlign w:val="center"/>
+          </w:tcPr>
+          <w:p>
+            <w:pPr>
+              <w:spacing w:after="40" w:line="259" w:lineRule="auto"/>
+              <w:jc w:val="left"/>
+            </w:pPr>
+            <w:r>
+              <w:rPr>
+                <w:rFonts w:ascii="맑은 고딕" w:hAnsi="맑은 고딕" w:eastAsia="맑은 고딕"/>
+                <w:b w:val="0"/>
+                <w:sz w:val="16"/>
+              </w:rPr>
+            </w:r>
+            <w:r>
+              <w:rPr>
+                <w:rFonts w:ascii="맑은 고딕" w:hAnsi="맑은 고딕" w:eastAsia="맑은 고딕"/>
+                <w:b w:val="0"/>
+                <w:sz w:val="16"/>
+              </w:rPr>
+              <w:t>Alzheimer’s Association, “Reminiscence and Reminiscence Therapy,” https://www.alz.org/help-support/caregiving/daily-care/reminiscence-and-reminiscence-therapy</w:t>
+            </w:r>
+          </w:p>
+        </w:tc>
+      </w:tr>
+      <w:tr>
+        <w:tc>
+          <w:tcPr>
+            <w:tcW w:type="dxa" w:w="5019"/>
+            <w:vAlign w:val="center"/>
+          </w:tcPr>
+          <w:p>
+            <w:pPr>
+              <w:spacing w:after="40" w:line="259" w:lineRule="auto"/>
+              <w:jc w:val="left"/>
+            </w:pPr>
+            <w:r>
+              <w:rPr>
+                <w:rFonts w:ascii="맑은 고딕" w:hAnsi="맑은 고딕" w:eastAsia="맑은 고딕"/>
+                <w:b w:val="0"/>
+                <w:sz w:val="17"/>
+              </w:rPr>
+            </w:r>
+            <w:r>
+              <w:rPr>
+                <w:rFonts w:ascii="맑은 고딕" w:hAnsi="맑은 고딕" w:eastAsia="맑은 고딕"/>
+                <w:b w:val="0"/>
+                <w:sz w:val="17"/>
+              </w:rPr>
+              <w:t>[참고 9]</w:t>
+            </w:r>
+          </w:p>
+        </w:tc>
+        <w:tc>
+          <w:tcPr>
+            <w:tcW w:type="dxa" w:w="5019"/>
+            <w:vAlign w:val="center"/>
+          </w:tcPr>
+          <w:p>
+            <w:pPr>
+              <w:spacing w:after="40" w:line="259" w:lineRule="auto"/>
+              <w:jc w:val="left"/>
+            </w:pPr>
+            <w:r>
+              <w:rPr>
+                <w:rFonts w:ascii="맑은 고딕" w:hAnsi="맑은 고딕" w:eastAsia="맑은 고딕"/>
+                <w:b w:val="0"/>
+                <w:sz w:val="16"/>
+              </w:rPr>
+            </w:r>
+            <w:r>
+              <w:rPr>
+                <w:rFonts w:ascii="맑은 고딕" w:hAnsi="맑은 고딕" w:eastAsia="맑은 고딕"/>
+                <w:b w:val="0"/>
+                <w:sz w:val="16"/>
+              </w:rPr>
+              <w:t>일본 내각부, 「令和7年版高齢社会白書（概要版）」, 2025, https://www8.cao.go.jp/kourei/whitepaper/w-2025/html/gaiyou/s1_1.html</w:t>
+            </w:r>
+          </w:p>
+        </w:tc>
+      </w:tr>
+      <w:tr>
+        <w:tc>
+          <w:tcPr>
+            <w:tcW w:type="dxa" w:w="5019"/>
+            <w:vAlign w:val="center"/>
+          </w:tcPr>
+          <w:p>
+            <w:pPr>
+              <w:spacing w:after="40" w:line="259" w:lineRule="auto"/>
+              <w:jc w:val="left"/>
+            </w:pPr>
+            <w:r>
+              <w:rPr>
+                <w:rFonts w:ascii="맑은 고딕" w:hAnsi="맑은 고딕" w:eastAsia="맑은 고딕"/>
+                <w:b w:val="0"/>
+                <w:sz w:val="17"/>
+              </w:rPr>
+            </w:r>
+            <w:r>
+              <w:rPr>
+                <w:rFonts w:ascii="맑은 고딕" w:hAnsi="맑은 고딕" w:eastAsia="맑은 고딕"/>
+                <w:b w:val="0"/>
+                <w:sz w:val="17"/>
+              </w:rPr>
+              <w:t>[참고 10]</w:t>
+            </w:r>
+          </w:p>
+        </w:tc>
+        <w:tc>
+          <w:tcPr>
+            <w:tcW w:type="dxa" w:w="5019"/>
+            <w:vAlign w:val="center"/>
+          </w:tcPr>
+          <w:p>
+            <w:pPr>
+              <w:spacing w:after="40" w:line="259" w:lineRule="auto"/>
+              <w:jc w:val="left"/>
+            </w:pPr>
+            <w:r>
+              <w:rPr>
+                <w:rFonts w:ascii="맑은 고딕" w:hAnsi="맑은 고딕" w:eastAsia="맑은 고딕"/>
+                <w:b w:val="0"/>
+                <w:sz w:val="16"/>
+              </w:rPr>
+            </w:r>
+            <w:r>
+              <w:rPr>
+                <w:rFonts w:ascii="맑은 고딕" w:hAnsi="맑은 고딕" w:eastAsia="맑은 고딕"/>
+                <w:b w:val="0"/>
+                <w:sz w:val="16"/>
+              </w:rPr>
+              <w:t>일본 후생노동성, 「認知症施策」 및 「認知症施策推進基本計画の概要」, 2024~2026, https://www.mhlw.go.jp/stf/seisakunitsuite/bunya/hukushi_kaigo/kaigo_koureisha/ninchi/index.html / https://www.mhlw.go.jp/content/001344088.pdf</w:t>
+            </w:r>
+          </w:p>
+        </w:tc>
+      </w:tr>
+      <w:tr>
+        <w:tc>
+          <w:tcPr>
+            <w:tcW w:type="dxa" w:w="5019"/>
+            <w:vAlign w:val="center"/>
+          </w:tcPr>
+          <w:p>
+            <w:pPr>
+              <w:spacing w:after="40" w:line="259" w:lineRule="auto"/>
+              <w:jc w:val="left"/>
+            </w:pPr>
+            <w:r>
+              <w:rPr>
+                <w:rFonts w:ascii="맑은 고딕" w:hAnsi="맑은 고딕" w:eastAsia="맑은 고딕"/>
+                <w:b w:val="0"/>
+                <w:sz w:val="17"/>
+              </w:rPr>
+            </w:r>
+            <w:r>
+              <w:rPr>
+                <w:rFonts w:ascii="맑은 고딕" w:hAnsi="맑은 고딕" w:eastAsia="맑은 고딕"/>
+                <w:b w:val="0"/>
+                <w:sz w:val="17"/>
+              </w:rPr>
+              <w:t>[참고 11]</w:t>
+            </w:r>
+          </w:p>
+        </w:tc>
+        <w:tc>
+          <w:tcPr>
+            <w:tcW w:type="dxa" w:w="5019"/>
+            <w:vAlign w:val="center"/>
+          </w:tcPr>
+          <w:p>
+            <w:pPr>
+              <w:spacing w:after="40" w:line="259" w:lineRule="auto"/>
+              <w:jc w:val="left"/>
+            </w:pPr>
+            <w:r>
+              <w:rPr>
+                <w:rFonts w:ascii="맑은 고딕" w:hAnsi="맑은 고딕" w:eastAsia="맑은 고딕"/>
+                <w:b w:val="0"/>
+                <w:sz w:val="16"/>
+              </w:rPr>
+            </w:r>
+            <w:r>
+              <w:rPr>
+                <w:rFonts w:ascii="맑은 고딕" w:hAnsi="맑은 고딕" w:eastAsia="맑은 고딕"/>
+                <w:b w:val="0"/>
+                <w:sz w:val="16"/>
+              </w:rPr>
+              <w:t>일본 경제산업성, 「認知症政策」, 2026 확인, https://www.meti.go.jp/policy/mono_info_service/healthcare/dementia/dementia.html</w:t>
+            </w:r>
+          </w:p>
+        </w:tc>
+      </w:tr>
+    </w:tbl>
+    <w:p>
+      <w:pPr>
+        <w:pStyle w:val="Heading1"/>
+        <w:spacing w:after="40" w:line="250" w:lineRule="auto"/>
+      </w:pPr>
+      <w:r>
+        <w:rPr>
+          <w:rFonts w:ascii="Malgun Gothic" w:hAnsi="Malgun Gothic" w:eastAsia="Malgun Gothic" w:cs="Calibri"/>
           <w:b/>
           <w:color w:val="2E74B5"/>
           <w:sz w:val="28"/>
@@ -1250,14 +3376,22 @@
     </w:p>
     <w:p>
       <w:pPr>
-        <w:spacing w:after="100"/>
+        <w:spacing w:after="40" w:before="0" w:line="250" w:lineRule="auto"/>
       </w:pPr>
       <w:r>
         <w:rPr>
-          <w:rFonts w:ascii="Calibri" w:hAnsi="Calibri" w:eastAsia="Malgun Gothic" w:cs="Calibri"/>
-          <w:sz w:val="19"/>
+          <w:rFonts w:ascii="Malgun Gothic" w:hAnsi="Malgun Gothic" w:eastAsia="Malgun Gothic"/>
+          <w:sz w:val="18"/>
         </w:rPr>
-        <w:t>아래 이미지는 현재 구현물의 대표 화면입니다. 제출용 최종본에서는 심사 분량에 맞춰 일부 이미지만 남길 수 있습니다.</w:t>
+        <w:t>아래 이미지는 현재 구현물의 대표 화면입니다. 치매 관련 추가 루틴 화면은 개발 완료 후 별도 캡처하여 교체·삽입합니다.</w:t>
+      </w:r>
+      <w:r>
+        <w:rPr>
+          <w:rFonts w:ascii="Malgun Gothic" w:hAnsi="Malgun Gothic" w:eastAsia="Malgun Gothic"/>
+          <w:b w:val="0"/>
+          <w:color w:val="5A5A5A"/>
+          <w:sz w:val="16"/>
+        </w:rPr>
       </w:r>
     </w:p>
     <w:tbl>
@@ -1280,21 +3414,31 @@
         <w:gridCol w:w="5019"/>
       </w:tblGrid>
       <w:tr>
+        <w:trPr/>
         <w:tc>
           <w:tcPr>
             <w:tcW w:type="dxa" w:w="5019"/>
             <w:tcMar>
-              <w:top w:w="100" w:type="dxa"/>
-              <w:start w:w="120" w:type="dxa"/>
-              <w:bottom w:w="100" w:type="dxa"/>
-              <w:end w:w="120" w:type="dxa"/>
+              <w:top w:w="90" w:type="dxa"/>
+              <w:start w:w="110" w:type="dxa"/>
+              <w:bottom w:w="90" w:type="dxa"/>
+              <w:end w:w="110" w:type="dxa"/>
             </w:tcMar>
+            <w:vAlign w:val="top"/>
+            <w:shd w:fill="EAF2F8"/>
           </w:tcPr>
           <w:p>
             <w:pPr>
+              <w:spacing w:before="0" w:after="40" w:line="250" w:lineRule="auto"/>
               <w:jc w:val="center"/>
             </w:pPr>
             <w:r>
+              <w:rPr>
+                <w:rFonts w:ascii="Malgun Gothic" w:hAnsi="Malgun Gothic" w:eastAsia="Malgun Gothic"/>
+                <w:b w:val="0"/>
+                <w:color w:val="1F4E79"/>
+                <w:sz w:val="18"/>
+              </w:rPr>
               <w:drawing>
                 <wp:inline xmlns:a="http://schemas.openxmlformats.org/drawingml/2006/main" xmlns:pic="http://schemas.openxmlformats.org/drawingml/2006/picture">
                   <wp:extent cx="2592000" cy="5618009"/>
@@ -1332,15 +3476,15 @@
           <w:p>
             <w:pPr>
               <w:pStyle w:val="Caption"/>
-              <w:spacing w:after="100" w:line="283" w:lineRule="auto"/>
+              <w:spacing w:after="40" w:line="250" w:lineRule="auto" w:before="0"/>
               <w:jc w:val="center"/>
             </w:pPr>
             <w:r>
               <w:rPr>
-                <w:rFonts w:ascii="Calibri" w:hAnsi="Calibri" w:eastAsia="Malgun Gothic" w:cs="Calibri"/>
-                <w:b w:val="0"/>
-                <w:color w:val="555555"/>
-                <w:sz w:val="17"/>
+                <w:rFonts w:ascii="Malgun Gothic" w:hAnsi="Malgun Gothic" w:eastAsia="Malgun Gothic" w:cs="Calibri"/>
+                <w:b/>
+                <w:color w:val="1F4E79"/>
+                <w:sz w:val="18"/>
               </w:rPr>
               <w:t>그림 1. 홈 화면과 학습 시작</w:t>
             </w:r>
@@ -1350,17 +3494,24 @@
           <w:tcPr>
             <w:tcW w:type="dxa" w:w="5019"/>
             <w:tcMar>
-              <w:top w:w="100" w:type="dxa"/>
-              <w:start w:w="120" w:type="dxa"/>
-              <w:bottom w:w="100" w:type="dxa"/>
-              <w:end w:w="120" w:type="dxa"/>
+              <w:top w:w="90" w:type="dxa"/>
+              <w:start w:w="110" w:type="dxa"/>
+              <w:bottom w:w="90" w:type="dxa"/>
+              <w:end w:w="110" w:type="dxa"/>
             </w:tcMar>
+            <w:vAlign w:val="top"/>
           </w:tcPr>
           <w:p>
             <w:pPr>
+              <w:spacing w:before="0" w:after="40" w:line="250" w:lineRule="auto"/>
               <w:jc w:val="center"/>
             </w:pPr>
             <w:r>
+              <w:rPr>
+                <w:rFonts w:ascii="Malgun Gothic" w:hAnsi="Malgun Gothic" w:eastAsia="Malgun Gothic"/>
+                <w:b w:val="0"/>
+                <w:sz w:val="18"/>
+              </w:rPr>
               <w:drawing>
                 <wp:inline xmlns:a="http://schemas.openxmlformats.org/drawingml/2006/main" xmlns:pic="http://schemas.openxmlformats.org/drawingml/2006/picture">
                   <wp:extent cx="2592000" cy="4482446"/>
@@ -1398,15 +3549,15 @@
           <w:p>
             <w:pPr>
               <w:pStyle w:val="Caption"/>
-              <w:spacing w:after="100" w:line="283" w:lineRule="auto"/>
+              <w:spacing w:after="40" w:line="250" w:lineRule="auto" w:before="0"/>
               <w:jc w:val="center"/>
             </w:pPr>
             <w:r>
               <w:rPr>
-                <w:rFonts w:ascii="Calibri" w:hAnsi="Calibri" w:eastAsia="Malgun Gothic" w:cs="Calibri"/>
+                <w:rFonts w:ascii="Malgun Gothic" w:hAnsi="Malgun Gothic" w:eastAsia="Malgun Gothic" w:cs="Calibri"/>
                 <w:b w:val="0"/>
                 <w:color w:val="555555"/>
-                <w:sz w:val="17"/>
+                <w:sz w:val="18"/>
               </w:rPr>
               <w:t>그림 2. 선택형 학습과 정답 피드백</w:t>
             </w:r>
@@ -1414,21 +3565,31 @@
         </w:tc>
       </w:tr>
       <w:tr>
+        <w:trPr/>
         <w:tc>
           <w:tcPr>
             <w:tcW w:type="dxa" w:w="5019"/>
             <w:tcMar>
-              <w:top w:w="100" w:type="dxa"/>
-              <w:start w:w="120" w:type="dxa"/>
-              <w:bottom w:w="100" w:type="dxa"/>
-              <w:end w:w="120" w:type="dxa"/>
+              <w:top w:w="90" w:type="dxa"/>
+              <w:start w:w="110" w:type="dxa"/>
+              <w:bottom w:w="90" w:type="dxa"/>
+              <w:end w:w="110" w:type="dxa"/>
             </w:tcMar>
+            <w:vAlign w:val="top"/>
+            <w:shd w:fill="EAF2F8"/>
           </w:tcPr>
           <w:p>
             <w:pPr>
+              <w:spacing w:before="0" w:after="40" w:line="250" w:lineRule="auto"/>
               <w:jc w:val="center"/>
             </w:pPr>
             <w:r>
+              <w:rPr>
+                <w:rFonts w:ascii="Malgun Gothic" w:hAnsi="Malgun Gothic" w:eastAsia="Malgun Gothic"/>
+                <w:b w:val="0"/>
+                <w:color w:val="1F4E79"/>
+                <w:sz w:val="18"/>
+              </w:rPr>
               <w:drawing>
                 <wp:inline xmlns:a="http://schemas.openxmlformats.org/drawingml/2006/main" xmlns:pic="http://schemas.openxmlformats.org/drawingml/2006/picture">
                   <wp:extent cx="2592000" cy="4482446"/>
@@ -1466,17 +3627,17 @@
           <w:p>
             <w:pPr>
               <w:pStyle w:val="Caption"/>
-              <w:spacing w:after="100" w:line="283" w:lineRule="auto"/>
+              <w:spacing w:after="40" w:line="250" w:lineRule="auto" w:before="0"/>
               <w:jc w:val="center"/>
             </w:pPr>
             <w:r>
               <w:rPr>
-                <w:rFonts w:ascii="Calibri" w:hAnsi="Calibri" w:eastAsia="Malgun Gothic" w:cs="Calibri"/>
-                <w:b w:val="0"/>
-                <w:color w:val="555555"/>
-                <w:sz w:val="17"/>
+                <w:rFonts w:ascii="Malgun Gothic" w:hAnsi="Malgun Gothic" w:eastAsia="Malgun Gothic" w:cs="Calibri"/>
+                <w:b/>
+                <w:color w:val="1F4E79"/>
+                <w:sz w:val="18"/>
               </w:rPr>
-              <w:t>그림 3. 개인 기억 주제 선택</w:t>
+              <w:t>그림 3. 개인 기억 단서 선택 및 저장</w:t>
             </w:r>
           </w:p>
         </w:tc>
@@ -1484,17 +3645,24 @@
           <w:tcPr>
             <w:tcW w:type="dxa" w:w="5019"/>
             <w:tcMar>
-              <w:top w:w="100" w:type="dxa"/>
-              <w:start w:w="120" w:type="dxa"/>
-              <w:bottom w:w="100" w:type="dxa"/>
-              <w:end w:w="120" w:type="dxa"/>
+              <w:top w:w="90" w:type="dxa"/>
+              <w:start w:w="110" w:type="dxa"/>
+              <w:bottom w:w="90" w:type="dxa"/>
+              <w:end w:w="110" w:type="dxa"/>
             </w:tcMar>
+            <w:vAlign w:val="top"/>
           </w:tcPr>
           <w:p>
             <w:pPr>
+              <w:spacing w:before="0" w:after="40" w:line="250" w:lineRule="auto"/>
               <w:jc w:val="center"/>
             </w:pPr>
             <w:r>
+              <w:rPr>
+                <w:rFonts w:ascii="Malgun Gothic" w:hAnsi="Malgun Gothic" w:eastAsia="Malgun Gothic"/>
+                <w:b w:val="0"/>
+                <w:sz w:val="18"/>
+              </w:rPr>
               <w:drawing>
                 <wp:inline xmlns:a="http://schemas.openxmlformats.org/drawingml/2006/main" xmlns:pic="http://schemas.openxmlformats.org/drawingml/2006/picture">
                   <wp:extent cx="2592000" cy="5618009"/>
@@ -1532,37 +3700,47 @@
           <w:p>
             <w:pPr>
               <w:pStyle w:val="Caption"/>
-              <w:spacing w:after="100" w:line="283" w:lineRule="auto"/>
+              <w:spacing w:after="40" w:line="250" w:lineRule="auto" w:before="0"/>
               <w:jc w:val="center"/>
             </w:pPr>
             <w:r>
               <w:rPr>
-                <w:rFonts w:ascii="Calibri" w:hAnsi="Calibri" w:eastAsia="Malgun Gothic" w:cs="Calibri"/>
+                <w:rFonts w:ascii="Malgun Gothic" w:hAnsi="Malgun Gothic" w:eastAsia="Malgun Gothic" w:cs="Calibri"/>
                 <w:b w:val="0"/>
                 <w:color w:val="555555"/>
-                <w:sz w:val="17"/>
+                <w:sz w:val="18"/>
               </w:rPr>
-              <w:t>그림 4. 정원 보상 화면</w:t>
+              <w:t>그림 4. Haru 보상 정원 화면</w:t>
             </w:r>
           </w:p>
         </w:tc>
       </w:tr>
       <w:tr>
+        <w:trPr/>
         <w:tc>
           <w:tcPr>
             <w:tcW w:type="dxa" w:w="5019"/>
             <w:tcMar>
-              <w:top w:w="100" w:type="dxa"/>
-              <w:start w:w="120" w:type="dxa"/>
-              <w:bottom w:w="100" w:type="dxa"/>
-              <w:end w:w="120" w:type="dxa"/>
+              <w:top w:w="90" w:type="dxa"/>
+              <w:start w:w="110" w:type="dxa"/>
+              <w:bottom w:w="90" w:type="dxa"/>
+              <w:end w:w="110" w:type="dxa"/>
             </w:tcMar>
+            <w:vAlign w:val="top"/>
+            <w:shd w:fill="EAF2F8"/>
           </w:tcPr>
           <w:p>
             <w:pPr>
+              <w:spacing w:before="0" w:after="40" w:line="250" w:lineRule="auto"/>
               <w:jc w:val="center"/>
             </w:pPr>
             <w:r>
+              <w:rPr>
+                <w:rFonts w:ascii="Malgun Gothic" w:hAnsi="Malgun Gothic" w:eastAsia="Malgun Gothic"/>
+                <w:b w:val="0"/>
+                <w:color w:val="1F4E79"/>
+                <w:sz w:val="18"/>
+              </w:rPr>
               <w:drawing>
                 <wp:inline xmlns:a="http://schemas.openxmlformats.org/drawingml/2006/main" xmlns:pic="http://schemas.openxmlformats.org/drawingml/2006/picture">
                   <wp:extent cx="2592000" cy="5618009"/>
@@ -1600,15 +3778,15 @@
           <w:p>
             <w:pPr>
               <w:pStyle w:val="Caption"/>
-              <w:spacing w:after="100" w:line="283" w:lineRule="auto"/>
+              <w:spacing w:after="40" w:line="250" w:lineRule="auto" w:before="0"/>
               <w:jc w:val="center"/>
             </w:pPr>
             <w:r>
               <w:rPr>
-                <w:rFonts w:ascii="Calibri" w:hAnsi="Calibri" w:eastAsia="Malgun Gothic" w:cs="Calibri"/>
-                <w:b w:val="0"/>
-                <w:color w:val="555555"/>
-                <w:sz w:val="17"/>
+                <w:rFonts w:ascii="Malgun Gothic" w:hAnsi="Malgun Gothic" w:eastAsia="Malgun Gothic" w:cs="Calibri"/>
+                <w:b/>
+                <w:color w:val="1F4E79"/>
+                <w:sz w:val="18"/>
               </w:rPr>
               <w:t>그림 5. 가족·보호자 안내 화면</w:t>
             </w:r>
@@ -1618,17 +3796,24 @@
           <w:tcPr>
             <w:tcW w:type="dxa" w:w="5019"/>
             <w:tcMar>
-              <w:top w:w="100" w:type="dxa"/>
-              <w:start w:w="120" w:type="dxa"/>
-              <w:bottom w:w="100" w:type="dxa"/>
-              <w:end w:w="120" w:type="dxa"/>
+              <w:top w:w="90" w:type="dxa"/>
+              <w:start w:w="110" w:type="dxa"/>
+              <w:bottom w:w="90" w:type="dxa"/>
+              <w:end w:w="110" w:type="dxa"/>
             </w:tcMar>
+            <w:vAlign w:val="top"/>
           </w:tcPr>
           <w:p>
             <w:pPr>
+              <w:spacing w:before="0" w:after="40" w:line="250" w:lineRule="auto"/>
               <w:jc w:val="center"/>
             </w:pPr>
             <w:r>
+              <w:rPr>
+                <w:rFonts w:ascii="Malgun Gothic" w:hAnsi="Malgun Gothic" w:eastAsia="Malgun Gothic"/>
+                <w:b w:val="0"/>
+                <w:sz w:val="18"/>
+              </w:rPr>
               <w:drawing>
                 <wp:inline xmlns:a="http://schemas.openxmlformats.org/drawingml/2006/main" xmlns:pic="http://schemas.openxmlformats.org/drawingml/2006/picture">
                   <wp:extent cx="2592000" cy="5618009"/>
@@ -1666,15 +3851,15 @@
           <w:p>
             <w:pPr>
               <w:pStyle w:val="Caption"/>
-              <w:spacing w:after="100" w:line="283" w:lineRule="auto"/>
+              <w:spacing w:after="40" w:line="250" w:lineRule="auto" w:before="0"/>
               <w:jc w:val="center"/>
             </w:pPr>
             <w:r>
               <w:rPr>
-                <w:rFonts w:ascii="Calibri" w:hAnsi="Calibri" w:eastAsia="Malgun Gothic" w:cs="Calibri"/>
+                <w:rFonts w:ascii="Malgun Gothic" w:hAnsi="Malgun Gothic" w:eastAsia="Malgun Gothic" w:cs="Calibri"/>
                 <w:b w:val="0"/>
                 <w:color w:val="555555"/>
-                <w:sz w:val="17"/>
+                <w:sz w:val="18"/>
               </w:rPr>
               <w:t>그림 6. 언어 설정 및 기억 카드 삭제</w:t>
             </w:r>
@@ -1684,6 +3869,7 @@
     </w:tbl>
     <w:sectPr>
       <w:footerReference w:type="default" r:id="rId9"/>
+      <w:headerReference w:type="default" r:id="rId16"/>
       <w:pgSz w:w="11909" w:h="16834"/>
       <w:pgMar w:top="935" w:right="935" w:bottom="935" w:left="935" w:header="454" w:footer="454" w:gutter="0"/>
       <w:cols w:space="720"/>
@@ -1702,14 +3888,25 @@
     </w:pPr>
     <w:r>
       <w:rPr>
-        <w:rFonts w:ascii="Calibri" w:hAnsi="Calibri" w:eastAsia="Malgun Gothic" w:cs="Calibri"/>
-        <w:color w:val="666666"/>
+        <w:rFonts w:ascii="Malgun Gothic" w:hAnsi="Malgun Gothic" w:eastAsia="Malgun Gothic" w:cs="Calibri"/>
+        <w:b w:val="0"/>
+        <w:color w:val="5A5A5A"/>
         <w:sz w:val="16"/>
       </w:rPr>
-      <w:t>새록정원 | 2026 글로벌 피우다프로젝트 지원신청서</w:t>
+      <w:t>Haru | 2026 글로벌 피우다프로젝트 지원신청서</w:t>
     </w:r>
   </w:p>
 </w:ftr>
+</file>
+
+<file path=word/header1.xml><?xml version="1.0" encoding="utf-8"?>
+<w:hdr xmlns:m="http://schemas.openxmlformats.org/officeDocument/2006/math" xmlns:mc="http://schemas.openxmlformats.org/markup-compatibility/2006" xmlns:mo="http://schemas.microsoft.com/office/mac/office/2008/main" xmlns:mv="urn:schemas-microsoft-com:mac:vml" xmlns:o="urn:schemas-microsoft-com:office:office" xmlns:r="http://schemas.openxmlformats.org/officeDocument/2006/relationships" xmlns:v="urn:schemas-microsoft-com:vml" xmlns:w10="urn:schemas-microsoft-com:office:word" xmlns:w14="http://schemas.microsoft.com/office/word/2010/wordml" xmlns:w="http://schemas.openxmlformats.org/wordprocessingml/2006/main" xmlns:wne="http://schemas.microsoft.com/office/word/2006/wordml" xmlns:wp14="http://schemas.microsoft.com/office/word/2010/wordprocessingDrawing" xmlns:wp="http://schemas.openxmlformats.org/drawingml/2006/wordprocessingDrawing" xmlns:wpc="http://schemas.microsoft.com/office/word/2010/wordprocessingCanvas" xmlns:wpg="http://schemas.microsoft.com/office/word/2010/wordprocessingGroup" xmlns:wpi="http://schemas.microsoft.com/office/word/2010/wordprocessingInk" xmlns:wps="http://schemas.microsoft.com/office/word/2010/wordprocessingShape" mc:Ignorable="w14 wp14">
+  <w:p>
+    <w:pPr>
+      <w:pStyle w:val="Header"/>
+    </w:pPr>
+  </w:p>
+</w:hdr>
 </file>
 
 <file path=word/numbering.xml><?xml version="1.0" encoding="utf-8"?>

</xml_diff>